<commit_message>
Use cloud.region (dc1, dc2) for the site; keep the DR role separate
Semantic conventions have no site attribute. cloud.region is standard,
recognised by tools and a default Loki OTLP index label, so it replaces
the custom acme.site.name. Values are the location only (dc1, dc2); the
disaster-recovery role stays in acme.site.role because it changes on
failover. cloud.provider is not set; the collector stamp stays
authoritative.

Updated: attribute model and rationale, collector/backend configuration,
prerequisites, NIN-001 oracle, feature and OTLP example, scenario
catalogue, WP0 requirements, draw.io diagrams, OAEF specification and
validation documents (v0.2, regenerated).

Co-Authored-By: Claude Opus 5.5 <noreply@anthropic.com>
</commit_message>
<xml_diff>
--- a/docs/oaef/OAEF-SPEC-001_Observability-and-Audit-Evidence-Framework-Specification.docx
+++ b/docs/oaef/OAEF-SPEC-001_Observability-and-Audit-Evidence-Framework-Specification.docx
@@ -285,7 +285,7 @@
                 <w:sz w:val="18"/>
                 <w:szCs w:val="18"/>
               </w:rPr>
-              <w:t>0.1 — Draft for review</w:t>
+              <w:t>0.2 — Draft for review</w:t>
             </w:r>
           </w:p>
         </w:tc>
@@ -1073,6 +1073,148 @@
           </w:p>
         </w:tc>
       </w:tr>
+      <w:tr>
+        <w:tc>
+          <w:tcPr>
+            <w:tcW w:w="0" w:type="auto"/>
+            <w:tcBorders>
+              <w:top w:val="single" w:sz="6" w:space="0" w:color="8C8C8C"/>
+              <w:left w:val="single" w:sz="6" w:space="0" w:color="8C8C8C"/>
+              <w:bottom w:val="single" w:sz="6" w:space="0" w:color="8C8C8C"/>
+              <w:right w:val="single" w:sz="6" w:space="0" w:color="8C8C8C"/>
+            </w:tcBorders>
+            <w:tcMar>
+              <w:top w:w="60" w:type="dxa"/>
+              <w:left w:w="60" w:type="dxa"/>
+              <w:bottom w:w="60" w:type="dxa"/>
+              <w:right w:w="60" w:type="dxa"/>
+            </w:tcMar>
+            <w:hideMark/>
+          </w:tcPr>
+          <w:p>
+            <w:pPr>
+              <w:rPr>
+                <w:rFonts w:eastAsia="Times New Roman"/>
+                <w:sz w:val="18"/>
+                <w:szCs w:val="18"/>
+              </w:rPr>
+            </w:pPr>
+            <w:r>
+              <w:rPr>
+                <w:rFonts w:eastAsia="Times New Roman"/>
+                <w:sz w:val="18"/>
+                <w:szCs w:val="18"/>
+              </w:rPr>
+              <w:t>0.2</w:t>
+            </w:r>
+          </w:p>
+        </w:tc>
+        <w:tc>
+          <w:tcPr>
+            <w:tcW w:w="0" w:type="auto"/>
+            <w:tcBorders>
+              <w:top w:val="single" w:sz="6" w:space="0" w:color="8C8C8C"/>
+              <w:left w:val="single" w:sz="6" w:space="0" w:color="8C8C8C"/>
+              <w:bottom w:val="single" w:sz="6" w:space="0" w:color="8C8C8C"/>
+              <w:right w:val="single" w:sz="6" w:space="0" w:color="8C8C8C"/>
+            </w:tcBorders>
+            <w:tcMar>
+              <w:top w:w="60" w:type="dxa"/>
+              <w:left w:w="60" w:type="dxa"/>
+              <w:bottom w:w="60" w:type="dxa"/>
+              <w:right w:w="60" w:type="dxa"/>
+            </w:tcMar>
+            <w:hideMark/>
+          </w:tcPr>
+          <w:p>
+            <w:pPr>
+              <w:rPr>
+                <w:rFonts w:eastAsia="Times New Roman"/>
+                <w:sz w:val="18"/>
+                <w:szCs w:val="18"/>
+              </w:rPr>
+            </w:pPr>
+            <w:r>
+              <w:rPr>
+                <w:rFonts w:eastAsia="Times New Roman"/>
+                <w:sz w:val="18"/>
+                <w:szCs w:val="18"/>
+              </w:rPr>
+              <w:t>2026-10-18</w:t>
+            </w:r>
+          </w:p>
+        </w:tc>
+        <w:tc>
+          <w:tcPr>
+            <w:tcW w:w="0" w:type="auto"/>
+            <w:tcBorders>
+              <w:top w:val="single" w:sz="6" w:space="0" w:color="8C8C8C"/>
+              <w:left w:val="single" w:sz="6" w:space="0" w:color="8C8C8C"/>
+              <w:bottom w:val="single" w:sz="6" w:space="0" w:color="8C8C8C"/>
+              <w:right w:val="single" w:sz="6" w:space="0" w:color="8C8C8C"/>
+            </w:tcBorders>
+            <w:tcMar>
+              <w:top w:w="60" w:type="dxa"/>
+              <w:left w:w="60" w:type="dxa"/>
+              <w:bottom w:w="60" w:type="dxa"/>
+              <w:right w:w="60" w:type="dxa"/>
+            </w:tcMar>
+            <w:hideMark/>
+          </w:tcPr>
+          <w:p>
+            <w:pPr>
+              <w:rPr>
+                <w:rFonts w:eastAsia="Times New Roman"/>
+                <w:sz w:val="18"/>
+                <w:szCs w:val="18"/>
+              </w:rPr>
+            </w:pPr>
+            <w:r>
+              <w:rPr>
+                <w:rFonts w:eastAsia="Times New Roman"/>
+                <w:sz w:val="18"/>
+                <w:szCs w:val="18"/>
+              </w:rPr>
+              <w:t>[Author]</w:t>
+            </w:r>
+          </w:p>
+        </w:tc>
+        <w:tc>
+          <w:tcPr>
+            <w:tcW w:w="0" w:type="auto"/>
+            <w:tcBorders>
+              <w:top w:val="single" w:sz="6" w:space="0" w:color="8C8C8C"/>
+              <w:left w:val="single" w:sz="6" w:space="0" w:color="8C8C8C"/>
+              <w:bottom w:val="single" w:sz="6" w:space="0" w:color="8C8C8C"/>
+              <w:right w:val="single" w:sz="6" w:space="0" w:color="8C8C8C"/>
+            </w:tcBorders>
+            <w:tcMar>
+              <w:top w:w="60" w:type="dxa"/>
+              <w:left w:w="60" w:type="dxa"/>
+              <w:bottom w:w="60" w:type="dxa"/>
+              <w:right w:w="60" w:type="dxa"/>
+            </w:tcMar>
+            <w:hideMark/>
+          </w:tcPr>
+          <w:p>
+            <w:pPr>
+              <w:rPr>
+                <w:rFonts w:eastAsia="Times New Roman"/>
+                <w:sz w:val="18"/>
+                <w:szCs w:val="18"/>
+              </w:rPr>
+            </w:pPr>
+            <w:r>
+              <w:rPr>
+                <w:rFonts w:eastAsia="Times New Roman"/>
+                <w:sz w:val="18"/>
+                <w:szCs w:val="18"/>
+              </w:rPr>
+              <w:t>Site attribute: cloud.region (dc1, dc2) replaces acme.site.name; role kept in acme.site.role.</w:t>
+            </w:r>
+          </w:p>
+        </w:tc>
+      </w:tr>
     </w:tbl>
     <w:p>
       <w:pPr>
@@ -1906,7 +2048,7 @@
         <w:rPr>
           <w:noProof/>
         </w:rPr>
-        <w:instrText xml:space="preserve"> PAGEREF _Toc243221373 \h </w:instrText>
+        <w:instrText xml:space="preserve"> PAGEREF _Toc243225797 \h </w:instrText>
       </w:r>
       <w:r>
         <w:rPr>
@@ -1969,7 +2111,7 @@
         <w:rPr>
           <w:noProof/>
         </w:rPr>
-        <w:instrText xml:space="preserve"> PAGEREF _Toc243221374 \h </w:instrText>
+        <w:instrText xml:space="preserve"> PAGEREF _Toc243225798 \h </w:instrText>
       </w:r>
       <w:r>
         <w:rPr>
@@ -2032,7 +2174,7 @@
         <w:rPr>
           <w:noProof/>
         </w:rPr>
-        <w:instrText xml:space="preserve"> PAGEREF _Toc243221375 \h </w:instrText>
+        <w:instrText xml:space="preserve"> PAGEREF _Toc243225799 \h </w:instrText>
       </w:r>
       <w:r>
         <w:rPr>
@@ -2095,7 +2237,7 @@
         <w:rPr>
           <w:noProof/>
         </w:rPr>
-        <w:instrText xml:space="preserve"> PAGEREF _Toc243221376 \h </w:instrText>
+        <w:instrText xml:space="preserve"> PAGEREF _Toc243225800 \h </w:instrText>
       </w:r>
       <w:r>
         <w:rPr>
@@ -2158,7 +2300,7 @@
         <w:rPr>
           <w:noProof/>
         </w:rPr>
-        <w:instrText xml:space="preserve"> PAGEREF _Toc243221377 \h </w:instrText>
+        <w:instrText xml:space="preserve"> PAGEREF _Toc243225801 \h </w:instrText>
       </w:r>
       <w:r>
         <w:rPr>
@@ -2221,7 +2363,7 @@
         <w:rPr>
           <w:noProof/>
         </w:rPr>
-        <w:instrText xml:space="preserve"> PAGEREF _Toc243221378 \h </w:instrText>
+        <w:instrText xml:space="preserve"> PAGEREF _Toc243225802 \h </w:instrText>
       </w:r>
       <w:r>
         <w:rPr>
@@ -2284,7 +2426,7 @@
         <w:rPr>
           <w:noProof/>
         </w:rPr>
-        <w:instrText xml:space="preserve"> PAGEREF _Toc243221379 \h </w:instrText>
+        <w:instrText xml:space="preserve"> PAGEREF _Toc243225803 \h </w:instrText>
       </w:r>
       <w:r>
         <w:rPr>
@@ -2347,7 +2489,7 @@
         <w:rPr>
           <w:noProof/>
         </w:rPr>
-        <w:instrText xml:space="preserve"> PAGEREF _Toc243221380 \h </w:instrText>
+        <w:instrText xml:space="preserve"> PAGEREF _Toc243225804 \h </w:instrText>
       </w:r>
       <w:r>
         <w:rPr>
@@ -2410,7 +2552,7 @@
         <w:rPr>
           <w:noProof/>
         </w:rPr>
-        <w:instrText xml:space="preserve"> PAGEREF _Toc243221381 \h </w:instrText>
+        <w:instrText xml:space="preserve"> PAGEREF _Toc243225805 \h </w:instrText>
       </w:r>
       <w:r>
         <w:rPr>
@@ -2473,7 +2615,7 @@
         <w:rPr>
           <w:noProof/>
         </w:rPr>
-        <w:instrText xml:space="preserve"> PAGEREF _Toc243221382 \h </w:instrText>
+        <w:instrText xml:space="preserve"> PAGEREF _Toc243225806 \h </w:instrText>
       </w:r>
       <w:r>
         <w:rPr>
@@ -2536,7 +2678,7 @@
         <w:rPr>
           <w:noProof/>
         </w:rPr>
-        <w:instrText xml:space="preserve"> PAGEREF _Toc243221383 \h </w:instrText>
+        <w:instrText xml:space="preserve"> PAGEREF _Toc243225807 \h </w:instrText>
       </w:r>
       <w:r>
         <w:rPr>
@@ -2599,7 +2741,7 @@
         <w:rPr>
           <w:noProof/>
         </w:rPr>
-        <w:instrText xml:space="preserve"> PAGEREF _Toc243221384 \h </w:instrText>
+        <w:instrText xml:space="preserve"> PAGEREF _Toc243225808 \h </w:instrText>
       </w:r>
       <w:r>
         <w:rPr>
@@ -2662,7 +2804,7 @@
         <w:rPr>
           <w:noProof/>
         </w:rPr>
-        <w:instrText xml:space="preserve"> PAGEREF _Toc243221385 \h </w:instrText>
+        <w:instrText xml:space="preserve"> PAGEREF _Toc243225809 \h </w:instrText>
       </w:r>
       <w:r>
         <w:rPr>
@@ -2725,7 +2867,7 @@
         <w:rPr>
           <w:noProof/>
         </w:rPr>
-        <w:instrText xml:space="preserve"> PAGEREF _Toc243221386 \h </w:instrText>
+        <w:instrText xml:space="preserve"> PAGEREF _Toc243225810 \h </w:instrText>
       </w:r>
       <w:r>
         <w:rPr>
@@ -2788,7 +2930,7 @@
         <w:rPr>
           <w:noProof/>
         </w:rPr>
-        <w:instrText xml:space="preserve"> PAGEREF _Toc243221387 \h </w:instrText>
+        <w:instrText xml:space="preserve"> PAGEREF _Toc243225811 \h </w:instrText>
       </w:r>
       <w:r>
         <w:rPr>
@@ -2851,7 +2993,7 @@
         <w:rPr>
           <w:noProof/>
         </w:rPr>
-        <w:instrText xml:space="preserve"> PAGEREF _Toc243221388 \h </w:instrText>
+        <w:instrText xml:space="preserve"> PAGEREF _Toc243225812 \h </w:instrText>
       </w:r>
       <w:r>
         <w:rPr>
@@ -2914,7 +3056,7 @@
         <w:rPr>
           <w:noProof/>
         </w:rPr>
-        <w:instrText xml:space="preserve"> PAGEREF _Toc243221389 \h </w:instrText>
+        <w:instrText xml:space="preserve"> PAGEREF _Toc243225813 \h </w:instrText>
       </w:r>
       <w:r>
         <w:rPr>
@@ -2977,7 +3119,7 @@
         <w:rPr>
           <w:noProof/>
         </w:rPr>
-        <w:instrText xml:space="preserve"> PAGEREF _Toc243221390 \h </w:instrText>
+        <w:instrText xml:space="preserve"> PAGEREF _Toc243225814 \h </w:instrText>
       </w:r>
       <w:r>
         <w:rPr>
@@ -3040,7 +3182,7 @@
         <w:rPr>
           <w:noProof/>
         </w:rPr>
-        <w:instrText xml:space="preserve"> PAGEREF _Toc243221391 \h </w:instrText>
+        <w:instrText xml:space="preserve"> PAGEREF _Toc243225815 \h </w:instrText>
       </w:r>
       <w:r>
         <w:rPr>
@@ -3103,7 +3245,7 @@
         <w:rPr>
           <w:noProof/>
         </w:rPr>
-        <w:instrText xml:space="preserve"> PAGEREF _Toc243221392 \h </w:instrText>
+        <w:instrText xml:space="preserve"> PAGEREF _Toc243225816 \h </w:instrText>
       </w:r>
       <w:r>
         <w:rPr>
@@ -3166,7 +3308,7 @@
         <w:rPr>
           <w:noProof/>
         </w:rPr>
-        <w:instrText xml:space="preserve"> PAGEREF _Toc243221393 \h </w:instrText>
+        <w:instrText xml:space="preserve"> PAGEREF _Toc243225817 \h </w:instrText>
       </w:r>
       <w:r>
         <w:rPr>
@@ -3229,7 +3371,7 @@
         <w:rPr>
           <w:noProof/>
         </w:rPr>
-        <w:instrText xml:space="preserve"> PAGEREF _Toc243221394 \h </w:instrText>
+        <w:instrText xml:space="preserve"> PAGEREF _Toc243225818 \h </w:instrText>
       </w:r>
       <w:r>
         <w:rPr>
@@ -3292,7 +3434,7 @@
         <w:rPr>
           <w:noProof/>
         </w:rPr>
-        <w:instrText xml:space="preserve"> PAGEREF _Toc243221395 \h </w:instrText>
+        <w:instrText xml:space="preserve"> PAGEREF _Toc243225819 \h </w:instrText>
       </w:r>
       <w:r>
         <w:rPr>
@@ -3355,7 +3497,7 @@
         <w:rPr>
           <w:noProof/>
         </w:rPr>
-        <w:instrText xml:space="preserve"> PAGEREF _Toc243221396 \h </w:instrText>
+        <w:instrText xml:space="preserve"> PAGEREF _Toc243225820 \h </w:instrText>
       </w:r>
       <w:r>
         <w:rPr>
@@ -3418,7 +3560,7 @@
         <w:rPr>
           <w:noProof/>
         </w:rPr>
-        <w:instrText xml:space="preserve"> PAGEREF _Toc243221397 \h </w:instrText>
+        <w:instrText xml:space="preserve"> PAGEREF _Toc243225821 \h </w:instrText>
       </w:r>
       <w:r>
         <w:rPr>
@@ -3481,7 +3623,7 @@
         <w:rPr>
           <w:noProof/>
         </w:rPr>
-        <w:instrText xml:space="preserve"> PAGEREF _Toc243221398 \h </w:instrText>
+        <w:instrText xml:space="preserve"> PAGEREF _Toc243225822 \h </w:instrText>
       </w:r>
       <w:r>
         <w:rPr>
@@ -3544,7 +3686,7 @@
         <w:rPr>
           <w:noProof/>
         </w:rPr>
-        <w:instrText xml:space="preserve"> PAGEREF _Toc243221399 \h </w:instrText>
+        <w:instrText xml:space="preserve"> PAGEREF _Toc243225823 \h </w:instrText>
       </w:r>
       <w:r>
         <w:rPr>
@@ -3607,7 +3749,7 @@
         <w:rPr>
           <w:noProof/>
         </w:rPr>
-        <w:instrText xml:space="preserve"> PAGEREF _Toc243221400 \h </w:instrText>
+        <w:instrText xml:space="preserve"> PAGEREF _Toc243225824 \h </w:instrText>
       </w:r>
       <w:r>
         <w:rPr>
@@ -3670,7 +3812,7 @@
         <w:rPr>
           <w:noProof/>
         </w:rPr>
-        <w:instrText xml:space="preserve"> PAGEREF _Toc243221401 \h </w:instrText>
+        <w:instrText xml:space="preserve"> PAGEREF _Toc243225825 \h </w:instrText>
       </w:r>
       <w:r>
         <w:rPr>
@@ -3733,7 +3875,7 @@
         <w:rPr>
           <w:noProof/>
         </w:rPr>
-        <w:instrText xml:space="preserve"> PAGEREF _Toc243221402 \h </w:instrText>
+        <w:instrText xml:space="preserve"> PAGEREF _Toc243225826 \h </w:instrText>
       </w:r>
       <w:r>
         <w:rPr>
@@ -3796,7 +3938,7 @@
         <w:rPr>
           <w:noProof/>
         </w:rPr>
-        <w:instrText xml:space="preserve"> PAGEREF _Toc243221403 \h </w:instrText>
+        <w:instrText xml:space="preserve"> PAGEREF _Toc243225827 \h </w:instrText>
       </w:r>
       <w:r>
         <w:rPr>
@@ -3859,7 +4001,7 @@
         <w:rPr>
           <w:noProof/>
         </w:rPr>
-        <w:instrText xml:space="preserve"> PAGEREF _Toc243221404 \h </w:instrText>
+        <w:instrText xml:space="preserve"> PAGEREF _Toc243225828 \h </w:instrText>
       </w:r>
       <w:r>
         <w:rPr>
@@ -3922,7 +4064,7 @@
         <w:rPr>
           <w:noProof/>
         </w:rPr>
-        <w:instrText xml:space="preserve"> PAGEREF _Toc243221405 \h </w:instrText>
+        <w:instrText xml:space="preserve"> PAGEREF _Toc243225829 \h </w:instrText>
       </w:r>
       <w:r>
         <w:rPr>
@@ -3985,7 +4127,7 @@
         <w:rPr>
           <w:noProof/>
         </w:rPr>
-        <w:instrText xml:space="preserve"> PAGEREF _Toc243221406 \h </w:instrText>
+        <w:instrText xml:space="preserve"> PAGEREF _Toc243225830 \h </w:instrText>
       </w:r>
       <w:r>
         <w:rPr>
@@ -4048,7 +4190,7 @@
         <w:rPr>
           <w:noProof/>
         </w:rPr>
-        <w:instrText xml:space="preserve"> PAGEREF _Toc243221407 \h </w:instrText>
+        <w:instrText xml:space="preserve"> PAGEREF _Toc243225831 \h </w:instrText>
       </w:r>
       <w:r>
         <w:rPr>
@@ -4111,7 +4253,7 @@
         <w:rPr>
           <w:noProof/>
         </w:rPr>
-        <w:instrText xml:space="preserve"> PAGEREF _Toc243221408 \h </w:instrText>
+        <w:instrText xml:space="preserve"> PAGEREF _Toc243225832 \h </w:instrText>
       </w:r>
       <w:r>
         <w:rPr>
@@ -4174,7 +4316,7 @@
         <w:rPr>
           <w:noProof/>
         </w:rPr>
-        <w:instrText xml:space="preserve"> PAGEREF _Toc243221409 \h </w:instrText>
+        <w:instrText xml:space="preserve"> PAGEREF _Toc243225833 \h </w:instrText>
       </w:r>
       <w:r>
         <w:rPr>
@@ -4237,7 +4379,7 @@
         <w:rPr>
           <w:noProof/>
         </w:rPr>
-        <w:instrText xml:space="preserve"> PAGEREF _Toc243221410 \h </w:instrText>
+        <w:instrText xml:space="preserve"> PAGEREF _Toc243225834 \h </w:instrText>
       </w:r>
       <w:r>
         <w:rPr>
@@ -4300,7 +4442,7 @@
         <w:rPr>
           <w:noProof/>
         </w:rPr>
-        <w:instrText xml:space="preserve"> PAGEREF _Toc243221411 \h </w:instrText>
+        <w:instrText xml:space="preserve"> PAGEREF _Toc243225835 \h </w:instrText>
       </w:r>
       <w:r>
         <w:rPr>
@@ -4363,7 +4505,7 @@
         <w:rPr>
           <w:noProof/>
         </w:rPr>
-        <w:instrText xml:space="preserve"> PAGEREF _Toc243221412 \h </w:instrText>
+        <w:instrText xml:space="preserve"> PAGEREF _Toc243225836 \h </w:instrText>
       </w:r>
       <w:r>
         <w:rPr>
@@ -4427,7 +4569,7 @@
         <w:rPr>
           <w:noProof/>
         </w:rPr>
-        <w:instrText xml:space="preserve"> PAGEREF _Toc243221413 \h </w:instrText>
+        <w:instrText xml:space="preserve"> PAGEREF _Toc243225837 \h </w:instrText>
       </w:r>
       <w:r>
         <w:rPr>
@@ -4490,7 +4632,7 @@
         <w:rPr>
           <w:noProof/>
         </w:rPr>
-        <w:instrText xml:space="preserve"> PAGEREF _Toc243221414 \h </w:instrText>
+        <w:instrText xml:space="preserve"> PAGEREF _Toc243225838 \h </w:instrText>
       </w:r>
       <w:r>
         <w:rPr>
@@ -4553,7 +4695,7 @@
         <w:rPr>
           <w:noProof/>
         </w:rPr>
-        <w:instrText xml:space="preserve"> PAGEREF _Toc243221415 \h </w:instrText>
+        <w:instrText xml:space="preserve"> PAGEREF _Toc243225839 \h </w:instrText>
       </w:r>
       <w:r>
         <w:rPr>
@@ -4616,7 +4758,7 @@
         <w:rPr>
           <w:noProof/>
         </w:rPr>
-        <w:instrText xml:space="preserve"> PAGEREF _Toc243221416 \h </w:instrText>
+        <w:instrText xml:space="preserve"> PAGEREF _Toc243225840 \h </w:instrText>
       </w:r>
       <w:r>
         <w:rPr>
@@ -4679,7 +4821,7 @@
         <w:rPr>
           <w:noProof/>
         </w:rPr>
-        <w:instrText xml:space="preserve"> PAGEREF _Toc243221417 \h </w:instrText>
+        <w:instrText xml:space="preserve"> PAGEREF _Toc243225841 \h </w:instrText>
       </w:r>
       <w:r>
         <w:rPr>
@@ -4742,7 +4884,7 @@
         <w:rPr>
           <w:noProof/>
         </w:rPr>
-        <w:instrText xml:space="preserve"> PAGEREF _Toc243221418 \h </w:instrText>
+        <w:instrText xml:space="preserve"> PAGEREF _Toc243225842 \h </w:instrText>
       </w:r>
       <w:r>
         <w:rPr>
@@ -4805,7 +4947,7 @@
         <w:rPr>
           <w:noProof/>
         </w:rPr>
-        <w:instrText xml:space="preserve"> PAGEREF _Toc243221419 \h </w:instrText>
+        <w:instrText xml:space="preserve"> PAGEREF _Toc243225843 \h </w:instrText>
       </w:r>
       <w:r>
         <w:rPr>
@@ -4868,7 +5010,7 @@
         <w:rPr>
           <w:noProof/>
         </w:rPr>
-        <w:instrText xml:space="preserve"> PAGEREF _Toc243221420 \h </w:instrText>
+        <w:instrText xml:space="preserve"> PAGEREF _Toc243225844 \h </w:instrText>
       </w:r>
       <w:r>
         <w:rPr>
@@ -4931,7 +5073,7 @@
         <w:rPr>
           <w:noProof/>
         </w:rPr>
-        <w:instrText xml:space="preserve"> PAGEREF _Toc243221421 \h </w:instrText>
+        <w:instrText xml:space="preserve"> PAGEREF _Toc243225845 \h </w:instrText>
       </w:r>
       <w:r>
         <w:rPr>
@@ -4994,7 +5136,7 @@
         <w:rPr>
           <w:noProof/>
         </w:rPr>
-        <w:instrText xml:space="preserve"> PAGEREF _Toc243221422 \h </w:instrText>
+        <w:instrText xml:space="preserve"> PAGEREF _Toc243225846 \h </w:instrText>
       </w:r>
       <w:r>
         <w:rPr>
@@ -5057,7 +5199,7 @@
         <w:rPr>
           <w:noProof/>
         </w:rPr>
-        <w:instrText xml:space="preserve"> PAGEREF _Toc243221423 \h </w:instrText>
+        <w:instrText xml:space="preserve"> PAGEREF _Toc243225847 \h </w:instrText>
       </w:r>
       <w:r>
         <w:rPr>
@@ -5120,7 +5262,7 @@
         <w:rPr>
           <w:noProof/>
         </w:rPr>
-        <w:instrText xml:space="preserve"> PAGEREF _Toc243221424 \h </w:instrText>
+        <w:instrText xml:space="preserve"> PAGEREF _Toc243225848 \h </w:instrText>
       </w:r>
       <w:r>
         <w:rPr>
@@ -5183,7 +5325,7 @@
         <w:rPr>
           <w:noProof/>
         </w:rPr>
-        <w:instrText xml:space="preserve"> PAGEREF _Toc243221425 \h </w:instrText>
+        <w:instrText xml:space="preserve"> PAGEREF _Toc243225849 \h </w:instrText>
       </w:r>
       <w:r>
         <w:rPr>
@@ -5246,7 +5388,7 @@
         <w:rPr>
           <w:noProof/>
         </w:rPr>
-        <w:instrText xml:space="preserve"> PAGEREF _Toc243221426 \h </w:instrText>
+        <w:instrText xml:space="preserve"> PAGEREF _Toc243225850 \h </w:instrText>
       </w:r>
       <w:r>
         <w:rPr>
@@ -5309,7 +5451,7 @@
         <w:rPr>
           <w:noProof/>
         </w:rPr>
-        <w:instrText xml:space="preserve"> PAGEREF _Toc243221427 \h </w:instrText>
+        <w:instrText xml:space="preserve"> PAGEREF _Toc243225851 \h </w:instrText>
       </w:r>
       <w:r>
         <w:rPr>
@@ -5372,7 +5514,7 @@
         <w:rPr>
           <w:noProof/>
         </w:rPr>
-        <w:instrText xml:space="preserve"> PAGEREF _Toc243221428 \h </w:instrText>
+        <w:instrText xml:space="preserve"> PAGEREF _Toc243225852 \h </w:instrText>
       </w:r>
       <w:r>
         <w:rPr>
@@ -5435,7 +5577,7 @@
         <w:rPr>
           <w:noProof/>
         </w:rPr>
-        <w:instrText xml:space="preserve"> PAGEREF _Toc243221429 \h </w:instrText>
+        <w:instrText xml:space="preserve"> PAGEREF _Toc243225853 \h </w:instrText>
       </w:r>
       <w:r>
         <w:rPr>
@@ -5498,7 +5640,7 @@
         <w:rPr>
           <w:noProof/>
         </w:rPr>
-        <w:instrText xml:space="preserve"> PAGEREF _Toc243221430 \h </w:instrText>
+        <w:instrText xml:space="preserve"> PAGEREF _Toc243225854 \h </w:instrText>
       </w:r>
       <w:r>
         <w:rPr>
@@ -5561,7 +5703,7 @@
         <w:rPr>
           <w:noProof/>
         </w:rPr>
-        <w:instrText xml:space="preserve"> PAGEREF _Toc243221431 \h </w:instrText>
+        <w:instrText xml:space="preserve"> PAGEREF _Toc243225855 \h </w:instrText>
       </w:r>
       <w:r>
         <w:rPr>
@@ -5624,7 +5766,7 @@
         <w:rPr>
           <w:noProof/>
         </w:rPr>
-        <w:instrText xml:space="preserve"> PAGEREF _Toc243221432 \h </w:instrText>
+        <w:instrText xml:space="preserve"> PAGEREF _Toc243225856 \h </w:instrText>
       </w:r>
       <w:r>
         <w:rPr>
@@ -5687,7 +5829,7 @@
         <w:rPr>
           <w:noProof/>
         </w:rPr>
-        <w:instrText xml:space="preserve"> PAGEREF _Toc243221433 \h </w:instrText>
+        <w:instrText xml:space="preserve"> PAGEREF _Toc243225857 \h </w:instrText>
       </w:r>
       <w:r>
         <w:rPr>
@@ -5750,7 +5892,7 @@
         <w:rPr>
           <w:noProof/>
         </w:rPr>
-        <w:instrText xml:space="preserve"> PAGEREF _Toc243221434 \h </w:instrText>
+        <w:instrText xml:space="preserve"> PAGEREF _Toc243225858 \h </w:instrText>
       </w:r>
       <w:r>
         <w:rPr>
@@ -5813,7 +5955,7 @@
         <w:rPr>
           <w:noProof/>
         </w:rPr>
-        <w:instrText xml:space="preserve"> PAGEREF _Toc243221435 \h </w:instrText>
+        <w:instrText xml:space="preserve"> PAGEREF _Toc243225859 \h </w:instrText>
       </w:r>
       <w:r>
         <w:rPr>
@@ -5876,7 +6018,7 @@
         <w:rPr>
           <w:noProof/>
         </w:rPr>
-        <w:instrText xml:space="preserve"> PAGEREF _Toc243221436 \h </w:instrText>
+        <w:instrText xml:space="preserve"> PAGEREF _Toc243225860 \h </w:instrText>
       </w:r>
       <w:r>
         <w:rPr>
@@ -5939,7 +6081,7 @@
         <w:rPr>
           <w:noProof/>
         </w:rPr>
-        <w:instrText xml:space="preserve"> PAGEREF _Toc243221437 \h </w:instrText>
+        <w:instrText xml:space="preserve"> PAGEREF _Toc243225861 \h </w:instrText>
       </w:r>
       <w:r>
         <w:rPr>
@@ -6002,7 +6144,7 @@
         <w:rPr>
           <w:noProof/>
         </w:rPr>
-        <w:instrText xml:space="preserve"> PAGEREF _Toc243221438 \h </w:instrText>
+        <w:instrText xml:space="preserve"> PAGEREF _Toc243225862 \h </w:instrText>
       </w:r>
       <w:r>
         <w:rPr>
@@ -6065,7 +6207,7 @@
         <w:rPr>
           <w:noProof/>
         </w:rPr>
-        <w:instrText xml:space="preserve"> PAGEREF _Toc243221439 \h </w:instrText>
+        <w:instrText xml:space="preserve"> PAGEREF _Toc243225863 \h </w:instrText>
       </w:r>
       <w:r>
         <w:rPr>
@@ -6128,7 +6270,7 @@
         <w:rPr>
           <w:noProof/>
         </w:rPr>
-        <w:instrText xml:space="preserve"> PAGEREF _Toc243221440 \h </w:instrText>
+        <w:instrText xml:space="preserve"> PAGEREF _Toc243225864 \h </w:instrText>
       </w:r>
       <w:r>
         <w:rPr>
@@ -6191,7 +6333,7 @@
         <w:rPr>
           <w:noProof/>
         </w:rPr>
-        <w:instrText xml:space="preserve"> PAGEREF _Toc243221441 \h </w:instrText>
+        <w:instrText xml:space="preserve"> PAGEREF _Toc243225865 \h </w:instrText>
       </w:r>
       <w:r>
         <w:rPr>
@@ -6254,7 +6396,7 @@
         <w:rPr>
           <w:noProof/>
         </w:rPr>
-        <w:instrText xml:space="preserve"> PAGEREF _Toc243221442 \h </w:instrText>
+        <w:instrText xml:space="preserve"> PAGEREF _Toc243225866 \h </w:instrText>
       </w:r>
       <w:r>
         <w:rPr>
@@ -6317,7 +6459,7 @@
         <w:rPr>
           <w:noProof/>
         </w:rPr>
-        <w:instrText xml:space="preserve"> PAGEREF _Toc243221443 \h </w:instrText>
+        <w:instrText xml:space="preserve"> PAGEREF _Toc243225867 \h </w:instrText>
       </w:r>
       <w:r>
         <w:rPr>
@@ -6380,7 +6522,7 @@
         <w:rPr>
           <w:noProof/>
         </w:rPr>
-        <w:instrText xml:space="preserve"> PAGEREF _Toc243221444 \h </w:instrText>
+        <w:instrText xml:space="preserve"> PAGEREF _Toc243225868 \h </w:instrText>
       </w:r>
       <w:r>
         <w:rPr>
@@ -6443,7 +6585,7 @@
         <w:rPr>
           <w:noProof/>
         </w:rPr>
-        <w:instrText xml:space="preserve"> PAGEREF _Toc243221445 \h </w:instrText>
+        <w:instrText xml:space="preserve"> PAGEREF _Toc243225869 \h </w:instrText>
       </w:r>
       <w:r>
         <w:rPr>
@@ -6506,7 +6648,7 @@
         <w:rPr>
           <w:noProof/>
         </w:rPr>
-        <w:instrText xml:space="preserve"> PAGEREF _Toc243221446 \h </w:instrText>
+        <w:instrText xml:space="preserve"> PAGEREF _Toc243225870 \h </w:instrText>
       </w:r>
       <w:r>
         <w:rPr>
@@ -6569,7 +6711,7 @@
         <w:rPr>
           <w:noProof/>
         </w:rPr>
-        <w:instrText xml:space="preserve"> PAGEREF _Toc243221447 \h </w:instrText>
+        <w:instrText xml:space="preserve"> PAGEREF _Toc243225871 \h </w:instrText>
       </w:r>
       <w:r>
         <w:rPr>
@@ -6616,7 +6758,7 @@
           <w:rFonts w:eastAsia="Times New Roman"/>
         </w:rPr>
       </w:pPr>
-      <w:bookmarkStart w:id="0" w:name="_Toc243221373"/>
+      <w:bookmarkStart w:id="0" w:name="_Toc243225797"/>
       <w:r>
         <w:rPr>
           <w:rFonts w:eastAsia="Times New Roman"/>
@@ -6633,7 +6775,7 @@
           <w:rFonts w:eastAsia="Times New Roman"/>
         </w:rPr>
       </w:pPr>
-      <w:bookmarkStart w:id="1" w:name="_Toc243221374"/>
+      <w:bookmarkStart w:id="1" w:name="_Toc243225798"/>
       <w:r>
         <w:rPr>
           <w:rFonts w:eastAsia="Times New Roman"/>
@@ -6710,7 +6852,14 @@
           <w:rFonts w:eastAsia="Times New Roman"/>
           <w:szCs w:val="20"/>
         </w:rPr>
-        <w:t xml:space="preserve"> of each delivery against its contractual specification, functional and non-functional, with sealed evidence.</w:t>
+        <w:t xml:space="preserve"> </w:t>
+      </w:r>
+      <w:r>
+        <w:rPr>
+          <w:rFonts w:eastAsia="Times New Roman"/>
+          <w:szCs w:val="20"/>
+        </w:rPr>
+        <w:t>of each delivery against its contractual specification, functional and non-functional, with sealed evidence.</w:t>
       </w:r>
     </w:p>
     <w:p>
@@ -6778,7 +6927,7 @@
           <w:rFonts w:eastAsia="Times New Roman"/>
         </w:rPr>
       </w:pPr>
-      <w:bookmarkStart w:id="2" w:name="_Toc243221375"/>
+      <w:bookmarkStart w:id="2" w:name="_Toc243225799"/>
       <w:r>
         <w:rPr>
           <w:rFonts w:eastAsia="Times New Roman"/>
@@ -6973,7 +7122,7 @@
           <w:rFonts w:eastAsia="Times New Roman"/>
         </w:rPr>
       </w:pPr>
-      <w:bookmarkStart w:id="3" w:name="_Toc243221376"/>
+      <w:bookmarkStart w:id="3" w:name="_Toc243225800"/>
       <w:r>
         <w:rPr>
           <w:rFonts w:eastAsia="Times New Roman"/>
@@ -7456,7 +7605,7 @@
           <w:rFonts w:eastAsia="Times New Roman"/>
         </w:rPr>
       </w:pPr>
-      <w:bookmarkStart w:id="4" w:name="_Toc243221377"/>
+      <w:bookmarkStart w:id="4" w:name="_Toc243225801"/>
       <w:r>
         <w:rPr>
           <w:rFonts w:eastAsia="Times New Roman"/>
@@ -8444,7 +8593,7 @@
           <w:rFonts w:eastAsia="Times New Roman"/>
         </w:rPr>
       </w:pPr>
-      <w:bookmarkStart w:id="5" w:name="_Toc243221378"/>
+      <w:bookmarkStart w:id="5" w:name="_Toc243225802"/>
       <w:r>
         <w:rPr>
           <w:rFonts w:eastAsia="Times New Roman"/>
@@ -9287,7 +9436,7 @@
           <w:rFonts w:eastAsia="Times New Roman"/>
         </w:rPr>
       </w:pPr>
-      <w:bookmarkStart w:id="6" w:name="_Toc243221379"/>
+      <w:bookmarkStart w:id="6" w:name="_Toc243225803"/>
       <w:r>
         <w:rPr>
           <w:rFonts w:eastAsia="Times New Roman"/>
@@ -9593,7 +9742,7 @@
           <w:rFonts w:eastAsia="Times New Roman"/>
         </w:rPr>
       </w:pPr>
-      <w:bookmarkStart w:id="7" w:name="_Toc243221380"/>
+      <w:bookmarkStart w:id="7" w:name="_Toc243225804"/>
       <w:r>
         <w:rPr>
           <w:rFonts w:eastAsia="Times New Roman"/>
@@ -9610,7 +9759,7 @@
           <w:rFonts w:eastAsia="Times New Roman"/>
         </w:rPr>
       </w:pPr>
-      <w:bookmarkStart w:id="8" w:name="_Toc243221381"/>
+      <w:bookmarkStart w:id="8" w:name="_Toc243225805"/>
       <w:r>
         <w:rPr>
           <w:rFonts w:eastAsia="Times New Roman"/>
@@ -10107,7 +10256,7 @@
           <w:rFonts w:eastAsia="Times New Roman"/>
         </w:rPr>
       </w:pPr>
-      <w:bookmarkStart w:id="9" w:name="_Toc243221382"/>
+      <w:bookmarkStart w:id="9" w:name="_Toc243225806"/>
       <w:r>
         <w:rPr>
           <w:rFonts w:eastAsia="Times New Roman"/>
@@ -10662,7 +10811,7 @@
           <w:rFonts w:eastAsia="Times New Roman"/>
         </w:rPr>
       </w:pPr>
-      <w:bookmarkStart w:id="10" w:name="_Toc243221383"/>
+      <w:bookmarkStart w:id="10" w:name="_Toc243225807"/>
       <w:r>
         <w:rPr>
           <w:rFonts w:eastAsia="Times New Roman"/>
@@ -11485,7 +11634,7 @@
           <w:rFonts w:eastAsia="Times New Roman"/>
         </w:rPr>
       </w:pPr>
-      <w:bookmarkStart w:id="11" w:name="_Toc243221384"/>
+      <w:bookmarkStart w:id="11" w:name="_Toc243225808"/>
       <w:r>
         <w:rPr>
           <w:rFonts w:eastAsia="Times New Roman"/>
@@ -12744,7 +12893,7 @@
           <w:rFonts w:eastAsia="Times New Roman"/>
         </w:rPr>
       </w:pPr>
-      <w:bookmarkStart w:id="12" w:name="_Toc243221385"/>
+      <w:bookmarkStart w:id="12" w:name="_Toc243225809"/>
       <w:r>
         <w:rPr>
           <w:rFonts w:eastAsia="Times New Roman"/>
@@ -12840,7 +12989,7 @@
           <w:rFonts w:eastAsia="Times New Roman"/>
         </w:rPr>
       </w:pPr>
-      <w:bookmarkStart w:id="13" w:name="_Toc243221386"/>
+      <w:bookmarkStart w:id="13" w:name="_Toc243225810"/>
       <w:r>
         <w:rPr>
           <w:rFonts w:eastAsia="Times New Roman"/>
@@ -12936,7 +13085,7 @@
           <w:rFonts w:eastAsia="Times New Roman"/>
         </w:rPr>
       </w:pPr>
-      <w:bookmarkStart w:id="14" w:name="_Toc243221387"/>
+      <w:bookmarkStart w:id="14" w:name="_Toc243225811"/>
       <w:r>
         <w:rPr>
           <w:rFonts w:eastAsia="Times New Roman"/>
@@ -12953,7 +13102,7 @@
           <w:rFonts w:eastAsia="Times New Roman"/>
         </w:rPr>
       </w:pPr>
-      <w:bookmarkStart w:id="15" w:name="_Toc243221388"/>
+      <w:bookmarkStart w:id="15" w:name="_Toc243225812"/>
       <w:r>
         <w:rPr>
           <w:rFonts w:eastAsia="Times New Roman"/>
@@ -13535,7 +13684,7 @@
                 <w:sz w:val="18"/>
                 <w:szCs w:val="18"/>
               </w:rPr>
-              <w:t>Environment and site are resource attributes stamped by the cluster collector, not request headers.</w:t>
+              <w:t>Environment and site are resource attributes stamped by the cluster collector, not request headers. The site is cloud.region (location); the disaster-recovery role is a separate attribute.</w:t>
             </w:r>
           </w:p>
         </w:tc>
@@ -13869,7 +14018,7 @@
           <w:rFonts w:eastAsia="Times New Roman"/>
         </w:rPr>
       </w:pPr>
-      <w:bookmarkStart w:id="16" w:name="_Toc243221389"/>
+      <w:bookmarkStart w:id="16" w:name="_Toc243225813"/>
       <w:r>
         <w:rPr>
           <w:rFonts w:eastAsia="Times New Roman"/>
@@ -14678,7 +14827,7 @@
           <w:rFonts w:eastAsia="Times New Roman"/>
         </w:rPr>
       </w:pPr>
-      <w:bookmarkStart w:id="17" w:name="_Toc243221390"/>
+      <w:bookmarkStart w:id="17" w:name="_Toc243225814"/>
       <w:r>
         <w:rPr>
           <w:rFonts w:eastAsia="Times New Roman"/>
@@ -15481,6 +15630,7 @@
                 <w:sz w:val="18"/>
                 <w:szCs w:val="18"/>
               </w:rPr>
+              <w:lastRenderedPageBreak/>
               <w:t>Collector gateway</w:t>
             </w:r>
           </w:p>
@@ -15623,7 +15773,6 @@
                 <w:sz w:val="18"/>
                 <w:szCs w:val="18"/>
               </w:rPr>
-              <w:lastRenderedPageBreak/>
               <w:t>Trace store</w:t>
             </w:r>
           </w:p>
@@ -16736,7 +16885,7 @@
           <w:rFonts w:eastAsia="Times New Roman"/>
         </w:rPr>
       </w:pPr>
-      <w:bookmarkStart w:id="18" w:name="_Toc243221391"/>
+      <w:bookmarkStart w:id="18" w:name="_Toc243225815"/>
       <w:r>
         <w:rPr>
           <w:rFonts w:eastAsia="Times New Roman"/>
@@ -16912,7 +17061,7 @@
           <w:rFonts w:eastAsia="Times New Roman"/>
         </w:rPr>
       </w:pPr>
-      <w:bookmarkStart w:id="19" w:name="_Toc243221392"/>
+      <w:bookmarkStart w:id="19" w:name="_Toc243225816"/>
       <w:r>
         <w:rPr>
           <w:rFonts w:eastAsia="Times New Roman"/>
@@ -17715,7 +17864,7 @@
                 <w:sz w:val="18"/>
                 <w:szCs w:val="18"/>
               </w:rPr>
-              <w:t>deployment.environment.name, k8s.cluster.name, acme.site.name</w:t>
+              <w:t>deployment.environment.name, k8s.cluster.name, cloud.region</w:t>
             </w:r>
           </w:p>
         </w:tc>
@@ -17820,7 +17969,7 @@
                 <w:sz w:val="18"/>
                 <w:szCs w:val="18"/>
               </w:rPr>
-              <w:t>OTel and organisation</w:t>
+              <w:t>OTel semantic conventions</w:t>
             </w:r>
           </w:p>
         </w:tc>
@@ -17833,7 +17982,7 @@
           <w:rFonts w:eastAsia="Times New Roman"/>
         </w:rPr>
       </w:pPr>
-      <w:bookmarkStart w:id="20" w:name="_Toc243221393"/>
+      <w:bookmarkStart w:id="20" w:name="_Toc243225817"/>
       <w:r>
         <w:rPr>
           <w:rFonts w:eastAsia="Times New Roman"/>
@@ -17859,7 +18008,7 @@
         <w:rPr>
           <w:rStyle w:val="CodeHTML"/>
         </w:rPr>
-        <w:t>acme.site.name</w:t>
+        <w:t>cloud.region</w:t>
       </w:r>
       <w:r>
         <w:rPr>
@@ -17875,7 +18024,7 @@
           <w:rFonts w:eastAsia="Times New Roman"/>
         </w:rPr>
       </w:pPr>
-      <w:bookmarkStart w:id="21" w:name="_Toc243221394"/>
+      <w:bookmarkStart w:id="21" w:name="_Toc243225818"/>
       <w:r>
         <w:rPr>
           <w:rFonts w:eastAsia="Times New Roman"/>
@@ -17892,7 +18041,7 @@
           <w:rFonts w:eastAsia="Times New Roman"/>
         </w:rPr>
       </w:pPr>
-      <w:bookmarkStart w:id="22" w:name="_Toc243221395"/>
+      <w:bookmarkStart w:id="22" w:name="_Toc243225819"/>
       <w:r>
         <w:rPr>
           <w:rFonts w:eastAsia="Times New Roman"/>
@@ -18501,7 +18650,7 @@
           <w:rFonts w:eastAsia="Times New Roman"/>
         </w:rPr>
       </w:pPr>
-      <w:bookmarkStart w:id="23" w:name="_Toc243221396"/>
+      <w:bookmarkStart w:id="23" w:name="_Toc243225820"/>
       <w:r>
         <w:rPr>
           <w:rFonts w:eastAsia="Times New Roman"/>
@@ -19162,7 +19311,7 @@
                 <w:sz w:val="18"/>
                 <w:szCs w:val="18"/>
               </w:rPr>
-              <w:t>acme.site.name, acme.site.role, acme.env.id, acme.env.config.version</w:t>
+              <w:t>cloud.region (physical site), cloud.availability_zone (optional)</w:t>
             </w:r>
           </w:p>
         </w:tc>
@@ -19232,42 +19381,42 @@
                 <w:sz w:val="18"/>
                 <w:szCs w:val="18"/>
               </w:rPr>
-              <w:t>DC1, primary, ENV-000123</w:t>
-            </w:r>
-          </w:p>
-        </w:tc>
-        <w:tc>
-          <w:tcPr>
-            <w:tcW w:w="0" w:type="auto"/>
-            <w:tcBorders>
-              <w:top w:val="single" w:sz="6" w:space="0" w:color="8C8C8C"/>
-              <w:left w:val="single" w:sz="6" w:space="0" w:color="8C8C8C"/>
-              <w:bottom w:val="single" w:sz="6" w:space="0" w:color="8C8C8C"/>
-              <w:right w:val="single" w:sz="6" w:space="0" w:color="8C8C8C"/>
-            </w:tcBorders>
-            <w:tcMar>
-              <w:top w:w="60" w:type="dxa"/>
-              <w:left w:w="60" w:type="dxa"/>
-              <w:bottom w:w="60" w:type="dxa"/>
-              <w:right w:w="60" w:type="dxa"/>
-            </w:tcMar>
-            <w:hideMark/>
-          </w:tcPr>
-          <w:p>
-            <w:pPr>
-              <w:rPr>
-                <w:rFonts w:eastAsia="Times New Roman"/>
-                <w:sz w:val="18"/>
-                <w:szCs w:val="18"/>
-              </w:rPr>
-            </w:pPr>
-            <w:r>
-              <w:rPr>
-                <w:rFonts w:eastAsia="Times New Roman"/>
-                <w:sz w:val="18"/>
-                <w:szCs w:val="18"/>
-              </w:rPr>
-              <w:t>Environment manager</w:t>
+              <w:t>dc1, dc2; dc1-a</w:t>
+            </w:r>
+          </w:p>
+        </w:tc>
+        <w:tc>
+          <w:tcPr>
+            <w:tcW w:w="0" w:type="auto"/>
+            <w:tcBorders>
+              <w:top w:val="single" w:sz="6" w:space="0" w:color="8C8C8C"/>
+              <w:left w:val="single" w:sz="6" w:space="0" w:color="8C8C8C"/>
+              <w:bottom w:val="single" w:sz="6" w:space="0" w:color="8C8C8C"/>
+              <w:right w:val="single" w:sz="6" w:space="0" w:color="8C8C8C"/>
+            </w:tcBorders>
+            <w:tcMar>
+              <w:top w:w="60" w:type="dxa"/>
+              <w:left w:w="60" w:type="dxa"/>
+              <w:bottom w:w="60" w:type="dxa"/>
+              <w:right w:w="60" w:type="dxa"/>
+            </w:tcMar>
+            <w:hideMark/>
+          </w:tcPr>
+          <w:p>
+            <w:pPr>
+              <w:rPr>
+                <w:rFonts w:eastAsia="Times New Roman"/>
+                <w:sz w:val="18"/>
+                <w:szCs w:val="18"/>
+              </w:rPr>
+            </w:pPr>
+            <w:r>
+              <w:rPr>
+                <w:rFonts w:eastAsia="Times New Roman"/>
+                <w:sz w:val="18"/>
+                <w:szCs w:val="18"/>
+              </w:rPr>
+              <w:t>Environment manager. Reuse of the cloud convention for on-premises sites: location only (never a role such as DR), cloud.provider not set, value enforced by the collector stamp.</w:t>
             </w:r>
           </w:p>
         </w:tc>
@@ -19990,7 +20139,7 @@
           <w:rFonts w:eastAsia="Times New Roman"/>
         </w:rPr>
       </w:pPr>
-      <w:bookmarkStart w:id="24" w:name="_Toc243221397"/>
+      <w:bookmarkStart w:id="24" w:name="_Toc243225821"/>
       <w:r>
         <w:rPr>
           <w:rFonts w:eastAsia="Times New Roman"/>
@@ -20209,6 +20358,7 @@
                 <w:sz w:val="18"/>
                 <w:szCs w:val="18"/>
               </w:rPr>
+              <w:lastRenderedPageBreak/>
               <w:t>Kafka / Vert.x event bus</w:t>
             </w:r>
           </w:p>
@@ -20281,7 +20431,6 @@
                 <w:sz w:val="18"/>
                 <w:szCs w:val="18"/>
               </w:rPr>
-              <w:lastRenderedPageBreak/>
               <w:t>JMS (ABIS)</w:t>
             </w:r>
           </w:p>
@@ -20546,7 +20695,7 @@
           <w:rFonts w:eastAsia="Times New Roman"/>
         </w:rPr>
       </w:pPr>
-      <w:bookmarkStart w:id="25" w:name="_Toc243221398"/>
+      <w:bookmarkStart w:id="25" w:name="_Toc243225822"/>
       <w:r>
         <w:rPr>
           <w:rFonts w:eastAsia="Times New Roman"/>
@@ -21103,7 +21252,7 @@
           <w:rFonts w:eastAsia="Times New Roman"/>
         </w:rPr>
       </w:pPr>
-      <w:bookmarkStart w:id="26" w:name="_Toc243221399"/>
+      <w:bookmarkStart w:id="26" w:name="_Toc243225823"/>
       <w:r>
         <w:rPr>
           <w:rFonts w:eastAsia="Times New Roman"/>
@@ -21157,7 +21306,10 @@
         <w:pStyle w:val="PrformatHTML"/>
       </w:pPr>
       <w:r>
-        <w:t xml:space="preserve">  audit.json           audit DB rows and audit-tenant records</w:t>
+        <w:t xml:space="preserve">  audit.json   </w:t>
+      </w:r>
+      <w:r>
+        <w:t xml:space="preserve">        audit DB rows and audit-tenant records</w:t>
       </w:r>
     </w:p>
     <w:p>
@@ -21173,10 +21325,7 @@
         <w:pStyle w:val="PrformatHTML"/>
       </w:pPr>
       <w:r>
-        <w:t xml:space="preserve">  business.json  </w:t>
-      </w:r>
-      <w:r>
-        <w:t xml:space="preserve">      API responses and database states</w:t>
+        <w:t xml:space="preserve">  business.json        API responses and database states</w:t>
       </w:r>
     </w:p>
     <w:p>
@@ -21210,7 +21359,7 @@
           <w:rFonts w:eastAsia="Times New Roman"/>
         </w:rPr>
       </w:pPr>
-      <w:bookmarkStart w:id="27" w:name="_Toc243221400"/>
+      <w:bookmarkStart w:id="27" w:name="_Toc243225824"/>
       <w:r>
         <w:rPr>
           <w:rFonts w:eastAsia="Times New Roman"/>
@@ -21420,7 +21569,7 @@
           <w:rFonts w:eastAsia="Times New Roman"/>
         </w:rPr>
       </w:pPr>
-      <w:bookmarkStart w:id="28" w:name="_Toc243221401"/>
+      <w:bookmarkStart w:id="28" w:name="_Toc243225825"/>
       <w:r>
         <w:rPr>
           <w:rFonts w:eastAsia="Times New Roman"/>
@@ -21825,6 +21974,7 @@
                 <w:sz w:val="18"/>
                 <w:szCs w:val="18"/>
               </w:rPr>
+              <w:lastRenderedPageBreak/>
               <w:t>Log query</w:t>
             </w:r>
           </w:p>
@@ -21932,7 +22082,6 @@
                 <w:sz w:val="18"/>
                 <w:szCs w:val="18"/>
               </w:rPr>
-              <w:lastRenderedPageBreak/>
               <w:t>Metric query</w:t>
             </w:r>
           </w:p>
@@ -22337,7 +22486,7 @@
           <w:rFonts w:eastAsia="Times New Roman"/>
         </w:rPr>
       </w:pPr>
-      <w:bookmarkStart w:id="29" w:name="_Toc243221402"/>
+      <w:bookmarkStart w:id="29" w:name="_Toc243225826"/>
       <w:r>
         <w:rPr>
           <w:rFonts w:eastAsia="Times New Roman"/>
@@ -22368,7 +22517,7 @@
           <w:rFonts w:eastAsia="Times New Roman"/>
         </w:rPr>
       </w:pPr>
-      <w:bookmarkStart w:id="30" w:name="_Toc243221403"/>
+      <w:bookmarkStart w:id="30" w:name="_Toc243225827"/>
       <w:r>
         <w:rPr>
           <w:rFonts w:eastAsia="Times New Roman"/>
@@ -25009,7 +25158,7 @@
           <w:rFonts w:eastAsia="Times New Roman"/>
         </w:rPr>
       </w:pPr>
-      <w:bookmarkStart w:id="31" w:name="_Toc243221404"/>
+      <w:bookmarkStart w:id="31" w:name="_Toc243225828"/>
       <w:r>
         <w:rPr>
           <w:rFonts w:eastAsia="Times New Roman"/>
@@ -26792,7 +26941,7 @@
           <w:rFonts w:eastAsia="Times New Roman"/>
         </w:rPr>
       </w:pPr>
-      <w:bookmarkStart w:id="32" w:name="_Toc243221405"/>
+      <w:bookmarkStart w:id="32" w:name="_Toc243225829"/>
       <w:r>
         <w:rPr>
           <w:rFonts w:eastAsia="Times New Roman"/>
@@ -27575,7 +27724,7 @@
                 <w:sz w:val="18"/>
                 <w:szCs w:val="18"/>
               </w:rPr>
-              <w:t>Tenants per platform class (dev, test, int, perf) plus audit; every signal carries deployment.environment.name, k8s.cluster.name and acme.site.name stamped by the cluster collector.</w:t>
+              <w:t>Tenants per platform class (dev, test, int, perf) plus audit; every signal carries deployment.environment.name, k8s.cluster.name and cloud.region stamped by the cluster collector.</w:t>
             </w:r>
           </w:p>
         </w:tc>
@@ -29424,7 +29573,7 @@
           <w:rFonts w:eastAsia="Times New Roman"/>
         </w:rPr>
       </w:pPr>
-      <w:bookmarkStart w:id="33" w:name="_Toc243221406"/>
+      <w:bookmarkStart w:id="33" w:name="_Toc243225830"/>
       <w:r>
         <w:rPr>
           <w:rFonts w:eastAsia="Times New Roman"/>
@@ -31632,7 +31781,7 @@
           <w:rFonts w:eastAsia="Times New Roman"/>
         </w:rPr>
       </w:pPr>
-      <w:bookmarkStart w:id="34" w:name="_Toc243221407"/>
+      <w:bookmarkStart w:id="34" w:name="_Toc243225831"/>
       <w:r>
         <w:rPr>
           <w:rFonts w:eastAsia="Times New Roman"/>
@@ -32779,7 +32928,7 @@
           <w:rFonts w:eastAsia="Times New Roman"/>
         </w:rPr>
       </w:pPr>
-      <w:bookmarkStart w:id="35" w:name="_Toc243221408"/>
+      <w:bookmarkStart w:id="35" w:name="_Toc243225832"/>
       <w:r>
         <w:rPr>
           <w:rFonts w:eastAsia="Times New Roman"/>
@@ -34138,7 +34287,7 @@
           <w:rFonts w:eastAsia="Times New Roman"/>
         </w:rPr>
       </w:pPr>
-      <w:bookmarkStart w:id="36" w:name="_Toc243221409"/>
+      <w:bookmarkStart w:id="36" w:name="_Toc243225833"/>
       <w:r>
         <w:rPr>
           <w:rFonts w:eastAsia="Times New Roman"/>
@@ -35376,7 +35525,7 @@
           <w:rFonts w:eastAsia="Times New Roman"/>
         </w:rPr>
       </w:pPr>
-      <w:bookmarkStart w:id="37" w:name="_Toc243221410"/>
+      <w:bookmarkStart w:id="37" w:name="_Toc243225834"/>
       <w:r>
         <w:rPr>
           <w:rFonts w:eastAsia="Times New Roman"/>
@@ -35393,7 +35542,7 @@
           <w:rFonts w:eastAsia="Times New Roman"/>
         </w:rPr>
       </w:pPr>
-      <w:bookmarkStart w:id="38" w:name="_Toc243221411"/>
+      <w:bookmarkStart w:id="38" w:name="_Toc243225835"/>
       <w:r>
         <w:rPr>
           <w:rFonts w:eastAsia="Times New Roman"/>
@@ -36202,7 +36351,7 @@
           <w:rFonts w:eastAsia="Times New Roman"/>
         </w:rPr>
       </w:pPr>
-      <w:bookmarkStart w:id="39" w:name="_Toc243221412"/>
+      <w:bookmarkStart w:id="39" w:name="_Toc243225836"/>
       <w:r>
         <w:rPr>
           <w:rFonts w:eastAsia="Times New Roman"/>
@@ -36309,7 +36458,7 @@
           <w:rFonts w:eastAsia="Times New Roman"/>
         </w:rPr>
       </w:pPr>
-      <w:bookmarkStart w:id="40" w:name="_Toc243221413"/>
+      <w:bookmarkStart w:id="40" w:name="_Toc243225837"/>
       <w:r>
         <w:rPr>
           <w:rFonts w:eastAsia="Times New Roman"/>
@@ -37011,7 +37160,7 @@
           <w:rFonts w:eastAsia="Times New Roman"/>
         </w:rPr>
       </w:pPr>
-      <w:bookmarkStart w:id="41" w:name="_Toc243221414"/>
+      <w:bookmarkStart w:id="41" w:name="_Toc243225838"/>
       <w:r>
         <w:rPr>
           <w:rFonts w:eastAsia="Times New Roman"/>
@@ -37027,7 +37176,7 @@
           <w:rFonts w:eastAsia="Times New Roman"/>
         </w:rPr>
       </w:pPr>
-      <w:bookmarkStart w:id="42" w:name="_Toc243221415"/>
+      <w:bookmarkStart w:id="42" w:name="_Toc243225839"/>
       <w:r>
         <w:rPr>
           <w:rFonts w:eastAsia="Times New Roman"/>
@@ -37125,7 +37274,7 @@
       </w:pPr>
       <w:r>
         <w:lastRenderedPageBreak/>
-        <w:t xml:space="preserve">      acme.site.name: DC1                        # generated</w:t>
+        <w:t xml:space="preserve">      cloud.region: dc1                          # generated</w:t>
       </w:r>
     </w:p>
     <w:p>
@@ -37175,7 +37324,7 @@
           <w:rFonts w:eastAsia="Times New Roman"/>
         </w:rPr>
       </w:pPr>
-      <w:bookmarkStart w:id="43" w:name="_Toc243221416"/>
+      <w:bookmarkStart w:id="43" w:name="_Toc243225840"/>
       <w:r>
         <w:rPr>
           <w:rFonts w:eastAsia="Times New Roman"/>
@@ -37240,7 +37389,7 @@
         <w:pStyle w:val="PrformatHTML"/>
       </w:pPr>
       <w:r>
-        <w:t xml:space="preserve">      - { key: acme.site.name,              value: DC1, action: upsert }</w:t>
+        <w:t xml:space="preserve">      - { key: cloud.region,                value: dc1, action: upsert }</w:t>
       </w:r>
     </w:p>
     <w:p>
@@ -37274,7 +37423,7 @@
           <w:rFonts w:eastAsia="Times New Roman"/>
         </w:rPr>
       </w:pPr>
-      <w:bookmarkStart w:id="44" w:name="_Toc243221417"/>
+      <w:bookmarkStart w:id="44" w:name="_Toc243225841"/>
       <w:r>
         <w:rPr>
           <w:rFonts w:eastAsia="Times New Roman"/>
@@ -37366,7 +37515,7 @@
         <w:t xml:space="preserve">  </w:t>
       </w:r>
       <w:r>
-        <w:t>spanmetrics: { resource_metrics_key_attributes: [service.name, deployment.environment.name, acme.site.name] }</w:t>
+        <w:t>spanmetrics: { resource_metrics_key_attributes: [service.name, deployment.environment.name, cloud.region] }</w:t>
       </w:r>
     </w:p>
     <w:p>
@@ -37406,7 +37555,7 @@
           <w:rFonts w:eastAsia="Times New Roman"/>
         </w:rPr>
       </w:pPr>
-      <w:bookmarkStart w:id="45" w:name="_Toc243221418"/>
+      <w:bookmarkStart w:id="45" w:name="_Toc243225842"/>
       <w:r>
         <w:rPr>
           <w:rFonts w:eastAsia="Times New Roman"/>
@@ -37432,20 +37581,20 @@
           <w:rFonts w:eastAsia="Times New Roman"/>
           <w:szCs w:val="20"/>
         </w:rPr>
-        <w:t xml:space="preserve">Loki: OTLP index labels for </w:t>
+        <w:t xml:space="preserve">Loki: </w:t>
       </w:r>
       <w:r>
         <w:rPr>
           <w:rStyle w:val="CodeHTML"/>
         </w:rPr>
-        <w:t>acme.site.name</w:t>
+        <w:t>cloud.region</w:t>
       </w:r>
       <w:r>
         <w:rPr>
           <w:rFonts w:eastAsia="Times New Roman"/>
           <w:szCs w:val="20"/>
         </w:rPr>
-        <w:t xml:space="preserve">, </w:t>
+        <w:t xml:space="preserve"> is a default OTLP index label; add </w:t>
       </w:r>
       <w:r>
         <w:rPr>
@@ -37458,7 +37607,7 @@
           <w:rFonts w:eastAsia="Times New Roman"/>
           <w:szCs w:val="20"/>
         </w:rPr>
-        <w:t xml:space="preserve"> in addition to defaults; tenants app and audit; retention per platform.</w:t>
+        <w:t>; tenants app and audit; retention per platform.</w:t>
       </w:r>
     </w:p>
     <w:p>
@@ -37510,7 +37659,7 @@
         <w:rPr>
           <w:rStyle w:val="CodeHTML"/>
         </w:rPr>
-        <w:t>acme.site.name</w:t>
+        <w:t>cloud.region</w:t>
       </w:r>
       <w:r>
         <w:rPr>
@@ -37586,7 +37735,7 @@
           <w:rFonts w:eastAsia="Times New Roman"/>
         </w:rPr>
       </w:pPr>
-      <w:bookmarkStart w:id="46" w:name="_Toc243221419"/>
+      <w:bookmarkStart w:id="46" w:name="_Toc243225843"/>
       <w:r>
         <w:rPr>
           <w:rFonts w:eastAsia="Times New Roman"/>
@@ -37628,7 +37777,7 @@
           <w:rFonts w:eastAsia="Times New Roman"/>
         </w:rPr>
       </w:pPr>
-      <w:bookmarkStart w:id="47" w:name="_Toc243221420"/>
+      <w:bookmarkStart w:id="47" w:name="_Toc243225844"/>
       <w:r>
         <w:rPr>
           <w:rFonts w:eastAsia="Times New Roman"/>
@@ -37685,7 +37834,7 @@
           <w:rFonts w:eastAsia="Times New Roman"/>
         </w:rPr>
       </w:pPr>
-      <w:bookmarkStart w:id="48" w:name="_Toc243221421"/>
+      <w:bookmarkStart w:id="48" w:name="_Toc243225845"/>
       <w:r>
         <w:rPr>
           <w:rFonts w:eastAsia="Times New Roman"/>
@@ -38168,7 +38317,7 @@
           <w:rFonts w:eastAsia="Times New Roman"/>
         </w:rPr>
       </w:pPr>
-      <w:bookmarkStart w:id="49" w:name="_Toc243221422"/>
+      <w:bookmarkStart w:id="49" w:name="_Toc243225846"/>
       <w:r>
         <w:rPr>
           <w:rFonts w:eastAsia="Times New Roman"/>
@@ -38185,7 +38334,7 @@
           <w:rFonts w:eastAsia="Times New Roman"/>
         </w:rPr>
       </w:pPr>
-      <w:bookmarkStart w:id="50" w:name="_Toc243221423"/>
+      <w:bookmarkStart w:id="50" w:name="_Toc243225847"/>
       <w:r>
         <w:rPr>
           <w:rFonts w:eastAsia="Times New Roman"/>
@@ -38299,7 +38448,7 @@
           <w:rFonts w:eastAsia="Times New Roman"/>
         </w:rPr>
       </w:pPr>
-      <w:bookmarkStart w:id="51" w:name="_Toc243221424"/>
+      <w:bookmarkStart w:id="51" w:name="_Toc243225848"/>
       <w:r>
         <w:rPr>
           <w:rFonts w:eastAsia="Times New Roman"/>
@@ -38854,7 +39003,7 @@
           <w:rFonts w:eastAsia="Times New Roman"/>
         </w:rPr>
       </w:pPr>
-      <w:bookmarkStart w:id="52" w:name="_Toc243221425"/>
+      <w:bookmarkStart w:id="52" w:name="_Toc243225849"/>
       <w:r>
         <w:rPr>
           <w:rFonts w:eastAsia="Times New Roman"/>
@@ -38970,7 +39119,7 @@
           <w:rFonts w:eastAsia="Times New Roman"/>
         </w:rPr>
       </w:pPr>
-      <w:bookmarkStart w:id="53" w:name="_Toc243221426"/>
+      <w:bookmarkStart w:id="53" w:name="_Toc243225850"/>
       <w:r>
         <w:rPr>
           <w:rFonts w:eastAsia="Times New Roman"/>
@@ -39886,7 +40035,7 @@
           <w:rFonts w:eastAsia="Times New Roman"/>
         </w:rPr>
       </w:pPr>
-      <w:bookmarkStart w:id="54" w:name="_Toc243221427"/>
+      <w:bookmarkStart w:id="54" w:name="_Toc243225851"/>
       <w:r>
         <w:rPr>
           <w:rFonts w:eastAsia="Times New Roman"/>
@@ -39923,7 +40072,7 @@
           <w:rFonts w:eastAsia="Times New Roman"/>
         </w:rPr>
       </w:pPr>
-      <w:bookmarkStart w:id="55" w:name="_Toc243221428"/>
+      <w:bookmarkStart w:id="55" w:name="_Toc243225852"/>
       <w:r>
         <w:rPr>
           <w:rFonts w:eastAsia="Times New Roman"/>
@@ -39953,7 +40102,7 @@
           <w:rFonts w:eastAsia="Times New Roman"/>
         </w:rPr>
       </w:pPr>
-      <w:bookmarkStart w:id="56" w:name="_Toc243221429"/>
+      <w:bookmarkStart w:id="56" w:name="_Toc243225853"/>
       <w:r>
         <w:rPr>
           <w:rFonts w:eastAsia="Times New Roman"/>
@@ -39970,7 +40119,7 @@
           <w:rFonts w:eastAsia="Times New Roman"/>
         </w:rPr>
       </w:pPr>
-      <w:bookmarkStart w:id="57" w:name="_Toc243221430"/>
+      <w:bookmarkStart w:id="57" w:name="_Toc243225854"/>
       <w:r>
         <w:rPr>
           <w:rFonts w:eastAsia="Times New Roman"/>
@@ -40012,7 +40161,7 @@
           <w:rFonts w:eastAsia="Times New Roman"/>
         </w:rPr>
       </w:pPr>
-      <w:bookmarkStart w:id="58" w:name="_Toc243221431"/>
+      <w:bookmarkStart w:id="58" w:name="_Toc243225855"/>
       <w:r>
         <w:rPr>
           <w:rFonts w:eastAsia="Times New Roman"/>
@@ -40054,7 +40203,7 @@
           <w:rFonts w:eastAsia="Times New Roman"/>
         </w:rPr>
       </w:pPr>
-      <w:bookmarkStart w:id="59" w:name="_Toc243221432"/>
+      <w:bookmarkStart w:id="59" w:name="_Toc243225856"/>
       <w:r>
         <w:rPr>
           <w:rFonts w:eastAsia="Times New Roman"/>
@@ -42468,7 +42617,7 @@
           <w:rFonts w:eastAsia="Times New Roman"/>
         </w:rPr>
       </w:pPr>
-      <w:bookmarkStart w:id="60" w:name="_Toc243221433"/>
+      <w:bookmarkStart w:id="60" w:name="_Toc243225857"/>
       <w:r>
         <w:rPr>
           <w:rFonts w:eastAsia="Times New Roman"/>
@@ -43492,7 +43641,7 @@
           <w:rFonts w:eastAsia="Times New Roman"/>
         </w:rPr>
       </w:pPr>
-      <w:bookmarkStart w:id="61" w:name="_Toc243221434"/>
+      <w:bookmarkStart w:id="61" w:name="_Toc243225858"/>
       <w:r>
         <w:rPr>
           <w:rFonts w:eastAsia="Times New Roman"/>
@@ -43508,7 +43657,7 @@
           <w:rFonts w:eastAsia="Times New Roman"/>
         </w:rPr>
       </w:pPr>
-      <w:bookmarkStart w:id="62" w:name="_Toc243221435"/>
+      <w:bookmarkStart w:id="62" w:name="_Toc243225859"/>
       <w:r>
         <w:rPr>
           <w:rFonts w:eastAsia="Times New Roman"/>
@@ -43590,7 +43739,7 @@
           <w:rFonts w:eastAsia="Times New Roman"/>
         </w:rPr>
       </w:pPr>
-      <w:bookmarkStart w:id="63" w:name="_Toc243221436"/>
+      <w:bookmarkStart w:id="63" w:name="_Toc243225860"/>
       <w:r>
         <w:rPr>
           <w:rFonts w:eastAsia="Times New Roman"/>
@@ -45148,7 +45297,7 @@
           <w:rFonts w:eastAsia="Times New Roman"/>
         </w:rPr>
       </w:pPr>
-      <w:bookmarkStart w:id="64" w:name="_Toc243221437"/>
+      <w:bookmarkStart w:id="64" w:name="_Toc243225861"/>
       <w:r>
         <w:rPr>
           <w:rFonts w:eastAsia="Times New Roman"/>
@@ -46289,7 +46438,7 @@
           <w:rFonts w:eastAsia="Times New Roman"/>
         </w:rPr>
       </w:pPr>
-      <w:bookmarkStart w:id="65" w:name="_Toc243221438"/>
+      <w:bookmarkStart w:id="65" w:name="_Toc243225862"/>
       <w:r>
         <w:rPr>
           <w:rFonts w:eastAsia="Times New Roman"/>
@@ -46311,7 +46460,7 @@
         <w:pStyle w:val="PrformatHTML"/>
       </w:pPr>
       <w:r>
-        <w:t xml:space="preserve">  resource: { service.name: idgenerator, acme.site.name: ${env.site} }</w:t>
+        <w:t xml:space="preserve">  resource: { service.name: idgenerator, cloud.region: ${env.site} }</w:t>
       </w:r>
     </w:p>
     <w:p>
@@ -46427,7 +46576,7 @@
           <w:rFonts w:eastAsia="Times New Roman"/>
         </w:rPr>
       </w:pPr>
-      <w:bookmarkStart w:id="66" w:name="_Toc243221439"/>
+      <w:bookmarkStart w:id="66" w:name="_Toc243225863"/>
       <w:r>
         <w:rPr>
           <w:rFonts w:eastAsia="Times New Roman"/>
@@ -46457,7 +46606,7 @@
           <w:rFonts w:eastAsia="Times New Roman"/>
         </w:rPr>
       </w:pPr>
-      <w:bookmarkStart w:id="67" w:name="_Toc243221440"/>
+      <w:bookmarkStart w:id="67" w:name="_Toc243225864"/>
       <w:r>
         <w:rPr>
           <w:rFonts w:eastAsia="Times New Roman"/>
@@ -46505,7 +46654,7 @@
           <w:rFonts w:eastAsia="Times New Roman"/>
         </w:rPr>
       </w:pPr>
-      <w:bookmarkStart w:id="68" w:name="_Toc243221441"/>
+      <w:bookmarkStart w:id="68" w:name="_Toc243225865"/>
       <w:r>
         <w:rPr>
           <w:rFonts w:eastAsia="Times New Roman"/>
@@ -46522,7 +46671,7 @@
           <w:rFonts w:eastAsia="Times New Roman"/>
         </w:rPr>
       </w:pPr>
-      <w:bookmarkStart w:id="69" w:name="_Toc243221442"/>
+      <w:bookmarkStart w:id="69" w:name="_Toc243225866"/>
       <w:r>
         <w:rPr>
           <w:rFonts w:eastAsia="Times New Roman"/>
@@ -47029,15 +47178,7 @@
                 <w:sz w:val="18"/>
                 <w:szCs w:val="18"/>
               </w:rPr>
-              <w:t>Compromis</w:t>
-            </w:r>
-            <w:r>
-              <w:rPr>
-                <w:rFonts w:eastAsia="Times New Roman"/>
-                <w:sz w:val="18"/>
-                <w:szCs w:val="18"/>
-              </w:rPr>
-              <w:t>ed images or agents</w:t>
+              <w:t>Compromised images or agents</w:t>
             </w:r>
           </w:p>
         </w:tc>
@@ -47157,7 +47298,7 @@
           <w:rFonts w:eastAsia="Times New Roman"/>
         </w:rPr>
       </w:pPr>
-      <w:bookmarkStart w:id="70" w:name="_Toc243221443"/>
+      <w:bookmarkStart w:id="70" w:name="_Toc243225867"/>
       <w:r>
         <w:rPr>
           <w:rFonts w:eastAsia="Times New Roman"/>
@@ -47187,7 +47328,7 @@
           <w:rFonts w:eastAsia="Times New Roman"/>
         </w:rPr>
       </w:pPr>
-      <w:bookmarkStart w:id="71" w:name="_Toc243221444"/>
+      <w:bookmarkStart w:id="71" w:name="_Toc243225868"/>
       <w:r>
         <w:rPr>
           <w:rFonts w:eastAsia="Times New Roman"/>
@@ -47284,7 +47425,7 @@
           <w:rFonts w:eastAsia="Times New Roman"/>
         </w:rPr>
       </w:pPr>
-      <w:bookmarkStart w:id="72" w:name="_Toc243221445"/>
+      <w:bookmarkStart w:id="72" w:name="_Toc243225869"/>
       <w:r>
         <w:rPr>
           <w:rFonts w:eastAsia="Times New Roman"/>
@@ -54185,7 +54326,7 @@
           <w:rFonts w:eastAsia="Times New Roman"/>
         </w:rPr>
       </w:pPr>
-      <w:bookmarkStart w:id="73" w:name="_Toc243221446"/>
+      <w:bookmarkStart w:id="73" w:name="_Toc243225870"/>
       <w:r>
         <w:rPr>
           <w:rFonts w:eastAsia="Times New Roman"/>
@@ -54813,7 +54954,7 @@
           <w:rFonts w:eastAsia="Times New Roman"/>
         </w:rPr>
       </w:pPr>
-      <w:bookmarkStart w:id="74" w:name="_Toc243221447"/>
+      <w:bookmarkStart w:id="74" w:name="_Toc243225871"/>
       <w:r>
         <w:rPr>
           <w:rFonts w:eastAsia="Times New Roman"/>
@@ -55770,7 +55911,7 @@
       <w:rPr>
         <w:sz w:val="16"/>
       </w:rPr>
-      <w:t>Observability and Audit Evidence Framework Specification  |  OAEF-SPEC-001 v0.1 Draft</w:t>
+      <w:t>Observability and Audit Evidence Framework Specification  |  OAEF-SPEC-001 v0.2 Draft</w:t>
     </w:r>
   </w:p>
 </w:hdr>
@@ -55789,9 +55930,9 @@
 <file path=word/numbering.xml><?xml version="1.0" encoding="utf-8"?>
 <w:numbering xmlns:wpc="http://schemas.microsoft.com/office/word/2010/wordprocessingCanvas" xmlns:cx="http://schemas.microsoft.com/office/drawing/2014/chartex" xmlns:cx1="http://schemas.microsoft.com/office/drawing/2015/9/8/chartex" xmlns:cx2="http://schemas.microsoft.com/office/drawing/2015/10/21/chartex" xmlns:cx3="http://schemas.microsoft.com/office/drawing/2016/5/9/chartex" xmlns:cx4="http://schemas.microsoft.com/office/drawing/2016/5/10/chartex" xmlns:cx5="http://schemas.microsoft.com/office/drawing/2016/5/11/chartex" xmlns:cx6="http://schemas.microsoft.com/office/drawing/2016/5/12/chartex" xmlns:cx7="http://schemas.microsoft.com/office/drawing/2016/5/13/chartex" xmlns:cx8="http://schemas.microsoft.com/office/drawing/2016/5/14/chartex" xmlns:mc="http://schemas.openxmlformats.org/markup-compatibility/2006" xmlns:aink="http://schemas.microsoft.com/office/drawing/2016/ink" xmlns:am3d="http://schemas.microsoft.com/office/drawing/2017/model3d" xmlns:o="urn:schemas-microsoft-com:office:office" xmlns:oel="http://schemas.microsoft.com/office/2019/extlst" xmlns:r="http://schemas.openxmlformats.org/officeDocument/2006/relationships" xmlns:m="http://schemas.openxmlformats.org/officeDocument/2006/math" xmlns:v="urn:schemas-microsoft-com:vml" xmlns:wp14="http://schemas.microsoft.com/office/word/2010/wordprocessingDrawing" xmlns:wp="http://schemas.openxmlformats.org/drawingml/2006/wordprocessingDrawing" xmlns:w10="urn:schemas-microsoft-com:office:word" xmlns:w="http://schemas.openxmlformats.org/wordprocessingml/2006/main" xmlns:w14="http://schemas.microsoft.com/office/word/2010/wordml" xmlns:w15="http://schemas.microsoft.com/office/word/2012/wordml" xmlns:w16cex="http://schemas.microsoft.com/office/word/2018/wordml/cex" xmlns:w16cid="http://schemas.microsoft.com/office/word/2016/wordml/cid" xmlns:w16="http://schemas.microsoft.com/office/word/2018/wordml" xmlns:w16du="http://schemas.microsoft.com/office/word/2023/wordml/word16du" xmlns:w16sdtdh="http://schemas.microsoft.com/office/word/2020/wordml/sdtdatahash" xmlns:w16sdtfl="http://schemas.microsoft.com/office/word/2024/wordml/sdtformatlock" xmlns:w16se="http://schemas.microsoft.com/office/word/2015/wordml/symex" xmlns:wpg="http://schemas.microsoft.com/office/word/2010/wordprocessingGroup" xmlns:wpi="http://schemas.microsoft.com/office/word/2010/wordprocessingInk" xmlns:wne="http://schemas.microsoft.com/office/word/2006/wordml" xmlns:wps="http://schemas.microsoft.com/office/word/2010/wordprocessingShape" mc:Ignorable="w14 w15 w16se w16cid w16 w16cex w16sdtdh w16sdtfl w16du wp14">
   <w:abstractNum w:abstractNumId="0" w15:restartNumberingAfterBreak="0">
-    <w:nsid w:val="0CDB60A8"/>
+    <w:nsid w:val="172C26AC"/>
     <w:multiLevelType w:val="multilevel"/>
-    <w:tmpl w:val="BFACD2D2"/>
+    <w:tmpl w:val="9200959C"/>
     <w:lvl w:ilvl="0">
       <w:start w:val="1"/>
       <w:numFmt w:val="bullet"/>
@@ -55938,9 +56079,9 @@
     </w:lvl>
   </w:abstractNum>
   <w:abstractNum w:abstractNumId="1" w15:restartNumberingAfterBreak="0">
-    <w:nsid w:val="0E0A3923"/>
+    <w:nsid w:val="18984199"/>
     <w:multiLevelType w:val="multilevel"/>
-    <w:tmpl w:val="6A7A232E"/>
+    <w:tmpl w:val="868E6204"/>
     <w:lvl w:ilvl="0">
       <w:start w:val="1"/>
       <w:numFmt w:val="bullet"/>
@@ -56087,9 +56228,9 @@
     </w:lvl>
   </w:abstractNum>
   <w:abstractNum w:abstractNumId="2" w15:restartNumberingAfterBreak="0">
-    <w:nsid w:val="261708B7"/>
+    <w:nsid w:val="1A903E6C"/>
     <w:multiLevelType w:val="multilevel"/>
-    <w:tmpl w:val="2350FDF0"/>
+    <w:tmpl w:val="F588F086"/>
     <w:lvl w:ilvl="0">
       <w:start w:val="1"/>
       <w:numFmt w:val="bullet"/>
@@ -56236,9 +56377,9 @@
     </w:lvl>
   </w:abstractNum>
   <w:abstractNum w:abstractNumId="3" w15:restartNumberingAfterBreak="0">
-    <w:nsid w:val="26AF41C2"/>
+    <w:nsid w:val="1D5449D4"/>
     <w:multiLevelType w:val="multilevel"/>
-    <w:tmpl w:val="D92E34AC"/>
+    <w:tmpl w:val="36EAFE32"/>
     <w:lvl w:ilvl="0">
       <w:start w:val="1"/>
       <w:numFmt w:val="bullet"/>
@@ -56385,13 +56526,13 @@
     </w:lvl>
   </w:abstractNum>
   <w:abstractNum w:abstractNumId="4" w15:restartNumberingAfterBreak="0">
-    <w:nsid w:val="2DCB10F1"/>
+    <w:nsid w:val="1DC07FD8"/>
     <w:multiLevelType w:val="multilevel"/>
-    <w:tmpl w:val="4E2AF3B2"/>
+    <w:tmpl w:val="BF2458AC"/>
     <w:lvl w:ilvl="0">
       <w:start w:val="1"/>
-      <w:numFmt w:val="decimal"/>
-      <w:lvlText w:val="%1."/>
+      <w:numFmt w:val="bullet"/>
+      <w:lvlText w:val=""/>
       <w:lvlJc w:val="left"/>
       <w:pPr>
         <w:tabs>
@@ -56399,11 +56540,15 @@
         </w:tabs>
         <w:ind w:left="720" w:hanging="360"/>
       </w:pPr>
+      <w:rPr>
+        <w:rFonts w:ascii="Symbol" w:hAnsi="Symbol" w:hint="default"/>
+        <w:sz w:val="20"/>
+      </w:rPr>
     </w:lvl>
     <w:lvl w:ilvl="1" w:tentative="1">
       <w:start w:val="1"/>
-      <w:numFmt w:val="decimal"/>
-      <w:lvlText w:val="%2."/>
+      <w:numFmt w:val="bullet"/>
+      <w:lvlText w:val="o"/>
       <w:lvlJc w:val="left"/>
       <w:pPr>
         <w:tabs>
@@ -56411,11 +56556,15 @@
         </w:tabs>
         <w:ind w:left="1440" w:hanging="360"/>
       </w:pPr>
+      <w:rPr>
+        <w:rFonts w:ascii="Courier New" w:hAnsi="Courier New" w:hint="default"/>
+        <w:sz w:val="20"/>
+      </w:rPr>
     </w:lvl>
     <w:lvl w:ilvl="2" w:tentative="1">
       <w:start w:val="1"/>
-      <w:numFmt w:val="decimal"/>
-      <w:lvlText w:val="%3."/>
+      <w:numFmt w:val="bullet"/>
+      <w:lvlText w:val=""/>
       <w:lvlJc w:val="left"/>
       <w:pPr>
         <w:tabs>
@@ -56423,11 +56572,15 @@
         </w:tabs>
         <w:ind w:left="2160" w:hanging="360"/>
       </w:pPr>
+      <w:rPr>
+        <w:rFonts w:ascii="Wingdings" w:hAnsi="Wingdings" w:hint="default"/>
+        <w:sz w:val="20"/>
+      </w:rPr>
     </w:lvl>
     <w:lvl w:ilvl="3" w:tentative="1">
       <w:start w:val="1"/>
-      <w:numFmt w:val="decimal"/>
-      <w:lvlText w:val="%4."/>
+      <w:numFmt w:val="bullet"/>
+      <w:lvlText w:val=""/>
       <w:lvlJc w:val="left"/>
       <w:pPr>
         <w:tabs>
@@ -56435,11 +56588,15 @@
         </w:tabs>
         <w:ind w:left="2880" w:hanging="360"/>
       </w:pPr>
+      <w:rPr>
+        <w:rFonts w:ascii="Wingdings" w:hAnsi="Wingdings" w:hint="default"/>
+        <w:sz w:val="20"/>
+      </w:rPr>
     </w:lvl>
     <w:lvl w:ilvl="4" w:tentative="1">
       <w:start w:val="1"/>
-      <w:numFmt w:val="decimal"/>
-      <w:lvlText w:val="%5."/>
+      <w:numFmt w:val="bullet"/>
+      <w:lvlText w:val=""/>
       <w:lvlJc w:val="left"/>
       <w:pPr>
         <w:tabs>
@@ -56447,11 +56604,15 @@
         </w:tabs>
         <w:ind w:left="3600" w:hanging="360"/>
       </w:pPr>
+      <w:rPr>
+        <w:rFonts w:ascii="Wingdings" w:hAnsi="Wingdings" w:hint="default"/>
+        <w:sz w:val="20"/>
+      </w:rPr>
     </w:lvl>
     <w:lvl w:ilvl="5" w:tentative="1">
       <w:start w:val="1"/>
-      <w:numFmt w:val="decimal"/>
-      <w:lvlText w:val="%6."/>
+      <w:numFmt w:val="bullet"/>
+      <w:lvlText w:val=""/>
       <w:lvlJc w:val="left"/>
       <w:pPr>
         <w:tabs>
@@ -56459,11 +56620,15 @@
         </w:tabs>
         <w:ind w:left="4320" w:hanging="360"/>
       </w:pPr>
+      <w:rPr>
+        <w:rFonts w:ascii="Wingdings" w:hAnsi="Wingdings" w:hint="default"/>
+        <w:sz w:val="20"/>
+      </w:rPr>
     </w:lvl>
     <w:lvl w:ilvl="6" w:tentative="1">
       <w:start w:val="1"/>
-      <w:numFmt w:val="decimal"/>
-      <w:lvlText w:val="%7."/>
+      <w:numFmt w:val="bullet"/>
+      <w:lvlText w:val=""/>
       <w:lvlJc w:val="left"/>
       <w:pPr>
         <w:tabs>
@@ -56471,11 +56636,15 @@
         </w:tabs>
         <w:ind w:left="5040" w:hanging="360"/>
       </w:pPr>
+      <w:rPr>
+        <w:rFonts w:ascii="Wingdings" w:hAnsi="Wingdings" w:hint="default"/>
+        <w:sz w:val="20"/>
+      </w:rPr>
     </w:lvl>
     <w:lvl w:ilvl="7" w:tentative="1">
       <w:start w:val="1"/>
-      <w:numFmt w:val="decimal"/>
-      <w:lvlText w:val="%8."/>
+      <w:numFmt w:val="bullet"/>
+      <w:lvlText w:val=""/>
       <w:lvlJc w:val="left"/>
       <w:pPr>
         <w:tabs>
@@ -56483,11 +56652,15 @@
         </w:tabs>
         <w:ind w:left="5760" w:hanging="360"/>
       </w:pPr>
+      <w:rPr>
+        <w:rFonts w:ascii="Wingdings" w:hAnsi="Wingdings" w:hint="default"/>
+        <w:sz w:val="20"/>
+      </w:rPr>
     </w:lvl>
     <w:lvl w:ilvl="8" w:tentative="1">
       <w:start w:val="1"/>
-      <w:numFmt w:val="decimal"/>
-      <w:lvlText w:val="%9."/>
+      <w:numFmt w:val="bullet"/>
+      <w:lvlText w:val=""/>
       <w:lvlJc w:val="left"/>
       <w:pPr>
         <w:tabs>
@@ -56495,12 +56668,16 @@
         </w:tabs>
         <w:ind w:left="6480" w:hanging="360"/>
       </w:pPr>
+      <w:rPr>
+        <w:rFonts w:ascii="Wingdings" w:hAnsi="Wingdings" w:hint="default"/>
+        <w:sz w:val="20"/>
+      </w:rPr>
     </w:lvl>
   </w:abstractNum>
   <w:abstractNum w:abstractNumId="5" w15:restartNumberingAfterBreak="0">
-    <w:nsid w:val="380C58F9"/>
+    <w:nsid w:val="2921231D"/>
     <w:multiLevelType w:val="multilevel"/>
-    <w:tmpl w:val="0600A9BA"/>
+    <w:tmpl w:val="9B32584C"/>
     <w:lvl w:ilvl="0">
       <w:start w:val="1"/>
       <w:numFmt w:val="bullet"/>
@@ -56647,122 +56824,9 @@
     </w:lvl>
   </w:abstractNum>
   <w:abstractNum w:abstractNumId="6" w15:restartNumberingAfterBreak="0">
-    <w:nsid w:val="3CB22685"/>
+    <w:nsid w:val="2ACE507D"/>
     <w:multiLevelType w:val="multilevel"/>
-    <w:tmpl w:val="0B5C0542"/>
-    <w:lvl w:ilvl="0">
-      <w:start w:val="1"/>
-      <w:numFmt w:val="decimal"/>
-      <w:lvlText w:val="%1."/>
-      <w:lvlJc w:val="left"/>
-      <w:pPr>
-        <w:tabs>
-          <w:tab w:val="num" w:pos="720"/>
-        </w:tabs>
-        <w:ind w:left="720" w:hanging="360"/>
-      </w:pPr>
-    </w:lvl>
-    <w:lvl w:ilvl="1" w:tentative="1">
-      <w:start w:val="1"/>
-      <w:numFmt w:val="decimal"/>
-      <w:lvlText w:val="%2."/>
-      <w:lvlJc w:val="left"/>
-      <w:pPr>
-        <w:tabs>
-          <w:tab w:val="num" w:pos="1440"/>
-        </w:tabs>
-        <w:ind w:left="1440" w:hanging="360"/>
-      </w:pPr>
-    </w:lvl>
-    <w:lvl w:ilvl="2" w:tentative="1">
-      <w:start w:val="1"/>
-      <w:numFmt w:val="decimal"/>
-      <w:lvlText w:val="%3."/>
-      <w:lvlJc w:val="left"/>
-      <w:pPr>
-        <w:tabs>
-          <w:tab w:val="num" w:pos="2160"/>
-        </w:tabs>
-        <w:ind w:left="2160" w:hanging="360"/>
-      </w:pPr>
-    </w:lvl>
-    <w:lvl w:ilvl="3" w:tentative="1">
-      <w:start w:val="1"/>
-      <w:numFmt w:val="decimal"/>
-      <w:lvlText w:val="%4."/>
-      <w:lvlJc w:val="left"/>
-      <w:pPr>
-        <w:tabs>
-          <w:tab w:val="num" w:pos="2880"/>
-        </w:tabs>
-        <w:ind w:left="2880" w:hanging="360"/>
-      </w:pPr>
-    </w:lvl>
-    <w:lvl w:ilvl="4" w:tentative="1">
-      <w:start w:val="1"/>
-      <w:numFmt w:val="decimal"/>
-      <w:lvlText w:val="%5."/>
-      <w:lvlJc w:val="left"/>
-      <w:pPr>
-        <w:tabs>
-          <w:tab w:val="num" w:pos="3600"/>
-        </w:tabs>
-        <w:ind w:left="3600" w:hanging="360"/>
-      </w:pPr>
-    </w:lvl>
-    <w:lvl w:ilvl="5" w:tentative="1">
-      <w:start w:val="1"/>
-      <w:numFmt w:val="decimal"/>
-      <w:lvlText w:val="%6."/>
-      <w:lvlJc w:val="left"/>
-      <w:pPr>
-        <w:tabs>
-          <w:tab w:val="num" w:pos="4320"/>
-        </w:tabs>
-        <w:ind w:left="4320" w:hanging="360"/>
-      </w:pPr>
-    </w:lvl>
-    <w:lvl w:ilvl="6" w:tentative="1">
-      <w:start w:val="1"/>
-      <w:numFmt w:val="decimal"/>
-      <w:lvlText w:val="%7."/>
-      <w:lvlJc w:val="left"/>
-      <w:pPr>
-        <w:tabs>
-          <w:tab w:val="num" w:pos="5040"/>
-        </w:tabs>
-        <w:ind w:left="5040" w:hanging="360"/>
-      </w:pPr>
-    </w:lvl>
-    <w:lvl w:ilvl="7" w:tentative="1">
-      <w:start w:val="1"/>
-      <w:numFmt w:val="decimal"/>
-      <w:lvlText w:val="%8."/>
-      <w:lvlJc w:val="left"/>
-      <w:pPr>
-        <w:tabs>
-          <w:tab w:val="num" w:pos="5760"/>
-        </w:tabs>
-        <w:ind w:left="5760" w:hanging="360"/>
-      </w:pPr>
-    </w:lvl>
-    <w:lvl w:ilvl="8" w:tentative="1">
-      <w:start w:val="1"/>
-      <w:numFmt w:val="decimal"/>
-      <w:lvlText w:val="%9."/>
-      <w:lvlJc w:val="left"/>
-      <w:pPr>
-        <w:tabs>
-          <w:tab w:val="num" w:pos="6480"/>
-        </w:tabs>
-        <w:ind w:left="6480" w:hanging="360"/>
-      </w:pPr>
-    </w:lvl>
-  </w:abstractNum>
-  <w:abstractNum w:abstractNumId="7" w15:restartNumberingAfterBreak="0">
-    <w:nsid w:val="54E3532D"/>
-    <w:multiLevelType w:val="multilevel"/>
-    <w:tmpl w:val="D9EA9062"/>
+    <w:tmpl w:val="15605392"/>
     <w:lvl w:ilvl="0">
       <w:start w:val="1"/>
       <w:numFmt w:val="bullet"/>
@@ -56908,10 +56972,123 @@
       </w:rPr>
     </w:lvl>
   </w:abstractNum>
+  <w:abstractNum w:abstractNumId="7" w15:restartNumberingAfterBreak="0">
+    <w:nsid w:val="44DD075F"/>
+    <w:multiLevelType w:val="multilevel"/>
+    <w:tmpl w:val="E8386DA6"/>
+    <w:lvl w:ilvl="0">
+      <w:start w:val="1"/>
+      <w:numFmt w:val="decimal"/>
+      <w:lvlText w:val="%1."/>
+      <w:lvlJc w:val="left"/>
+      <w:pPr>
+        <w:tabs>
+          <w:tab w:val="num" w:pos="720"/>
+        </w:tabs>
+        <w:ind w:left="720" w:hanging="360"/>
+      </w:pPr>
+    </w:lvl>
+    <w:lvl w:ilvl="1" w:tentative="1">
+      <w:start w:val="1"/>
+      <w:numFmt w:val="decimal"/>
+      <w:lvlText w:val="%2."/>
+      <w:lvlJc w:val="left"/>
+      <w:pPr>
+        <w:tabs>
+          <w:tab w:val="num" w:pos="1440"/>
+        </w:tabs>
+        <w:ind w:left="1440" w:hanging="360"/>
+      </w:pPr>
+    </w:lvl>
+    <w:lvl w:ilvl="2" w:tentative="1">
+      <w:start w:val="1"/>
+      <w:numFmt w:val="decimal"/>
+      <w:lvlText w:val="%3."/>
+      <w:lvlJc w:val="left"/>
+      <w:pPr>
+        <w:tabs>
+          <w:tab w:val="num" w:pos="2160"/>
+        </w:tabs>
+        <w:ind w:left="2160" w:hanging="360"/>
+      </w:pPr>
+    </w:lvl>
+    <w:lvl w:ilvl="3" w:tentative="1">
+      <w:start w:val="1"/>
+      <w:numFmt w:val="decimal"/>
+      <w:lvlText w:val="%4."/>
+      <w:lvlJc w:val="left"/>
+      <w:pPr>
+        <w:tabs>
+          <w:tab w:val="num" w:pos="2880"/>
+        </w:tabs>
+        <w:ind w:left="2880" w:hanging="360"/>
+      </w:pPr>
+    </w:lvl>
+    <w:lvl w:ilvl="4" w:tentative="1">
+      <w:start w:val="1"/>
+      <w:numFmt w:val="decimal"/>
+      <w:lvlText w:val="%5."/>
+      <w:lvlJc w:val="left"/>
+      <w:pPr>
+        <w:tabs>
+          <w:tab w:val="num" w:pos="3600"/>
+        </w:tabs>
+        <w:ind w:left="3600" w:hanging="360"/>
+      </w:pPr>
+    </w:lvl>
+    <w:lvl w:ilvl="5" w:tentative="1">
+      <w:start w:val="1"/>
+      <w:numFmt w:val="decimal"/>
+      <w:lvlText w:val="%6."/>
+      <w:lvlJc w:val="left"/>
+      <w:pPr>
+        <w:tabs>
+          <w:tab w:val="num" w:pos="4320"/>
+        </w:tabs>
+        <w:ind w:left="4320" w:hanging="360"/>
+      </w:pPr>
+    </w:lvl>
+    <w:lvl w:ilvl="6" w:tentative="1">
+      <w:start w:val="1"/>
+      <w:numFmt w:val="decimal"/>
+      <w:lvlText w:val="%7."/>
+      <w:lvlJc w:val="left"/>
+      <w:pPr>
+        <w:tabs>
+          <w:tab w:val="num" w:pos="5040"/>
+        </w:tabs>
+        <w:ind w:left="5040" w:hanging="360"/>
+      </w:pPr>
+    </w:lvl>
+    <w:lvl w:ilvl="7" w:tentative="1">
+      <w:start w:val="1"/>
+      <w:numFmt w:val="decimal"/>
+      <w:lvlText w:val="%8."/>
+      <w:lvlJc w:val="left"/>
+      <w:pPr>
+        <w:tabs>
+          <w:tab w:val="num" w:pos="5760"/>
+        </w:tabs>
+        <w:ind w:left="5760" w:hanging="360"/>
+      </w:pPr>
+    </w:lvl>
+    <w:lvl w:ilvl="8" w:tentative="1">
+      <w:start w:val="1"/>
+      <w:numFmt w:val="decimal"/>
+      <w:lvlText w:val="%9."/>
+      <w:lvlJc w:val="left"/>
+      <w:pPr>
+        <w:tabs>
+          <w:tab w:val="num" w:pos="6480"/>
+        </w:tabs>
+        <w:ind w:left="6480" w:hanging="360"/>
+      </w:pPr>
+    </w:lvl>
+  </w:abstractNum>
   <w:abstractNum w:abstractNumId="8" w15:restartNumberingAfterBreak="0">
-    <w:nsid w:val="563C7663"/>
+    <w:nsid w:val="58492DB0"/>
     <w:multiLevelType w:val="multilevel"/>
-    <w:tmpl w:val="04547098"/>
+    <w:tmpl w:val="2074824E"/>
     <w:lvl w:ilvl="0">
       <w:start w:val="1"/>
       <w:numFmt w:val="bullet"/>
@@ -57058,9 +57235,122 @@
     </w:lvl>
   </w:abstractNum>
   <w:abstractNum w:abstractNumId="9" w15:restartNumberingAfterBreak="0">
-    <w:nsid w:val="62A05D47"/>
+    <w:nsid w:val="5A1F1EC1"/>
     <w:multiLevelType w:val="multilevel"/>
-    <w:tmpl w:val="58566080"/>
+    <w:tmpl w:val="F7180BA0"/>
+    <w:lvl w:ilvl="0">
+      <w:start w:val="1"/>
+      <w:numFmt w:val="decimal"/>
+      <w:lvlText w:val="%1."/>
+      <w:lvlJc w:val="left"/>
+      <w:pPr>
+        <w:tabs>
+          <w:tab w:val="num" w:pos="720"/>
+        </w:tabs>
+        <w:ind w:left="720" w:hanging="360"/>
+      </w:pPr>
+    </w:lvl>
+    <w:lvl w:ilvl="1" w:tentative="1">
+      <w:start w:val="1"/>
+      <w:numFmt w:val="decimal"/>
+      <w:lvlText w:val="%2."/>
+      <w:lvlJc w:val="left"/>
+      <w:pPr>
+        <w:tabs>
+          <w:tab w:val="num" w:pos="1440"/>
+        </w:tabs>
+        <w:ind w:left="1440" w:hanging="360"/>
+      </w:pPr>
+    </w:lvl>
+    <w:lvl w:ilvl="2" w:tentative="1">
+      <w:start w:val="1"/>
+      <w:numFmt w:val="decimal"/>
+      <w:lvlText w:val="%3."/>
+      <w:lvlJc w:val="left"/>
+      <w:pPr>
+        <w:tabs>
+          <w:tab w:val="num" w:pos="2160"/>
+        </w:tabs>
+        <w:ind w:left="2160" w:hanging="360"/>
+      </w:pPr>
+    </w:lvl>
+    <w:lvl w:ilvl="3" w:tentative="1">
+      <w:start w:val="1"/>
+      <w:numFmt w:val="decimal"/>
+      <w:lvlText w:val="%4."/>
+      <w:lvlJc w:val="left"/>
+      <w:pPr>
+        <w:tabs>
+          <w:tab w:val="num" w:pos="2880"/>
+        </w:tabs>
+        <w:ind w:left="2880" w:hanging="360"/>
+      </w:pPr>
+    </w:lvl>
+    <w:lvl w:ilvl="4" w:tentative="1">
+      <w:start w:val="1"/>
+      <w:numFmt w:val="decimal"/>
+      <w:lvlText w:val="%5."/>
+      <w:lvlJc w:val="left"/>
+      <w:pPr>
+        <w:tabs>
+          <w:tab w:val="num" w:pos="3600"/>
+        </w:tabs>
+        <w:ind w:left="3600" w:hanging="360"/>
+      </w:pPr>
+    </w:lvl>
+    <w:lvl w:ilvl="5" w:tentative="1">
+      <w:start w:val="1"/>
+      <w:numFmt w:val="decimal"/>
+      <w:lvlText w:val="%6."/>
+      <w:lvlJc w:val="left"/>
+      <w:pPr>
+        <w:tabs>
+          <w:tab w:val="num" w:pos="4320"/>
+        </w:tabs>
+        <w:ind w:left="4320" w:hanging="360"/>
+      </w:pPr>
+    </w:lvl>
+    <w:lvl w:ilvl="6" w:tentative="1">
+      <w:start w:val="1"/>
+      <w:numFmt w:val="decimal"/>
+      <w:lvlText w:val="%7."/>
+      <w:lvlJc w:val="left"/>
+      <w:pPr>
+        <w:tabs>
+          <w:tab w:val="num" w:pos="5040"/>
+        </w:tabs>
+        <w:ind w:left="5040" w:hanging="360"/>
+      </w:pPr>
+    </w:lvl>
+    <w:lvl w:ilvl="7" w:tentative="1">
+      <w:start w:val="1"/>
+      <w:numFmt w:val="decimal"/>
+      <w:lvlText w:val="%8."/>
+      <w:lvlJc w:val="left"/>
+      <w:pPr>
+        <w:tabs>
+          <w:tab w:val="num" w:pos="5760"/>
+        </w:tabs>
+        <w:ind w:left="5760" w:hanging="360"/>
+      </w:pPr>
+    </w:lvl>
+    <w:lvl w:ilvl="8" w:tentative="1">
+      <w:start w:val="1"/>
+      <w:numFmt w:val="decimal"/>
+      <w:lvlText w:val="%9."/>
+      <w:lvlJc w:val="left"/>
+      <w:pPr>
+        <w:tabs>
+          <w:tab w:val="num" w:pos="6480"/>
+        </w:tabs>
+        <w:ind w:left="6480" w:hanging="360"/>
+      </w:pPr>
+    </w:lvl>
+  </w:abstractNum>
+  <w:abstractNum w:abstractNumId="10" w15:restartNumberingAfterBreak="0">
+    <w:nsid w:val="5F157588"/>
+    <w:multiLevelType w:val="multilevel"/>
+    <w:tmpl w:val="8A62664E"/>
     <w:lvl w:ilvl="0">
       <w:start w:val="1"/>
       <w:numFmt w:val="bullet"/>
@@ -57206,187 +57496,38 @@
       </w:rPr>
     </w:lvl>
   </w:abstractNum>
-  <w:abstractNum w:abstractNumId="10" w15:restartNumberingAfterBreak="0">
-    <w:nsid w:val="7004271A"/>
-    <w:multiLevelType w:val="multilevel"/>
-    <w:tmpl w:val="A5924972"/>
-    <w:lvl w:ilvl="0">
-      <w:start w:val="1"/>
-      <w:numFmt w:val="bullet"/>
-      <w:lvlText w:val=""/>
-      <w:lvlJc w:val="left"/>
-      <w:pPr>
-        <w:tabs>
-          <w:tab w:val="num" w:pos="720"/>
-        </w:tabs>
-        <w:ind w:left="720" w:hanging="360"/>
-      </w:pPr>
-      <w:rPr>
-        <w:rFonts w:ascii="Symbol" w:hAnsi="Symbol" w:hint="default"/>
-        <w:sz w:val="20"/>
-      </w:rPr>
-    </w:lvl>
-    <w:lvl w:ilvl="1" w:tentative="1">
-      <w:start w:val="1"/>
-      <w:numFmt w:val="bullet"/>
-      <w:lvlText w:val="o"/>
-      <w:lvlJc w:val="left"/>
-      <w:pPr>
-        <w:tabs>
-          <w:tab w:val="num" w:pos="1440"/>
-        </w:tabs>
-        <w:ind w:left="1440" w:hanging="360"/>
-      </w:pPr>
-      <w:rPr>
-        <w:rFonts w:ascii="Courier New" w:hAnsi="Courier New" w:hint="default"/>
-        <w:sz w:val="20"/>
-      </w:rPr>
-    </w:lvl>
-    <w:lvl w:ilvl="2" w:tentative="1">
-      <w:start w:val="1"/>
-      <w:numFmt w:val="bullet"/>
-      <w:lvlText w:val=""/>
-      <w:lvlJc w:val="left"/>
-      <w:pPr>
-        <w:tabs>
-          <w:tab w:val="num" w:pos="2160"/>
-        </w:tabs>
-        <w:ind w:left="2160" w:hanging="360"/>
-      </w:pPr>
-      <w:rPr>
-        <w:rFonts w:ascii="Wingdings" w:hAnsi="Wingdings" w:hint="default"/>
-        <w:sz w:val="20"/>
-      </w:rPr>
-    </w:lvl>
-    <w:lvl w:ilvl="3" w:tentative="1">
-      <w:start w:val="1"/>
-      <w:numFmt w:val="bullet"/>
-      <w:lvlText w:val=""/>
-      <w:lvlJc w:val="left"/>
-      <w:pPr>
-        <w:tabs>
-          <w:tab w:val="num" w:pos="2880"/>
-        </w:tabs>
-        <w:ind w:left="2880" w:hanging="360"/>
-      </w:pPr>
-      <w:rPr>
-        <w:rFonts w:ascii="Wingdings" w:hAnsi="Wingdings" w:hint="default"/>
-        <w:sz w:val="20"/>
-      </w:rPr>
-    </w:lvl>
-    <w:lvl w:ilvl="4" w:tentative="1">
-      <w:start w:val="1"/>
-      <w:numFmt w:val="bullet"/>
-      <w:lvlText w:val=""/>
-      <w:lvlJc w:val="left"/>
-      <w:pPr>
-        <w:tabs>
-          <w:tab w:val="num" w:pos="3600"/>
-        </w:tabs>
-        <w:ind w:left="3600" w:hanging="360"/>
-      </w:pPr>
-      <w:rPr>
-        <w:rFonts w:ascii="Wingdings" w:hAnsi="Wingdings" w:hint="default"/>
-        <w:sz w:val="20"/>
-      </w:rPr>
-    </w:lvl>
-    <w:lvl w:ilvl="5" w:tentative="1">
-      <w:start w:val="1"/>
-      <w:numFmt w:val="bullet"/>
-      <w:lvlText w:val=""/>
-      <w:lvlJc w:val="left"/>
-      <w:pPr>
-        <w:tabs>
-          <w:tab w:val="num" w:pos="4320"/>
-        </w:tabs>
-        <w:ind w:left="4320" w:hanging="360"/>
-      </w:pPr>
-      <w:rPr>
-        <w:rFonts w:ascii="Wingdings" w:hAnsi="Wingdings" w:hint="default"/>
-        <w:sz w:val="20"/>
-      </w:rPr>
-    </w:lvl>
-    <w:lvl w:ilvl="6" w:tentative="1">
-      <w:start w:val="1"/>
-      <w:numFmt w:val="bullet"/>
-      <w:lvlText w:val=""/>
-      <w:lvlJc w:val="left"/>
-      <w:pPr>
-        <w:tabs>
-          <w:tab w:val="num" w:pos="5040"/>
-        </w:tabs>
-        <w:ind w:left="5040" w:hanging="360"/>
-      </w:pPr>
-      <w:rPr>
-        <w:rFonts w:ascii="Wingdings" w:hAnsi="Wingdings" w:hint="default"/>
-        <w:sz w:val="20"/>
-      </w:rPr>
-    </w:lvl>
-    <w:lvl w:ilvl="7" w:tentative="1">
-      <w:start w:val="1"/>
-      <w:numFmt w:val="bullet"/>
-      <w:lvlText w:val=""/>
-      <w:lvlJc w:val="left"/>
-      <w:pPr>
-        <w:tabs>
-          <w:tab w:val="num" w:pos="5760"/>
-        </w:tabs>
-        <w:ind w:left="5760" w:hanging="360"/>
-      </w:pPr>
-      <w:rPr>
-        <w:rFonts w:ascii="Wingdings" w:hAnsi="Wingdings" w:hint="default"/>
-        <w:sz w:val="20"/>
-      </w:rPr>
-    </w:lvl>
-    <w:lvl w:ilvl="8" w:tentative="1">
-      <w:start w:val="1"/>
-      <w:numFmt w:val="bullet"/>
-      <w:lvlText w:val=""/>
-      <w:lvlJc w:val="left"/>
-      <w:pPr>
-        <w:tabs>
-          <w:tab w:val="num" w:pos="6480"/>
-        </w:tabs>
-        <w:ind w:left="6480" w:hanging="360"/>
-      </w:pPr>
-      <w:rPr>
-        <w:rFonts w:ascii="Wingdings" w:hAnsi="Wingdings" w:hint="default"/>
-        <w:sz w:val="20"/>
-      </w:rPr>
-    </w:lvl>
-  </w:abstractNum>
-  <w:num w:numId="1" w16cid:durableId="1307930151">
+  <w:num w:numId="1" w16cid:durableId="948974085">
+    <w:abstractNumId w:val="8"/>
+  </w:num>
+  <w:num w:numId="2" w16cid:durableId="1185024095">
+    <w:abstractNumId w:val="6"/>
+  </w:num>
+  <w:num w:numId="3" w16cid:durableId="140972075">
+    <w:abstractNumId w:val="4"/>
+  </w:num>
+  <w:num w:numId="4" w16cid:durableId="620963422">
+    <w:abstractNumId w:val="3"/>
+  </w:num>
+  <w:num w:numId="5" w16cid:durableId="1649437534">
+    <w:abstractNumId w:val="1"/>
+  </w:num>
+  <w:num w:numId="6" w16cid:durableId="446395664">
+    <w:abstractNumId w:val="9"/>
+  </w:num>
+  <w:num w:numId="7" w16cid:durableId="70323811">
+    <w:abstractNumId w:val="0"/>
+  </w:num>
+  <w:num w:numId="8" w16cid:durableId="1852260688">
+    <w:abstractNumId w:val="5"/>
+  </w:num>
+  <w:num w:numId="9" w16cid:durableId="1912497221">
     <w:abstractNumId w:val="7"/>
   </w:num>
-  <w:num w:numId="2" w16cid:durableId="1150905823">
-    <w:abstractNumId w:val="2"/>
-  </w:num>
-  <w:num w:numId="3" w16cid:durableId="1010984028">
-    <w:abstractNumId w:val="9"/>
-  </w:num>
-  <w:num w:numId="4" w16cid:durableId="1558204904">
-    <w:abstractNumId w:val="5"/>
-  </w:num>
-  <w:num w:numId="5" w16cid:durableId="298537342">
+  <w:num w:numId="10" w16cid:durableId="503009688">
     <w:abstractNumId w:val="10"/>
   </w:num>
-  <w:num w:numId="6" w16cid:durableId="2091541332">
-    <w:abstractNumId w:val="6"/>
-  </w:num>
-  <w:num w:numId="7" w16cid:durableId="2082285930">
-    <w:abstractNumId w:val="8"/>
-  </w:num>
-  <w:num w:numId="8" w16cid:durableId="991175995">
-    <w:abstractNumId w:val="0"/>
-  </w:num>
-  <w:num w:numId="9" w16cid:durableId="1015694808">
-    <w:abstractNumId w:val="4"/>
-  </w:num>
-  <w:num w:numId="10" w16cid:durableId="386224292">
-    <w:abstractNumId w:val="3"/>
-  </w:num>
-  <w:num w:numId="11" w16cid:durableId="1922835205">
-    <w:abstractNumId w:val="1"/>
+  <w:num w:numId="11" w16cid:durableId="2113474245">
+    <w:abstractNumId w:val="2"/>
   </w:num>
 </w:numbering>
 </file>
@@ -58063,7 +58204,7 @@
     <w:autoRedefine/>
     <w:uiPriority w:val="39"/>
     <w:unhideWhenUsed/>
-    <w:rsid w:val="00196A72"/>
+    <w:rsid w:val="00143250"/>
     <w:pPr>
       <w:spacing w:after="100"/>
     </w:pPr>
@@ -58075,7 +58216,7 @@
     <w:autoRedefine/>
     <w:uiPriority w:val="39"/>
     <w:unhideWhenUsed/>
-    <w:rsid w:val="00196A72"/>
+    <w:rsid w:val="00143250"/>
     <w:pPr>
       <w:spacing w:after="100"/>
       <w:ind w:left="200"/>
@@ -58088,7 +58229,7 @@
     <w:autoRedefine/>
     <w:uiPriority w:val="39"/>
     <w:unhideWhenUsed/>
-    <w:rsid w:val="00196A72"/>
+    <w:rsid w:val="00143250"/>
     <w:pPr>
       <w:spacing w:after="100"/>
       <w:ind w:left="400"/>
@@ -58100,7 +58241,7 @@
     <w:link w:val="En-tteCar"/>
     <w:uiPriority w:val="99"/>
     <w:unhideWhenUsed/>
-    <w:rsid w:val="00196A72"/>
+    <w:rsid w:val="00143250"/>
     <w:pPr>
       <w:tabs>
         <w:tab w:val="center" w:pos="4536"/>
@@ -58113,7 +58254,7 @@
     <w:basedOn w:val="Policepardfaut"/>
     <w:link w:val="En-tte"/>
     <w:uiPriority w:val="99"/>
-    <w:rsid w:val="00196A72"/>
+    <w:rsid w:val="00143250"/>
     <w:rPr>
       <w:rFonts w:ascii="Arial" w:eastAsiaTheme="minorEastAsia" w:hAnsi="Arial" w:cs="Arial"/>
       <w:szCs w:val="24"/>
@@ -58125,7 +58266,7 @@
     <w:link w:val="PieddepageCar"/>
     <w:uiPriority w:val="99"/>
     <w:unhideWhenUsed/>
-    <w:rsid w:val="00196A72"/>
+    <w:rsid w:val="00143250"/>
     <w:pPr>
       <w:tabs>
         <w:tab w:val="center" w:pos="4536"/>
@@ -58138,7 +58279,7 @@
     <w:basedOn w:val="Policepardfaut"/>
     <w:link w:val="Pieddepage"/>
     <w:uiPriority w:val="99"/>
-    <w:rsid w:val="00196A72"/>
+    <w:rsid w:val="00143250"/>
     <w:rPr>
       <w:rFonts w:ascii="Arial" w:eastAsiaTheme="minorEastAsia" w:hAnsi="Arial" w:cs="Arial"/>
       <w:szCs w:val="24"/>

</xml_diff>

<commit_message>
Resolve D5: framework namespace oaef.* for non-standard attributes
acme.* placeholders become oaef.* (oaef.site.role, oaef.env.id,
oaef.env.config.version, oaef.test.verdict, oaef.test.persona) and the
Kubernetes label prefix oaef.io/. Business keys keep mosip.*.
D5 removed from the open decisions (specification and WP0); remaining
decisions renumbered; resolution recorded. OAEF documents regenerated.

Co-Authored-By: Claude Opus 5.5 <noreply@anthropic.com>
</commit_message>
<xml_diff>
--- a/docs/oaef/OAEF-SPEC-001_Observability-and-Audit-Evidence-Framework-Specification.docx
+++ b/docs/oaef/OAEF-SPEC-001_Observability-and-Audit-Evidence-Framework-Specification.docx
@@ -1210,7 +1210,7 @@
                 <w:sz w:val="18"/>
                 <w:szCs w:val="18"/>
               </w:rPr>
-              <w:t>Site attribute: cloud.region (dc1, dc2) replaces acme.site.name; role kept in acme.site.role.</w:t>
+              <w:t>Site attribute: cloud.region (dc1, dc2); DR role oaef.site.role; namespace oaef.* (former open decision D5 resolved).</w:t>
             </w:r>
           </w:p>
         </w:tc>
@@ -2048,7 +2048,7 @@
         <w:rPr>
           <w:noProof/>
         </w:rPr>
-        <w:instrText xml:space="preserve"> PAGEREF _Toc243225797 \h </w:instrText>
+        <w:instrText xml:space="preserve"> PAGEREF _Toc243227454 \h </w:instrText>
       </w:r>
       <w:r>
         <w:rPr>
@@ -2111,7 +2111,7 @@
         <w:rPr>
           <w:noProof/>
         </w:rPr>
-        <w:instrText xml:space="preserve"> PAGEREF _Toc243225798 \h </w:instrText>
+        <w:instrText xml:space="preserve"> PAGEREF _Toc243227455 \h </w:instrText>
       </w:r>
       <w:r>
         <w:rPr>
@@ -2174,7 +2174,7 @@
         <w:rPr>
           <w:noProof/>
         </w:rPr>
-        <w:instrText xml:space="preserve"> PAGEREF _Toc243225799 \h </w:instrText>
+        <w:instrText xml:space="preserve"> PAGEREF _Toc243227456 \h </w:instrText>
       </w:r>
       <w:r>
         <w:rPr>
@@ -2237,7 +2237,7 @@
         <w:rPr>
           <w:noProof/>
         </w:rPr>
-        <w:instrText xml:space="preserve"> PAGEREF _Toc243225800 \h </w:instrText>
+        <w:instrText xml:space="preserve"> PAGEREF _Toc243227457 \h </w:instrText>
       </w:r>
       <w:r>
         <w:rPr>
@@ -2300,7 +2300,7 @@
         <w:rPr>
           <w:noProof/>
         </w:rPr>
-        <w:instrText xml:space="preserve"> PAGEREF _Toc243225801 \h </w:instrText>
+        <w:instrText xml:space="preserve"> PAGEREF _Toc243227458 \h </w:instrText>
       </w:r>
       <w:r>
         <w:rPr>
@@ -2363,7 +2363,7 @@
         <w:rPr>
           <w:noProof/>
         </w:rPr>
-        <w:instrText xml:space="preserve"> PAGEREF _Toc243225802 \h </w:instrText>
+        <w:instrText xml:space="preserve"> PAGEREF _Toc243227459 \h </w:instrText>
       </w:r>
       <w:r>
         <w:rPr>
@@ -2426,7 +2426,7 @@
         <w:rPr>
           <w:noProof/>
         </w:rPr>
-        <w:instrText xml:space="preserve"> PAGEREF _Toc243225803 \h </w:instrText>
+        <w:instrText xml:space="preserve"> PAGEREF _Toc243227460 \h </w:instrText>
       </w:r>
       <w:r>
         <w:rPr>
@@ -2489,7 +2489,7 @@
         <w:rPr>
           <w:noProof/>
         </w:rPr>
-        <w:instrText xml:space="preserve"> PAGEREF _Toc243225804 \h </w:instrText>
+        <w:instrText xml:space="preserve"> PAGEREF _Toc243227461 \h </w:instrText>
       </w:r>
       <w:r>
         <w:rPr>
@@ -2552,7 +2552,7 @@
         <w:rPr>
           <w:noProof/>
         </w:rPr>
-        <w:instrText xml:space="preserve"> PAGEREF _Toc243225805 \h </w:instrText>
+        <w:instrText xml:space="preserve"> PAGEREF _Toc243227462 \h </w:instrText>
       </w:r>
       <w:r>
         <w:rPr>
@@ -2615,7 +2615,7 @@
         <w:rPr>
           <w:noProof/>
         </w:rPr>
-        <w:instrText xml:space="preserve"> PAGEREF _Toc243225806 \h </w:instrText>
+        <w:instrText xml:space="preserve"> PAGEREF _Toc243227463 \h </w:instrText>
       </w:r>
       <w:r>
         <w:rPr>
@@ -2678,7 +2678,7 @@
         <w:rPr>
           <w:noProof/>
         </w:rPr>
-        <w:instrText xml:space="preserve"> PAGEREF _Toc243225807 \h </w:instrText>
+        <w:instrText xml:space="preserve"> PAGEREF _Toc243227464 \h </w:instrText>
       </w:r>
       <w:r>
         <w:rPr>
@@ -2741,7 +2741,7 @@
         <w:rPr>
           <w:noProof/>
         </w:rPr>
-        <w:instrText xml:space="preserve"> PAGEREF _Toc243225808 \h </w:instrText>
+        <w:instrText xml:space="preserve"> PAGEREF _Toc243227465 \h </w:instrText>
       </w:r>
       <w:r>
         <w:rPr>
@@ -2804,7 +2804,7 @@
         <w:rPr>
           <w:noProof/>
         </w:rPr>
-        <w:instrText xml:space="preserve"> PAGEREF _Toc243225809 \h </w:instrText>
+        <w:instrText xml:space="preserve"> PAGEREF _Toc243227466 \h </w:instrText>
       </w:r>
       <w:r>
         <w:rPr>
@@ -2867,7 +2867,7 @@
         <w:rPr>
           <w:noProof/>
         </w:rPr>
-        <w:instrText xml:space="preserve"> PAGEREF _Toc243225810 \h </w:instrText>
+        <w:instrText xml:space="preserve"> PAGEREF _Toc243227467 \h </w:instrText>
       </w:r>
       <w:r>
         <w:rPr>
@@ -2930,7 +2930,7 @@
         <w:rPr>
           <w:noProof/>
         </w:rPr>
-        <w:instrText xml:space="preserve"> PAGEREF _Toc243225811 \h </w:instrText>
+        <w:instrText xml:space="preserve"> PAGEREF _Toc243227468 \h </w:instrText>
       </w:r>
       <w:r>
         <w:rPr>
@@ -2993,7 +2993,7 @@
         <w:rPr>
           <w:noProof/>
         </w:rPr>
-        <w:instrText xml:space="preserve"> PAGEREF _Toc243225812 \h </w:instrText>
+        <w:instrText xml:space="preserve"> PAGEREF _Toc243227469 \h </w:instrText>
       </w:r>
       <w:r>
         <w:rPr>
@@ -3056,7 +3056,7 @@
         <w:rPr>
           <w:noProof/>
         </w:rPr>
-        <w:instrText xml:space="preserve"> PAGEREF _Toc243225813 \h </w:instrText>
+        <w:instrText xml:space="preserve"> PAGEREF _Toc243227470 \h </w:instrText>
       </w:r>
       <w:r>
         <w:rPr>
@@ -3119,7 +3119,7 @@
         <w:rPr>
           <w:noProof/>
         </w:rPr>
-        <w:instrText xml:space="preserve"> PAGEREF _Toc243225814 \h </w:instrText>
+        <w:instrText xml:space="preserve"> PAGEREF _Toc243227471 \h </w:instrText>
       </w:r>
       <w:r>
         <w:rPr>
@@ -3182,7 +3182,7 @@
         <w:rPr>
           <w:noProof/>
         </w:rPr>
-        <w:instrText xml:space="preserve"> PAGEREF _Toc243225815 \h </w:instrText>
+        <w:instrText xml:space="preserve"> PAGEREF _Toc243227472 \h </w:instrText>
       </w:r>
       <w:r>
         <w:rPr>
@@ -3245,7 +3245,7 @@
         <w:rPr>
           <w:noProof/>
         </w:rPr>
-        <w:instrText xml:space="preserve"> PAGEREF _Toc243225816 \h </w:instrText>
+        <w:instrText xml:space="preserve"> PAGEREF _Toc243227473 \h </w:instrText>
       </w:r>
       <w:r>
         <w:rPr>
@@ -3308,7 +3308,7 @@
         <w:rPr>
           <w:noProof/>
         </w:rPr>
-        <w:instrText xml:space="preserve"> PAGEREF _Toc243225817 \h </w:instrText>
+        <w:instrText xml:space="preserve"> PAGEREF _Toc243227474 \h </w:instrText>
       </w:r>
       <w:r>
         <w:rPr>
@@ -3371,7 +3371,7 @@
         <w:rPr>
           <w:noProof/>
         </w:rPr>
-        <w:instrText xml:space="preserve"> PAGEREF _Toc243225818 \h </w:instrText>
+        <w:instrText xml:space="preserve"> PAGEREF _Toc243227475 \h </w:instrText>
       </w:r>
       <w:r>
         <w:rPr>
@@ -3434,7 +3434,7 @@
         <w:rPr>
           <w:noProof/>
         </w:rPr>
-        <w:instrText xml:space="preserve"> PAGEREF _Toc243225819 \h </w:instrText>
+        <w:instrText xml:space="preserve"> PAGEREF _Toc243227476 \h </w:instrText>
       </w:r>
       <w:r>
         <w:rPr>
@@ -3497,7 +3497,7 @@
         <w:rPr>
           <w:noProof/>
         </w:rPr>
-        <w:instrText xml:space="preserve"> PAGEREF _Toc243225820 \h </w:instrText>
+        <w:instrText xml:space="preserve"> PAGEREF _Toc243227477 \h </w:instrText>
       </w:r>
       <w:r>
         <w:rPr>
@@ -3560,7 +3560,7 @@
         <w:rPr>
           <w:noProof/>
         </w:rPr>
-        <w:instrText xml:space="preserve"> PAGEREF _Toc243225821 \h </w:instrText>
+        <w:instrText xml:space="preserve"> PAGEREF _Toc243227478 \h </w:instrText>
       </w:r>
       <w:r>
         <w:rPr>
@@ -3623,7 +3623,7 @@
         <w:rPr>
           <w:noProof/>
         </w:rPr>
-        <w:instrText xml:space="preserve"> PAGEREF _Toc243225822 \h </w:instrText>
+        <w:instrText xml:space="preserve"> PAGEREF _Toc243227479 \h </w:instrText>
       </w:r>
       <w:r>
         <w:rPr>
@@ -3686,7 +3686,7 @@
         <w:rPr>
           <w:noProof/>
         </w:rPr>
-        <w:instrText xml:space="preserve"> PAGEREF _Toc243225823 \h </w:instrText>
+        <w:instrText xml:space="preserve"> PAGEREF _Toc243227480 \h </w:instrText>
       </w:r>
       <w:r>
         <w:rPr>
@@ -3749,7 +3749,7 @@
         <w:rPr>
           <w:noProof/>
         </w:rPr>
-        <w:instrText xml:space="preserve"> PAGEREF _Toc243225824 \h </w:instrText>
+        <w:instrText xml:space="preserve"> PAGEREF _Toc243227481 \h </w:instrText>
       </w:r>
       <w:r>
         <w:rPr>
@@ -3812,7 +3812,7 @@
         <w:rPr>
           <w:noProof/>
         </w:rPr>
-        <w:instrText xml:space="preserve"> PAGEREF _Toc243225825 \h </w:instrText>
+        <w:instrText xml:space="preserve"> PAGEREF _Toc243227482 \h </w:instrText>
       </w:r>
       <w:r>
         <w:rPr>
@@ -3875,7 +3875,7 @@
         <w:rPr>
           <w:noProof/>
         </w:rPr>
-        <w:instrText xml:space="preserve"> PAGEREF _Toc243225826 \h </w:instrText>
+        <w:instrText xml:space="preserve"> PAGEREF _Toc243227483 \h </w:instrText>
       </w:r>
       <w:r>
         <w:rPr>
@@ -3938,7 +3938,7 @@
         <w:rPr>
           <w:noProof/>
         </w:rPr>
-        <w:instrText xml:space="preserve"> PAGEREF _Toc243225827 \h </w:instrText>
+        <w:instrText xml:space="preserve"> PAGEREF _Toc243227484 \h </w:instrText>
       </w:r>
       <w:r>
         <w:rPr>
@@ -4001,7 +4001,7 @@
         <w:rPr>
           <w:noProof/>
         </w:rPr>
-        <w:instrText xml:space="preserve"> PAGEREF _Toc243225828 \h </w:instrText>
+        <w:instrText xml:space="preserve"> PAGEREF _Toc243227485 \h </w:instrText>
       </w:r>
       <w:r>
         <w:rPr>
@@ -4064,7 +4064,7 @@
         <w:rPr>
           <w:noProof/>
         </w:rPr>
-        <w:instrText xml:space="preserve"> PAGEREF _Toc243225829 \h </w:instrText>
+        <w:instrText xml:space="preserve"> PAGEREF _Toc243227486 \h </w:instrText>
       </w:r>
       <w:r>
         <w:rPr>
@@ -4127,7 +4127,7 @@
         <w:rPr>
           <w:noProof/>
         </w:rPr>
-        <w:instrText xml:space="preserve"> PAGEREF _Toc243225830 \h </w:instrText>
+        <w:instrText xml:space="preserve"> PAGEREF _Toc243227487 \h </w:instrText>
       </w:r>
       <w:r>
         <w:rPr>
@@ -4190,7 +4190,7 @@
         <w:rPr>
           <w:noProof/>
         </w:rPr>
-        <w:instrText xml:space="preserve"> PAGEREF _Toc243225831 \h </w:instrText>
+        <w:instrText xml:space="preserve"> PAGEREF _Toc243227488 \h </w:instrText>
       </w:r>
       <w:r>
         <w:rPr>
@@ -4253,7 +4253,7 @@
         <w:rPr>
           <w:noProof/>
         </w:rPr>
-        <w:instrText xml:space="preserve"> PAGEREF _Toc243225832 \h </w:instrText>
+        <w:instrText xml:space="preserve"> PAGEREF _Toc243227489 \h </w:instrText>
       </w:r>
       <w:r>
         <w:rPr>
@@ -4316,7 +4316,7 @@
         <w:rPr>
           <w:noProof/>
         </w:rPr>
-        <w:instrText xml:space="preserve"> PAGEREF _Toc243225833 \h </w:instrText>
+        <w:instrText xml:space="preserve"> PAGEREF _Toc243227490 \h </w:instrText>
       </w:r>
       <w:r>
         <w:rPr>
@@ -4379,7 +4379,7 @@
         <w:rPr>
           <w:noProof/>
         </w:rPr>
-        <w:instrText xml:space="preserve"> PAGEREF _Toc243225834 \h </w:instrText>
+        <w:instrText xml:space="preserve"> PAGEREF _Toc243227491 \h </w:instrText>
       </w:r>
       <w:r>
         <w:rPr>
@@ -4442,7 +4442,7 @@
         <w:rPr>
           <w:noProof/>
         </w:rPr>
-        <w:instrText xml:space="preserve"> PAGEREF _Toc243225835 \h </w:instrText>
+        <w:instrText xml:space="preserve"> PAGEREF _Toc243227492 \h </w:instrText>
       </w:r>
       <w:r>
         <w:rPr>
@@ -4505,7 +4505,7 @@
         <w:rPr>
           <w:noProof/>
         </w:rPr>
-        <w:instrText xml:space="preserve"> PAGEREF _Toc243225836 \h </w:instrText>
+        <w:instrText xml:space="preserve"> PAGEREF _Toc243227493 \h </w:instrText>
       </w:r>
       <w:r>
         <w:rPr>
@@ -4569,7 +4569,7 @@
         <w:rPr>
           <w:noProof/>
         </w:rPr>
-        <w:instrText xml:space="preserve"> PAGEREF _Toc243225837 \h </w:instrText>
+        <w:instrText xml:space="preserve"> PAGEREF _Toc243227494 \h </w:instrText>
       </w:r>
       <w:r>
         <w:rPr>
@@ -4632,7 +4632,7 @@
         <w:rPr>
           <w:noProof/>
         </w:rPr>
-        <w:instrText xml:space="preserve"> PAGEREF _Toc243225838 \h </w:instrText>
+        <w:instrText xml:space="preserve"> PAGEREF _Toc243227495 \h </w:instrText>
       </w:r>
       <w:r>
         <w:rPr>
@@ -4695,7 +4695,7 @@
         <w:rPr>
           <w:noProof/>
         </w:rPr>
-        <w:instrText xml:space="preserve"> PAGEREF _Toc243225839 \h </w:instrText>
+        <w:instrText xml:space="preserve"> PAGEREF _Toc243227496 \h </w:instrText>
       </w:r>
       <w:r>
         <w:rPr>
@@ -4758,7 +4758,7 @@
         <w:rPr>
           <w:noProof/>
         </w:rPr>
-        <w:instrText xml:space="preserve"> PAGEREF _Toc243225840 \h </w:instrText>
+        <w:instrText xml:space="preserve"> PAGEREF _Toc243227497 \h </w:instrText>
       </w:r>
       <w:r>
         <w:rPr>
@@ -4821,7 +4821,7 @@
         <w:rPr>
           <w:noProof/>
         </w:rPr>
-        <w:instrText xml:space="preserve"> PAGEREF _Toc243225841 \h </w:instrText>
+        <w:instrText xml:space="preserve"> PAGEREF _Toc243227498 \h </w:instrText>
       </w:r>
       <w:r>
         <w:rPr>
@@ -4884,7 +4884,7 @@
         <w:rPr>
           <w:noProof/>
         </w:rPr>
-        <w:instrText xml:space="preserve"> PAGEREF _Toc243225842 \h </w:instrText>
+        <w:instrText xml:space="preserve"> PAGEREF _Toc243227499 \h </w:instrText>
       </w:r>
       <w:r>
         <w:rPr>
@@ -4947,7 +4947,7 @@
         <w:rPr>
           <w:noProof/>
         </w:rPr>
-        <w:instrText xml:space="preserve"> PAGEREF _Toc243225843 \h </w:instrText>
+        <w:instrText xml:space="preserve"> PAGEREF _Toc243227500 \h </w:instrText>
       </w:r>
       <w:r>
         <w:rPr>
@@ -5010,7 +5010,7 @@
         <w:rPr>
           <w:noProof/>
         </w:rPr>
-        <w:instrText xml:space="preserve"> PAGEREF _Toc243225844 \h </w:instrText>
+        <w:instrText xml:space="preserve"> PAGEREF _Toc243227501 \h </w:instrText>
       </w:r>
       <w:r>
         <w:rPr>
@@ -5073,7 +5073,7 @@
         <w:rPr>
           <w:noProof/>
         </w:rPr>
-        <w:instrText xml:space="preserve"> PAGEREF _Toc243225845 \h </w:instrText>
+        <w:instrText xml:space="preserve"> PAGEREF _Toc243227502 \h </w:instrText>
       </w:r>
       <w:r>
         <w:rPr>
@@ -5136,7 +5136,7 @@
         <w:rPr>
           <w:noProof/>
         </w:rPr>
-        <w:instrText xml:space="preserve"> PAGEREF _Toc243225846 \h </w:instrText>
+        <w:instrText xml:space="preserve"> PAGEREF _Toc243227503 \h </w:instrText>
       </w:r>
       <w:r>
         <w:rPr>
@@ -5199,7 +5199,7 @@
         <w:rPr>
           <w:noProof/>
         </w:rPr>
-        <w:instrText xml:space="preserve"> PAGEREF _Toc243225847 \h </w:instrText>
+        <w:instrText xml:space="preserve"> PAGEREF _Toc243227504 \h </w:instrText>
       </w:r>
       <w:r>
         <w:rPr>
@@ -5262,7 +5262,7 @@
         <w:rPr>
           <w:noProof/>
         </w:rPr>
-        <w:instrText xml:space="preserve"> PAGEREF _Toc243225848 \h </w:instrText>
+        <w:instrText xml:space="preserve"> PAGEREF _Toc243227505 \h </w:instrText>
       </w:r>
       <w:r>
         <w:rPr>
@@ -5325,7 +5325,7 @@
         <w:rPr>
           <w:noProof/>
         </w:rPr>
-        <w:instrText xml:space="preserve"> PAGEREF _Toc243225849 \h </w:instrText>
+        <w:instrText xml:space="preserve"> PAGEREF _Toc243227506 \h </w:instrText>
       </w:r>
       <w:r>
         <w:rPr>
@@ -5388,7 +5388,7 @@
         <w:rPr>
           <w:noProof/>
         </w:rPr>
-        <w:instrText xml:space="preserve"> PAGEREF _Toc243225850 \h </w:instrText>
+        <w:instrText xml:space="preserve"> PAGEREF _Toc243227507 \h </w:instrText>
       </w:r>
       <w:r>
         <w:rPr>
@@ -5451,7 +5451,7 @@
         <w:rPr>
           <w:noProof/>
         </w:rPr>
-        <w:instrText xml:space="preserve"> PAGEREF _Toc243225851 \h </w:instrText>
+        <w:instrText xml:space="preserve"> PAGEREF _Toc243227508 \h </w:instrText>
       </w:r>
       <w:r>
         <w:rPr>
@@ -5514,7 +5514,7 @@
         <w:rPr>
           <w:noProof/>
         </w:rPr>
-        <w:instrText xml:space="preserve"> PAGEREF _Toc243225852 \h </w:instrText>
+        <w:instrText xml:space="preserve"> PAGEREF _Toc243227509 \h </w:instrText>
       </w:r>
       <w:r>
         <w:rPr>
@@ -5577,7 +5577,7 @@
         <w:rPr>
           <w:noProof/>
         </w:rPr>
-        <w:instrText xml:space="preserve"> PAGEREF _Toc243225853 \h </w:instrText>
+        <w:instrText xml:space="preserve"> PAGEREF _Toc243227510 \h </w:instrText>
       </w:r>
       <w:r>
         <w:rPr>
@@ -5640,7 +5640,7 @@
         <w:rPr>
           <w:noProof/>
         </w:rPr>
-        <w:instrText xml:space="preserve"> PAGEREF _Toc243225854 \h </w:instrText>
+        <w:instrText xml:space="preserve"> PAGEREF _Toc243227511 \h </w:instrText>
       </w:r>
       <w:r>
         <w:rPr>
@@ -5703,7 +5703,7 @@
         <w:rPr>
           <w:noProof/>
         </w:rPr>
-        <w:instrText xml:space="preserve"> PAGEREF _Toc243225855 \h </w:instrText>
+        <w:instrText xml:space="preserve"> PAGEREF _Toc243227512 \h </w:instrText>
       </w:r>
       <w:r>
         <w:rPr>
@@ -5766,7 +5766,7 @@
         <w:rPr>
           <w:noProof/>
         </w:rPr>
-        <w:instrText xml:space="preserve"> PAGEREF _Toc243225856 \h </w:instrText>
+        <w:instrText xml:space="preserve"> PAGEREF _Toc243227513 \h </w:instrText>
       </w:r>
       <w:r>
         <w:rPr>
@@ -5829,7 +5829,7 @@
         <w:rPr>
           <w:noProof/>
         </w:rPr>
-        <w:instrText xml:space="preserve"> PAGEREF _Toc243225857 \h </w:instrText>
+        <w:instrText xml:space="preserve"> PAGEREF _Toc243227514 \h </w:instrText>
       </w:r>
       <w:r>
         <w:rPr>
@@ -5892,7 +5892,7 @@
         <w:rPr>
           <w:noProof/>
         </w:rPr>
-        <w:instrText xml:space="preserve"> PAGEREF _Toc243225858 \h </w:instrText>
+        <w:instrText xml:space="preserve"> PAGEREF _Toc243227515 \h </w:instrText>
       </w:r>
       <w:r>
         <w:rPr>
@@ -5955,7 +5955,7 @@
         <w:rPr>
           <w:noProof/>
         </w:rPr>
-        <w:instrText xml:space="preserve"> PAGEREF _Toc243225859 \h </w:instrText>
+        <w:instrText xml:space="preserve"> PAGEREF _Toc243227516 \h </w:instrText>
       </w:r>
       <w:r>
         <w:rPr>
@@ -6018,7 +6018,7 @@
         <w:rPr>
           <w:noProof/>
         </w:rPr>
-        <w:instrText xml:space="preserve"> PAGEREF _Toc243225860 \h </w:instrText>
+        <w:instrText xml:space="preserve"> PAGEREF _Toc243227517 \h </w:instrText>
       </w:r>
       <w:r>
         <w:rPr>
@@ -6081,7 +6081,7 @@
         <w:rPr>
           <w:noProof/>
         </w:rPr>
-        <w:instrText xml:space="preserve"> PAGEREF _Toc243225861 \h </w:instrText>
+        <w:instrText xml:space="preserve"> PAGEREF _Toc243227518 \h </w:instrText>
       </w:r>
       <w:r>
         <w:rPr>
@@ -6144,7 +6144,7 @@
         <w:rPr>
           <w:noProof/>
         </w:rPr>
-        <w:instrText xml:space="preserve"> PAGEREF _Toc243225862 \h </w:instrText>
+        <w:instrText xml:space="preserve"> PAGEREF _Toc243227519 \h </w:instrText>
       </w:r>
       <w:r>
         <w:rPr>
@@ -6207,7 +6207,7 @@
         <w:rPr>
           <w:noProof/>
         </w:rPr>
-        <w:instrText xml:space="preserve"> PAGEREF _Toc243225863 \h </w:instrText>
+        <w:instrText xml:space="preserve"> PAGEREF _Toc243227520 \h </w:instrText>
       </w:r>
       <w:r>
         <w:rPr>
@@ -6270,7 +6270,7 @@
         <w:rPr>
           <w:noProof/>
         </w:rPr>
-        <w:instrText xml:space="preserve"> PAGEREF _Toc243225864 \h </w:instrText>
+        <w:instrText xml:space="preserve"> PAGEREF _Toc243227521 \h </w:instrText>
       </w:r>
       <w:r>
         <w:rPr>
@@ -6333,7 +6333,7 @@
         <w:rPr>
           <w:noProof/>
         </w:rPr>
-        <w:instrText xml:space="preserve"> PAGEREF _Toc243225865 \h </w:instrText>
+        <w:instrText xml:space="preserve"> PAGEREF _Toc243227522 \h </w:instrText>
       </w:r>
       <w:r>
         <w:rPr>
@@ -6396,7 +6396,7 @@
         <w:rPr>
           <w:noProof/>
         </w:rPr>
-        <w:instrText xml:space="preserve"> PAGEREF _Toc243225866 \h </w:instrText>
+        <w:instrText xml:space="preserve"> PAGEREF _Toc243227523 \h </w:instrText>
       </w:r>
       <w:r>
         <w:rPr>
@@ -6459,7 +6459,7 @@
         <w:rPr>
           <w:noProof/>
         </w:rPr>
-        <w:instrText xml:space="preserve"> PAGEREF _Toc243225867 \h </w:instrText>
+        <w:instrText xml:space="preserve"> PAGEREF _Toc243227524 \h </w:instrText>
       </w:r>
       <w:r>
         <w:rPr>
@@ -6522,7 +6522,7 @@
         <w:rPr>
           <w:noProof/>
         </w:rPr>
-        <w:instrText xml:space="preserve"> PAGEREF _Toc243225868 \h </w:instrText>
+        <w:instrText xml:space="preserve"> PAGEREF _Toc243227525 \h </w:instrText>
       </w:r>
       <w:r>
         <w:rPr>
@@ -6585,7 +6585,7 @@
         <w:rPr>
           <w:noProof/>
         </w:rPr>
-        <w:instrText xml:space="preserve"> PAGEREF _Toc243225869 \h </w:instrText>
+        <w:instrText xml:space="preserve"> PAGEREF _Toc243227526 \h </w:instrText>
       </w:r>
       <w:r>
         <w:rPr>
@@ -6648,7 +6648,7 @@
         <w:rPr>
           <w:noProof/>
         </w:rPr>
-        <w:instrText xml:space="preserve"> PAGEREF _Toc243225870 \h </w:instrText>
+        <w:instrText xml:space="preserve"> PAGEREF _Toc243227527 \h </w:instrText>
       </w:r>
       <w:r>
         <w:rPr>
@@ -6711,7 +6711,7 @@
         <w:rPr>
           <w:noProof/>
         </w:rPr>
-        <w:instrText xml:space="preserve"> PAGEREF _Toc243225871 \h </w:instrText>
+        <w:instrText xml:space="preserve"> PAGEREF _Toc243227528 \h </w:instrText>
       </w:r>
       <w:r>
         <w:rPr>
@@ -6758,7 +6758,7 @@
           <w:rFonts w:eastAsia="Times New Roman"/>
         </w:rPr>
       </w:pPr>
-      <w:bookmarkStart w:id="0" w:name="_Toc243225797"/>
+      <w:bookmarkStart w:id="0" w:name="_Toc243227454"/>
       <w:r>
         <w:rPr>
           <w:rFonts w:eastAsia="Times New Roman"/>
@@ -6775,7 +6775,7 @@
           <w:rFonts w:eastAsia="Times New Roman"/>
         </w:rPr>
       </w:pPr>
-      <w:bookmarkStart w:id="1" w:name="_Toc243225798"/>
+      <w:bookmarkStart w:id="1" w:name="_Toc243227455"/>
       <w:r>
         <w:rPr>
           <w:rFonts w:eastAsia="Times New Roman"/>
@@ -6927,7 +6927,7 @@
           <w:rFonts w:eastAsia="Times New Roman"/>
         </w:rPr>
       </w:pPr>
-      <w:bookmarkStart w:id="2" w:name="_Toc243225799"/>
+      <w:bookmarkStart w:id="2" w:name="_Toc243227456"/>
       <w:r>
         <w:rPr>
           <w:rFonts w:eastAsia="Times New Roman"/>
@@ -7122,7 +7122,7 @@
           <w:rFonts w:eastAsia="Times New Roman"/>
         </w:rPr>
       </w:pPr>
-      <w:bookmarkStart w:id="3" w:name="_Toc243225800"/>
+      <w:bookmarkStart w:id="3" w:name="_Toc243227457"/>
       <w:r>
         <w:rPr>
           <w:rFonts w:eastAsia="Times New Roman"/>
@@ -7605,7 +7605,7 @@
           <w:rFonts w:eastAsia="Times New Roman"/>
         </w:rPr>
       </w:pPr>
-      <w:bookmarkStart w:id="4" w:name="_Toc243225801"/>
+      <w:bookmarkStart w:id="4" w:name="_Toc243227458"/>
       <w:r>
         <w:rPr>
           <w:rFonts w:eastAsia="Times New Roman"/>
@@ -8593,7 +8593,7 @@
           <w:rFonts w:eastAsia="Times New Roman"/>
         </w:rPr>
       </w:pPr>
-      <w:bookmarkStart w:id="5" w:name="_Toc243225802"/>
+      <w:bookmarkStart w:id="5" w:name="_Toc243227459"/>
       <w:r>
         <w:rPr>
           <w:rFonts w:eastAsia="Times New Roman"/>
@@ -9436,7 +9436,7 @@
           <w:rFonts w:eastAsia="Times New Roman"/>
         </w:rPr>
       </w:pPr>
-      <w:bookmarkStart w:id="6" w:name="_Toc243225803"/>
+      <w:bookmarkStart w:id="6" w:name="_Toc243227460"/>
       <w:r>
         <w:rPr>
           <w:rFonts w:eastAsia="Times New Roman"/>
@@ -9719,20 +9719,20 @@
           <w:rFonts w:eastAsia="Times New Roman"/>
           <w:szCs w:val="20"/>
         </w:rPr>
-        <w:t xml:space="preserve">The organisation attribute namespace is written </w:t>
+        <w:t xml:space="preserve">Attributes with no semantic convention use the framework namespace </w:t>
       </w:r>
       <w:r>
         <w:rPr>
           <w:rStyle w:val="CodeHTML"/>
         </w:rPr>
-        <w:t>acme.*</w:t>
+        <w:t>oaef.*</w:t>
       </w:r>
       <w:r>
         <w:rPr>
           <w:rFonts w:eastAsia="Times New Roman"/>
           <w:szCs w:val="20"/>
         </w:rPr>
-        <w:t xml:space="preserve"> as a placeholder until decided.</w:t>
+        <w:t xml:space="preserve"> (decision of 2026-10-18).</w:t>
       </w:r>
     </w:p>
     <w:p>
@@ -9742,7 +9742,7 @@
           <w:rFonts w:eastAsia="Times New Roman"/>
         </w:rPr>
       </w:pPr>
-      <w:bookmarkStart w:id="7" w:name="_Toc243225804"/>
+      <w:bookmarkStart w:id="7" w:name="_Toc243227461"/>
       <w:r>
         <w:rPr>
           <w:rFonts w:eastAsia="Times New Roman"/>
@@ -9759,7 +9759,7 @@
           <w:rFonts w:eastAsia="Times New Roman"/>
         </w:rPr>
       </w:pPr>
-      <w:bookmarkStart w:id="8" w:name="_Toc243225805"/>
+      <w:bookmarkStart w:id="8" w:name="_Toc243227462"/>
       <w:r>
         <w:rPr>
           <w:rFonts w:eastAsia="Times New Roman"/>
@@ -10256,7 +10256,7 @@
           <w:rFonts w:eastAsia="Times New Roman"/>
         </w:rPr>
       </w:pPr>
-      <w:bookmarkStart w:id="9" w:name="_Toc243225806"/>
+      <w:bookmarkStart w:id="9" w:name="_Toc243227463"/>
       <w:r>
         <w:rPr>
           <w:rFonts w:eastAsia="Times New Roman"/>
@@ -10811,7 +10811,7 @@
           <w:rFonts w:eastAsia="Times New Roman"/>
         </w:rPr>
       </w:pPr>
-      <w:bookmarkStart w:id="10" w:name="_Toc243225807"/>
+      <w:bookmarkStart w:id="10" w:name="_Toc243227464"/>
       <w:r>
         <w:rPr>
           <w:rFonts w:eastAsia="Times New Roman"/>
@@ -11634,7 +11634,7 @@
           <w:rFonts w:eastAsia="Times New Roman"/>
         </w:rPr>
       </w:pPr>
-      <w:bookmarkStart w:id="11" w:name="_Toc243225808"/>
+      <w:bookmarkStart w:id="11" w:name="_Toc243227465"/>
       <w:r>
         <w:rPr>
           <w:rFonts w:eastAsia="Times New Roman"/>
@@ -12893,7 +12893,7 @@
           <w:rFonts w:eastAsia="Times New Roman"/>
         </w:rPr>
       </w:pPr>
-      <w:bookmarkStart w:id="12" w:name="_Toc243225809"/>
+      <w:bookmarkStart w:id="12" w:name="_Toc243227466"/>
       <w:r>
         <w:rPr>
           <w:rFonts w:eastAsia="Times New Roman"/>
@@ -12989,7 +12989,7 @@
           <w:rFonts w:eastAsia="Times New Roman"/>
         </w:rPr>
       </w:pPr>
-      <w:bookmarkStart w:id="13" w:name="_Toc243225810"/>
+      <w:bookmarkStart w:id="13" w:name="_Toc243227467"/>
       <w:r>
         <w:rPr>
           <w:rFonts w:eastAsia="Times New Roman"/>
@@ -13085,7 +13085,7 @@
           <w:rFonts w:eastAsia="Times New Roman"/>
         </w:rPr>
       </w:pPr>
-      <w:bookmarkStart w:id="14" w:name="_Toc243225811"/>
+      <w:bookmarkStart w:id="14" w:name="_Toc243227468"/>
       <w:r>
         <w:rPr>
           <w:rFonts w:eastAsia="Times New Roman"/>
@@ -13102,7 +13102,7 @@
           <w:rFonts w:eastAsia="Times New Roman"/>
         </w:rPr>
       </w:pPr>
-      <w:bookmarkStart w:id="15" w:name="_Toc243225812"/>
+      <w:bookmarkStart w:id="15" w:name="_Toc243227469"/>
       <w:r>
         <w:rPr>
           <w:rFonts w:eastAsia="Times New Roman"/>
@@ -14018,7 +14018,7 @@
           <w:rFonts w:eastAsia="Times New Roman"/>
         </w:rPr>
       </w:pPr>
-      <w:bookmarkStart w:id="16" w:name="_Toc243225813"/>
+      <w:bookmarkStart w:id="16" w:name="_Toc243227470"/>
       <w:r>
         <w:rPr>
           <w:rFonts w:eastAsia="Times New Roman"/>
@@ -14827,7 +14827,7 @@
           <w:rFonts w:eastAsia="Times New Roman"/>
         </w:rPr>
       </w:pPr>
-      <w:bookmarkStart w:id="17" w:name="_Toc243225814"/>
+      <w:bookmarkStart w:id="17" w:name="_Toc243227471"/>
       <w:r>
         <w:rPr>
           <w:rFonts w:eastAsia="Times New Roman"/>
@@ -16885,7 +16885,7 @@
           <w:rFonts w:eastAsia="Times New Roman"/>
         </w:rPr>
       </w:pPr>
-      <w:bookmarkStart w:id="18" w:name="_Toc243225815"/>
+      <w:bookmarkStart w:id="18" w:name="_Toc243227472"/>
       <w:r>
         <w:rPr>
           <w:rFonts w:eastAsia="Times New Roman"/>
@@ -17061,7 +17061,7 @@
           <w:rFonts w:eastAsia="Times New Roman"/>
         </w:rPr>
       </w:pPr>
-      <w:bookmarkStart w:id="19" w:name="_Toc243225816"/>
+      <w:bookmarkStart w:id="19" w:name="_Toc243227473"/>
       <w:r>
         <w:rPr>
           <w:rFonts w:eastAsia="Times New Roman"/>
@@ -17982,7 +17982,7 @@
           <w:rFonts w:eastAsia="Times New Roman"/>
         </w:rPr>
       </w:pPr>
-      <w:bookmarkStart w:id="20" w:name="_Toc243225817"/>
+      <w:bookmarkStart w:id="20" w:name="_Toc243227474"/>
       <w:r>
         <w:rPr>
           <w:rFonts w:eastAsia="Times New Roman"/>
@@ -18024,7 +18024,7 @@
           <w:rFonts w:eastAsia="Times New Roman"/>
         </w:rPr>
       </w:pPr>
-      <w:bookmarkStart w:id="21" w:name="_Toc243225818"/>
+      <w:bookmarkStart w:id="21" w:name="_Toc243227475"/>
       <w:r>
         <w:rPr>
           <w:rFonts w:eastAsia="Times New Roman"/>
@@ -18041,7 +18041,7 @@
           <w:rFonts w:eastAsia="Times New Roman"/>
         </w:rPr>
       </w:pPr>
-      <w:bookmarkStart w:id="22" w:name="_Toc243225819"/>
+      <w:bookmarkStart w:id="22" w:name="_Toc243227476"/>
       <w:r>
         <w:rPr>
           <w:rFonts w:eastAsia="Times New Roman"/>
@@ -18650,7 +18650,7 @@
           <w:rFonts w:eastAsia="Times New Roman"/>
         </w:rPr>
       </w:pPr>
-      <w:bookmarkStart w:id="23" w:name="_Toc243225820"/>
+      <w:bookmarkStart w:id="23" w:name="_Toc243227477"/>
       <w:r>
         <w:rPr>
           <w:rFonts w:eastAsia="Times New Roman"/>
@@ -19737,7 +19737,7 @@
                 <w:sz w:val="18"/>
                 <w:szCs w:val="18"/>
               </w:rPr>
-              <w:t>acme.test.verdict, acme.test.persona</w:t>
+              <w:t>oaef.test.verdict, oaef.test.persona</w:t>
             </w:r>
           </w:p>
         </w:tc>
@@ -20139,7 +20139,7 @@
           <w:rFonts w:eastAsia="Times New Roman"/>
         </w:rPr>
       </w:pPr>
-      <w:bookmarkStart w:id="24" w:name="_Toc243225821"/>
+      <w:bookmarkStart w:id="24" w:name="_Toc243227478"/>
       <w:r>
         <w:rPr>
           <w:rFonts w:eastAsia="Times New Roman"/>
@@ -20695,7 +20695,7 @@
           <w:rFonts w:eastAsia="Times New Roman"/>
         </w:rPr>
       </w:pPr>
-      <w:bookmarkStart w:id="25" w:name="_Toc243225822"/>
+      <w:bookmarkStart w:id="25" w:name="_Toc243227479"/>
       <w:r>
         <w:rPr>
           <w:rFonts w:eastAsia="Times New Roman"/>
@@ -21252,7 +21252,7 @@
           <w:rFonts w:eastAsia="Times New Roman"/>
         </w:rPr>
       </w:pPr>
-      <w:bookmarkStart w:id="26" w:name="_Toc243225823"/>
+      <w:bookmarkStart w:id="26" w:name="_Toc243227480"/>
       <w:r>
         <w:rPr>
           <w:rFonts w:eastAsia="Times New Roman"/>
@@ -21359,7 +21359,7 @@
           <w:rFonts w:eastAsia="Times New Roman"/>
         </w:rPr>
       </w:pPr>
-      <w:bookmarkStart w:id="27" w:name="_Toc243225824"/>
+      <w:bookmarkStart w:id="27" w:name="_Toc243227481"/>
       <w:r>
         <w:rPr>
           <w:rFonts w:eastAsia="Times New Roman"/>
@@ -21569,7 +21569,7 @@
           <w:rFonts w:eastAsia="Times New Roman"/>
         </w:rPr>
       </w:pPr>
-      <w:bookmarkStart w:id="28" w:name="_Toc243225825"/>
+      <w:bookmarkStart w:id="28" w:name="_Toc243227482"/>
       <w:r>
         <w:rPr>
           <w:rFonts w:eastAsia="Times New Roman"/>
@@ -22486,7 +22486,7 @@
           <w:rFonts w:eastAsia="Times New Roman"/>
         </w:rPr>
       </w:pPr>
-      <w:bookmarkStart w:id="29" w:name="_Toc243225826"/>
+      <w:bookmarkStart w:id="29" w:name="_Toc243227483"/>
       <w:r>
         <w:rPr>
           <w:rFonts w:eastAsia="Times New Roman"/>
@@ -22517,7 +22517,7 @@
           <w:rFonts w:eastAsia="Times New Roman"/>
         </w:rPr>
       </w:pPr>
-      <w:bookmarkStart w:id="30" w:name="_Toc243225827"/>
+      <w:bookmarkStart w:id="30" w:name="_Toc243227484"/>
       <w:r>
         <w:rPr>
           <w:rFonts w:eastAsia="Times New Roman"/>
@@ -25158,7 +25158,7 @@
           <w:rFonts w:eastAsia="Times New Roman"/>
         </w:rPr>
       </w:pPr>
-      <w:bookmarkStart w:id="31" w:name="_Toc243225828"/>
+      <w:bookmarkStart w:id="31" w:name="_Toc243227485"/>
       <w:r>
         <w:rPr>
           <w:rFonts w:eastAsia="Times New Roman"/>
@@ -25516,7 +25516,7 @@
                 <w:sz w:val="18"/>
                 <w:szCs w:val="18"/>
               </w:rPr>
-              <w:t>Jarvis opens one ROOT span per scenario with baggage cicd.pipeline.run.id, test.suite.name, test.case.name; step spans as children; results on the ROOT span (test.case.result.status, acme.test.verdict).</w:t>
+              <w:t>Jarvis opens one ROOT span per scenario with baggage cicd.pipeline.run.id, test.suite.name, test.case.name; step spans as children; results on the ROOT span (test.case.result.status, oaef.test.verdict).</w:t>
             </w:r>
           </w:p>
         </w:tc>
@@ -26941,7 +26941,7 @@
           <w:rFonts w:eastAsia="Times New Roman"/>
         </w:rPr>
       </w:pPr>
-      <w:bookmarkStart w:id="32" w:name="_Toc243225829"/>
+      <w:bookmarkStart w:id="32" w:name="_Toc243227486"/>
       <w:r>
         <w:rPr>
           <w:rFonts w:eastAsia="Times New Roman"/>
@@ -29573,7 +29573,7 @@
           <w:rFonts w:eastAsia="Times New Roman"/>
         </w:rPr>
       </w:pPr>
-      <w:bookmarkStart w:id="33" w:name="_Toc243225830"/>
+      <w:bookmarkStart w:id="33" w:name="_Toc243227487"/>
       <w:r>
         <w:rPr>
           <w:rFonts w:eastAsia="Times New Roman"/>
@@ -31781,7 +31781,7 @@
           <w:rFonts w:eastAsia="Times New Roman"/>
         </w:rPr>
       </w:pPr>
-      <w:bookmarkStart w:id="34" w:name="_Toc243225831"/>
+      <w:bookmarkStart w:id="34" w:name="_Toc243227488"/>
       <w:r>
         <w:rPr>
           <w:rFonts w:eastAsia="Times New Roman"/>
@@ -32928,7 +32928,7 @@
           <w:rFonts w:eastAsia="Times New Roman"/>
         </w:rPr>
       </w:pPr>
-      <w:bookmarkStart w:id="35" w:name="_Toc243225832"/>
+      <w:bookmarkStart w:id="35" w:name="_Toc243227489"/>
       <w:r>
         <w:rPr>
           <w:rFonts w:eastAsia="Times New Roman"/>
@@ -34287,7 +34287,7 @@
           <w:rFonts w:eastAsia="Times New Roman"/>
         </w:rPr>
       </w:pPr>
-      <w:bookmarkStart w:id="36" w:name="_Toc243225833"/>
+      <w:bookmarkStart w:id="36" w:name="_Toc243227490"/>
       <w:r>
         <w:rPr>
           <w:rFonts w:eastAsia="Times New Roman"/>
@@ -35525,7 +35525,7 @@
           <w:rFonts w:eastAsia="Times New Roman"/>
         </w:rPr>
       </w:pPr>
-      <w:bookmarkStart w:id="37" w:name="_Toc243225834"/>
+      <w:bookmarkStart w:id="37" w:name="_Toc243227491"/>
       <w:r>
         <w:rPr>
           <w:rFonts w:eastAsia="Times New Roman"/>
@@ -35542,7 +35542,7 @@
           <w:rFonts w:eastAsia="Times New Roman"/>
         </w:rPr>
       </w:pPr>
-      <w:bookmarkStart w:id="38" w:name="_Toc243225835"/>
+      <w:bookmarkStart w:id="38" w:name="_Toc243227492"/>
       <w:r>
         <w:rPr>
           <w:rFonts w:eastAsia="Times New Roman"/>
@@ -36351,7 +36351,7 @@
           <w:rFonts w:eastAsia="Times New Roman"/>
         </w:rPr>
       </w:pPr>
-      <w:bookmarkStart w:id="39" w:name="_Toc243225836"/>
+      <w:bookmarkStart w:id="39" w:name="_Toc243227493"/>
       <w:r>
         <w:rPr>
           <w:rFonts w:eastAsia="Times New Roman"/>
@@ -36458,7 +36458,7 @@
           <w:rFonts w:eastAsia="Times New Roman"/>
         </w:rPr>
       </w:pPr>
-      <w:bookmarkStart w:id="40" w:name="_Toc243225837"/>
+      <w:bookmarkStart w:id="40" w:name="_Toc243227494"/>
       <w:r>
         <w:rPr>
           <w:rFonts w:eastAsia="Times New Roman"/>
@@ -37160,7 +37160,7 @@
           <w:rFonts w:eastAsia="Times New Roman"/>
         </w:rPr>
       </w:pPr>
-      <w:bookmarkStart w:id="41" w:name="_Toc243225838"/>
+      <w:bookmarkStart w:id="41" w:name="_Toc243227495"/>
       <w:r>
         <w:rPr>
           <w:rFonts w:eastAsia="Times New Roman"/>
@@ -37176,7 +37176,7 @@
           <w:rFonts w:eastAsia="Times New Roman"/>
         </w:rPr>
       </w:pPr>
-      <w:bookmarkStart w:id="42" w:name="_Toc243225839"/>
+      <w:bookmarkStart w:id="42" w:name="_Toc243227496"/>
       <w:r>
         <w:rPr>
           <w:rFonts w:eastAsia="Times New Roman"/>
@@ -37324,7 +37324,7 @@
           <w:rFonts w:eastAsia="Times New Roman"/>
         </w:rPr>
       </w:pPr>
-      <w:bookmarkStart w:id="43" w:name="_Toc243225840"/>
+      <w:bookmarkStart w:id="43" w:name="_Toc243227497"/>
       <w:r>
         <w:rPr>
           <w:rFonts w:eastAsia="Times New Roman"/>
@@ -37423,7 +37423,7 @@
           <w:rFonts w:eastAsia="Times New Roman"/>
         </w:rPr>
       </w:pPr>
-      <w:bookmarkStart w:id="44" w:name="_Toc243225841"/>
+      <w:bookmarkStart w:id="44" w:name="_Toc243227498"/>
       <w:r>
         <w:rPr>
           <w:rFonts w:eastAsia="Times New Roman"/>
@@ -37555,7 +37555,7 @@
           <w:rFonts w:eastAsia="Times New Roman"/>
         </w:rPr>
       </w:pPr>
-      <w:bookmarkStart w:id="45" w:name="_Toc243225842"/>
+      <w:bookmarkStart w:id="45" w:name="_Toc243227499"/>
       <w:r>
         <w:rPr>
           <w:rFonts w:eastAsia="Times New Roman"/>
@@ -37600,7 +37600,7 @@
         <w:rPr>
           <w:rStyle w:val="CodeHTML"/>
         </w:rPr>
-        <w:t>acme.site.role</w:t>
+        <w:t>oaef.site.role</w:t>
       </w:r>
       <w:r>
         <w:rPr>
@@ -37735,7 +37735,7 @@
           <w:rFonts w:eastAsia="Times New Roman"/>
         </w:rPr>
       </w:pPr>
-      <w:bookmarkStart w:id="46" w:name="_Toc243225843"/>
+      <w:bookmarkStart w:id="46" w:name="_Toc243227500"/>
       <w:r>
         <w:rPr>
           <w:rFonts w:eastAsia="Times New Roman"/>
@@ -37777,7 +37777,7 @@
           <w:rFonts w:eastAsia="Times New Roman"/>
         </w:rPr>
       </w:pPr>
-      <w:bookmarkStart w:id="47" w:name="_Toc243225844"/>
+      <w:bookmarkStart w:id="47" w:name="_Toc243227501"/>
       <w:r>
         <w:rPr>
           <w:rFonts w:eastAsia="Times New Roman"/>
@@ -37834,7 +37834,7 @@
           <w:rFonts w:eastAsia="Times New Roman"/>
         </w:rPr>
       </w:pPr>
-      <w:bookmarkStart w:id="48" w:name="_Toc243225845"/>
+      <w:bookmarkStart w:id="48" w:name="_Toc243227502"/>
       <w:r>
         <w:rPr>
           <w:rFonts w:eastAsia="Times New Roman"/>
@@ -38317,7 +38317,7 @@
           <w:rFonts w:eastAsia="Times New Roman"/>
         </w:rPr>
       </w:pPr>
-      <w:bookmarkStart w:id="49" w:name="_Toc243225846"/>
+      <w:bookmarkStart w:id="49" w:name="_Toc243227503"/>
       <w:r>
         <w:rPr>
           <w:rFonts w:eastAsia="Times New Roman"/>
@@ -38334,7 +38334,7 @@
           <w:rFonts w:eastAsia="Times New Roman"/>
         </w:rPr>
       </w:pPr>
-      <w:bookmarkStart w:id="50" w:name="_Toc243225847"/>
+      <w:bookmarkStart w:id="50" w:name="_Toc243227504"/>
       <w:r>
         <w:rPr>
           <w:rFonts w:eastAsia="Times New Roman"/>
@@ -38448,7 +38448,7 @@
           <w:rFonts w:eastAsia="Times New Roman"/>
         </w:rPr>
       </w:pPr>
-      <w:bookmarkStart w:id="51" w:name="_Toc243225848"/>
+      <w:bookmarkStart w:id="51" w:name="_Toc243227505"/>
       <w:r>
         <w:rPr>
           <w:rFonts w:eastAsia="Times New Roman"/>
@@ -39003,7 +39003,7 @@
           <w:rFonts w:eastAsia="Times New Roman"/>
         </w:rPr>
       </w:pPr>
-      <w:bookmarkStart w:id="52" w:name="_Toc243225849"/>
+      <w:bookmarkStart w:id="52" w:name="_Toc243227506"/>
       <w:r>
         <w:rPr>
           <w:rFonts w:eastAsia="Times New Roman"/>
@@ -39119,7 +39119,7 @@
           <w:rFonts w:eastAsia="Times New Roman"/>
         </w:rPr>
       </w:pPr>
-      <w:bookmarkStart w:id="53" w:name="_Toc243225850"/>
+      <w:bookmarkStart w:id="53" w:name="_Toc243227507"/>
       <w:r>
         <w:rPr>
           <w:rFonts w:eastAsia="Times New Roman"/>
@@ -40035,7 +40035,7 @@
           <w:rFonts w:eastAsia="Times New Roman"/>
         </w:rPr>
       </w:pPr>
-      <w:bookmarkStart w:id="54" w:name="_Toc243225851"/>
+      <w:bookmarkStart w:id="54" w:name="_Toc243227508"/>
       <w:r>
         <w:rPr>
           <w:rFonts w:eastAsia="Times New Roman"/>
@@ -40072,7 +40072,7 @@
           <w:rFonts w:eastAsia="Times New Roman"/>
         </w:rPr>
       </w:pPr>
-      <w:bookmarkStart w:id="55" w:name="_Toc243225852"/>
+      <w:bookmarkStart w:id="55" w:name="_Toc243227509"/>
       <w:r>
         <w:rPr>
           <w:rFonts w:eastAsia="Times New Roman"/>
@@ -40102,7 +40102,7 @@
           <w:rFonts w:eastAsia="Times New Roman"/>
         </w:rPr>
       </w:pPr>
-      <w:bookmarkStart w:id="56" w:name="_Toc243225853"/>
+      <w:bookmarkStart w:id="56" w:name="_Toc243227510"/>
       <w:r>
         <w:rPr>
           <w:rFonts w:eastAsia="Times New Roman"/>
@@ -40119,7 +40119,7 @@
           <w:rFonts w:eastAsia="Times New Roman"/>
         </w:rPr>
       </w:pPr>
-      <w:bookmarkStart w:id="57" w:name="_Toc243225854"/>
+      <w:bookmarkStart w:id="57" w:name="_Toc243227511"/>
       <w:r>
         <w:rPr>
           <w:rFonts w:eastAsia="Times New Roman"/>
@@ -40161,7 +40161,7 @@
           <w:rFonts w:eastAsia="Times New Roman"/>
         </w:rPr>
       </w:pPr>
-      <w:bookmarkStart w:id="58" w:name="_Toc243225855"/>
+      <w:bookmarkStart w:id="58" w:name="_Toc243227512"/>
       <w:r>
         <w:rPr>
           <w:rFonts w:eastAsia="Times New Roman"/>
@@ -40203,7 +40203,7 @@
           <w:rFonts w:eastAsia="Times New Roman"/>
         </w:rPr>
       </w:pPr>
-      <w:bookmarkStart w:id="59" w:name="_Toc243225856"/>
+      <w:bookmarkStart w:id="59" w:name="_Toc243227513"/>
       <w:r>
         <w:rPr>
           <w:rFonts w:eastAsia="Times New Roman"/>
@@ -42617,7 +42617,7 @@
           <w:rFonts w:eastAsia="Times New Roman"/>
         </w:rPr>
       </w:pPr>
-      <w:bookmarkStart w:id="60" w:name="_Toc243225857"/>
+      <w:bookmarkStart w:id="60" w:name="_Toc243227514"/>
       <w:r>
         <w:rPr>
           <w:rFonts w:eastAsia="Times New Roman"/>
@@ -43641,7 +43641,7 @@
           <w:rFonts w:eastAsia="Times New Roman"/>
         </w:rPr>
       </w:pPr>
-      <w:bookmarkStart w:id="61" w:name="_Toc243225858"/>
+      <w:bookmarkStart w:id="61" w:name="_Toc243227515"/>
       <w:r>
         <w:rPr>
           <w:rFonts w:eastAsia="Times New Roman"/>
@@ -43657,7 +43657,7 @@
           <w:rFonts w:eastAsia="Times New Roman"/>
         </w:rPr>
       </w:pPr>
-      <w:bookmarkStart w:id="62" w:name="_Toc243225859"/>
+      <w:bookmarkStart w:id="62" w:name="_Toc243227516"/>
       <w:r>
         <w:rPr>
           <w:rFonts w:eastAsia="Times New Roman"/>
@@ -43739,7 +43739,7 @@
           <w:rFonts w:eastAsia="Times New Roman"/>
         </w:rPr>
       </w:pPr>
-      <w:bookmarkStart w:id="63" w:name="_Toc243225860"/>
+      <w:bookmarkStart w:id="63" w:name="_Toc243227517"/>
       <w:r>
         <w:rPr>
           <w:rFonts w:eastAsia="Times New Roman"/>
@@ -45297,7 +45297,7 @@
           <w:rFonts w:eastAsia="Times New Roman"/>
         </w:rPr>
       </w:pPr>
-      <w:bookmarkStart w:id="64" w:name="_Toc243225861"/>
+      <w:bookmarkStart w:id="64" w:name="_Toc243227518"/>
       <w:r>
         <w:rPr>
           <w:rFonts w:eastAsia="Times New Roman"/>
@@ -46438,7 +46438,7 @@
           <w:rFonts w:eastAsia="Times New Roman"/>
         </w:rPr>
       </w:pPr>
-      <w:bookmarkStart w:id="65" w:name="_Toc243225862"/>
+      <w:bookmarkStart w:id="65" w:name="_Toc243227519"/>
       <w:r>
         <w:rPr>
           <w:rFonts w:eastAsia="Times New Roman"/>
@@ -46576,7 +46576,7 @@
           <w:rFonts w:eastAsia="Times New Roman"/>
         </w:rPr>
       </w:pPr>
-      <w:bookmarkStart w:id="66" w:name="_Toc243225863"/>
+      <w:bookmarkStart w:id="66" w:name="_Toc243227520"/>
       <w:r>
         <w:rPr>
           <w:rFonts w:eastAsia="Times New Roman"/>
@@ -46606,7 +46606,7 @@
           <w:rFonts w:eastAsia="Times New Roman"/>
         </w:rPr>
       </w:pPr>
-      <w:bookmarkStart w:id="67" w:name="_Toc243225864"/>
+      <w:bookmarkStart w:id="67" w:name="_Toc243227521"/>
       <w:r>
         <w:rPr>
           <w:rFonts w:eastAsia="Times New Roman"/>
@@ -46654,7 +46654,7 @@
           <w:rFonts w:eastAsia="Times New Roman"/>
         </w:rPr>
       </w:pPr>
-      <w:bookmarkStart w:id="68" w:name="_Toc243225865"/>
+      <w:bookmarkStart w:id="68" w:name="_Toc243227522"/>
       <w:r>
         <w:rPr>
           <w:rFonts w:eastAsia="Times New Roman"/>
@@ -46671,7 +46671,7 @@
           <w:rFonts w:eastAsia="Times New Roman"/>
         </w:rPr>
       </w:pPr>
-      <w:bookmarkStart w:id="69" w:name="_Toc243225866"/>
+      <w:bookmarkStart w:id="69" w:name="_Toc243227523"/>
       <w:r>
         <w:rPr>
           <w:rFonts w:eastAsia="Times New Roman"/>
@@ -47298,7 +47298,7 @@
           <w:rFonts w:eastAsia="Times New Roman"/>
         </w:rPr>
       </w:pPr>
-      <w:bookmarkStart w:id="70" w:name="_Toc243225867"/>
+      <w:bookmarkStart w:id="70" w:name="_Toc243227524"/>
       <w:r>
         <w:rPr>
           <w:rFonts w:eastAsia="Times New Roman"/>
@@ -47328,7 +47328,7 @@
           <w:rFonts w:eastAsia="Times New Roman"/>
         </w:rPr>
       </w:pPr>
-      <w:bookmarkStart w:id="71" w:name="_Toc243225868"/>
+      <w:bookmarkStart w:id="71" w:name="_Toc243227525"/>
       <w:r>
         <w:rPr>
           <w:rFonts w:eastAsia="Times New Roman"/>
@@ -47425,7 +47425,7 @@
           <w:rFonts w:eastAsia="Times New Roman"/>
         </w:rPr>
       </w:pPr>
-      <w:bookmarkStart w:id="72" w:name="_Toc243225869"/>
+      <w:bookmarkStart w:id="72" w:name="_Toc243227526"/>
       <w:r>
         <w:rPr>
           <w:rFonts w:eastAsia="Times New Roman"/>
@@ -54326,7 +54326,7 @@
           <w:rFonts w:eastAsia="Times New Roman"/>
         </w:rPr>
       </w:pPr>
-      <w:bookmarkStart w:id="73" w:name="_Toc243225870"/>
+      <w:bookmarkStart w:id="73" w:name="_Toc243227527"/>
       <w:r>
         <w:rPr>
           <w:rFonts w:eastAsia="Times New Roman"/>
@@ -54335,6 +54335,80 @@
         <w:t>12 Open issues and decisions</w:t>
       </w:r>
       <w:bookmarkEnd w:id="73"/>
+    </w:p>
+    <w:p>
+      <w:pPr>
+        <w:pStyle w:val="NormalWeb"/>
+        <w:rPr>
+          <w:szCs w:val="20"/>
+        </w:rPr>
+      </w:pPr>
+      <w:r>
+        <w:rPr>
+          <w:szCs w:val="20"/>
+        </w:rPr>
+        <w:t xml:space="preserve">Resolved on 2026-10-18: the site attribute is </w:t>
+      </w:r>
+      <w:r>
+        <w:rPr>
+          <w:rStyle w:val="CodeHTML"/>
+        </w:rPr>
+        <w:t>cloud.region</w:t>
+      </w:r>
+      <w:r>
+        <w:rPr>
+          <w:szCs w:val="20"/>
+        </w:rPr>
+        <w:t xml:space="preserve"> (</w:t>
+      </w:r>
+      <w:r>
+        <w:rPr>
+          <w:rStyle w:val="CodeHTML"/>
+        </w:rPr>
+        <w:t>dc1</w:t>
+      </w:r>
+      <w:r>
+        <w:rPr>
+          <w:szCs w:val="20"/>
+        </w:rPr>
+        <w:t xml:space="preserve">, </w:t>
+      </w:r>
+      <w:r>
+        <w:rPr>
+          <w:rStyle w:val="CodeHTML"/>
+        </w:rPr>
+        <w:t>dc2</w:t>
+      </w:r>
+      <w:r>
+        <w:rPr>
+          <w:szCs w:val="20"/>
+        </w:rPr>
+        <w:t xml:space="preserve">); the disaster-recovery role is </w:t>
+      </w:r>
+      <w:r>
+        <w:rPr>
+          <w:rStyle w:val="CodeHTML"/>
+        </w:rPr>
+        <w:t>oaef.site.role</w:t>
+      </w:r>
+      <w:r>
+        <w:rPr>
+          <w:szCs w:val="20"/>
+        </w:rPr>
+        <w:t xml:space="preserve">; attributes with no semantic convention use the framework namespace </w:t>
+      </w:r>
+      <w:r>
+        <w:rPr>
+          <w:rStyle w:val="CodeHTML"/>
+        </w:rPr>
+        <w:t>oaef.*</w:t>
+      </w:r>
+      <w:r>
+        <w:rPr>
+          <w:szCs w:val="20"/>
+        </w:rPr>
+        <w:t>.</w:t>
+      </w:r>
     </w:p>
     <w:tbl>
       <w:tblPr>
@@ -54797,7 +54871,7 @@
                 <w:sz w:val="18"/>
                 <w:szCs w:val="18"/>
               </w:rPr>
-              <w:t>Organisation attribute namespace replacing acme.*.</w:t>
+              <w:t>Retention, capacity and threshold values (all bracketed values).</w:t>
             </w:r>
           </w:p>
         </w:tc>
@@ -54835,78 +54909,6 @@
                 <w:szCs w:val="18"/>
               </w:rPr>
               <w:t>D6</w:t>
-            </w:r>
-          </w:p>
-        </w:tc>
-        <w:tc>
-          <w:tcPr>
-            <w:tcW w:w="0" w:type="auto"/>
-            <w:tcBorders>
-              <w:top w:val="single" w:sz="6" w:space="0" w:color="8C8C8C"/>
-              <w:left w:val="single" w:sz="6" w:space="0" w:color="8C8C8C"/>
-              <w:bottom w:val="single" w:sz="6" w:space="0" w:color="8C8C8C"/>
-              <w:right w:val="single" w:sz="6" w:space="0" w:color="8C8C8C"/>
-            </w:tcBorders>
-            <w:tcMar>
-              <w:top w:w="60" w:type="dxa"/>
-              <w:left w:w="60" w:type="dxa"/>
-              <w:bottom w:w="60" w:type="dxa"/>
-              <w:right w:w="60" w:type="dxa"/>
-            </w:tcMar>
-            <w:hideMark/>
-          </w:tcPr>
-          <w:p>
-            <w:pPr>
-              <w:rPr>
-                <w:rFonts w:eastAsia="Times New Roman"/>
-                <w:sz w:val="18"/>
-                <w:szCs w:val="18"/>
-              </w:rPr>
-            </w:pPr>
-            <w:r>
-              <w:rPr>
-                <w:rFonts w:eastAsia="Times New Roman"/>
-                <w:sz w:val="18"/>
-                <w:szCs w:val="18"/>
-              </w:rPr>
-              <w:t>Retention, capacity and threshold values (all bracketed values).</w:t>
-            </w:r>
-          </w:p>
-        </w:tc>
-      </w:tr>
-      <w:tr>
-        <w:tc>
-          <w:tcPr>
-            <w:tcW w:w="0" w:type="auto"/>
-            <w:tcBorders>
-              <w:top w:val="single" w:sz="6" w:space="0" w:color="8C8C8C"/>
-              <w:left w:val="single" w:sz="6" w:space="0" w:color="8C8C8C"/>
-              <w:bottom w:val="single" w:sz="6" w:space="0" w:color="8C8C8C"/>
-              <w:right w:val="single" w:sz="6" w:space="0" w:color="8C8C8C"/>
-            </w:tcBorders>
-            <w:tcMar>
-              <w:top w:w="60" w:type="dxa"/>
-              <w:left w:w="60" w:type="dxa"/>
-              <w:bottom w:w="60" w:type="dxa"/>
-              <w:right w:w="60" w:type="dxa"/>
-            </w:tcMar>
-            <w:hideMark/>
-          </w:tcPr>
-          <w:p>
-            <w:pPr>
-              <w:rPr>
-                <w:rFonts w:eastAsia="Times New Roman"/>
-                <w:sz w:val="18"/>
-                <w:szCs w:val="18"/>
-              </w:rPr>
-            </w:pPr>
-            <w:r>
-              <w:rPr>
-                <w:rFonts w:eastAsia="Times New Roman"/>
-                <w:sz w:val="18"/>
-                <w:szCs w:val="18"/>
-              </w:rPr>
-              <w:t>D7</w:t>
             </w:r>
           </w:p>
         </w:tc>
@@ -54954,7 +54956,7 @@
           <w:rFonts w:eastAsia="Times New Roman"/>
         </w:rPr>
       </w:pPr>
-      <w:bookmarkStart w:id="74" w:name="_Toc243225871"/>
+      <w:bookmarkStart w:id="74" w:name="_Toc243227528"/>
       <w:r>
         <w:rPr>
           <w:rFonts w:eastAsia="Times New Roman"/>
@@ -55930,9 +55932,9 @@
 <file path=word/numbering.xml><?xml version="1.0" encoding="utf-8"?>
 <w:numbering xmlns:wpc="http://schemas.microsoft.com/office/word/2010/wordprocessingCanvas" xmlns:cx="http://schemas.microsoft.com/office/drawing/2014/chartex" xmlns:cx1="http://schemas.microsoft.com/office/drawing/2015/9/8/chartex" xmlns:cx2="http://schemas.microsoft.com/office/drawing/2015/10/21/chartex" xmlns:cx3="http://schemas.microsoft.com/office/drawing/2016/5/9/chartex" xmlns:cx4="http://schemas.microsoft.com/office/drawing/2016/5/10/chartex" xmlns:cx5="http://schemas.microsoft.com/office/drawing/2016/5/11/chartex" xmlns:cx6="http://schemas.microsoft.com/office/drawing/2016/5/12/chartex" xmlns:cx7="http://schemas.microsoft.com/office/drawing/2016/5/13/chartex" xmlns:cx8="http://schemas.microsoft.com/office/drawing/2016/5/14/chartex" xmlns:mc="http://schemas.openxmlformats.org/markup-compatibility/2006" xmlns:aink="http://schemas.microsoft.com/office/drawing/2016/ink" xmlns:am3d="http://schemas.microsoft.com/office/drawing/2017/model3d" xmlns:o="urn:schemas-microsoft-com:office:office" xmlns:oel="http://schemas.microsoft.com/office/2019/extlst" xmlns:r="http://schemas.openxmlformats.org/officeDocument/2006/relationships" xmlns:m="http://schemas.openxmlformats.org/officeDocument/2006/math" xmlns:v="urn:schemas-microsoft-com:vml" xmlns:wp14="http://schemas.microsoft.com/office/word/2010/wordprocessingDrawing" xmlns:wp="http://schemas.openxmlformats.org/drawingml/2006/wordprocessingDrawing" xmlns:w10="urn:schemas-microsoft-com:office:word" xmlns:w="http://schemas.openxmlformats.org/wordprocessingml/2006/main" xmlns:w14="http://schemas.microsoft.com/office/word/2010/wordml" xmlns:w15="http://schemas.microsoft.com/office/word/2012/wordml" xmlns:w16cex="http://schemas.microsoft.com/office/word/2018/wordml/cex" xmlns:w16cid="http://schemas.microsoft.com/office/word/2016/wordml/cid" xmlns:w16="http://schemas.microsoft.com/office/word/2018/wordml" xmlns:w16du="http://schemas.microsoft.com/office/word/2023/wordml/word16du" xmlns:w16sdtdh="http://schemas.microsoft.com/office/word/2020/wordml/sdtdatahash" xmlns:w16sdtfl="http://schemas.microsoft.com/office/word/2024/wordml/sdtformatlock" xmlns:w16se="http://schemas.microsoft.com/office/word/2015/wordml/symex" xmlns:wpg="http://schemas.microsoft.com/office/word/2010/wordprocessingGroup" xmlns:wpi="http://schemas.microsoft.com/office/word/2010/wordprocessingInk" xmlns:wne="http://schemas.microsoft.com/office/word/2006/wordml" xmlns:wps="http://schemas.microsoft.com/office/word/2010/wordprocessingShape" mc:Ignorable="w14 w15 w16se w16cid w16 w16cex w16sdtdh w16sdtfl w16du wp14">
   <w:abstractNum w:abstractNumId="0" w15:restartNumberingAfterBreak="0">
-    <w:nsid w:val="172C26AC"/>
+    <w:nsid w:val="075B4C2F"/>
     <w:multiLevelType w:val="multilevel"/>
-    <w:tmpl w:val="9200959C"/>
+    <w:tmpl w:val="C132150C"/>
     <w:lvl w:ilvl="0">
       <w:start w:val="1"/>
       <w:numFmt w:val="bullet"/>
@@ -56079,9 +56081,9 @@
     </w:lvl>
   </w:abstractNum>
   <w:abstractNum w:abstractNumId="1" w15:restartNumberingAfterBreak="0">
-    <w:nsid w:val="18984199"/>
+    <w:nsid w:val="0EA221C4"/>
     <w:multiLevelType w:val="multilevel"/>
-    <w:tmpl w:val="868E6204"/>
+    <w:tmpl w:val="0396E608"/>
     <w:lvl w:ilvl="0">
       <w:start w:val="1"/>
       <w:numFmt w:val="bullet"/>
@@ -56228,9 +56230,9 @@
     </w:lvl>
   </w:abstractNum>
   <w:abstractNum w:abstractNumId="2" w15:restartNumberingAfterBreak="0">
-    <w:nsid w:val="1A903E6C"/>
+    <w:nsid w:val="18727DEE"/>
     <w:multiLevelType w:val="multilevel"/>
-    <w:tmpl w:val="F588F086"/>
+    <w:tmpl w:val="BD9EF3BA"/>
     <w:lvl w:ilvl="0">
       <w:start w:val="1"/>
       <w:numFmt w:val="bullet"/>
@@ -56377,9 +56379,9 @@
     </w:lvl>
   </w:abstractNum>
   <w:abstractNum w:abstractNumId="3" w15:restartNumberingAfterBreak="0">
-    <w:nsid w:val="1D5449D4"/>
+    <w:nsid w:val="26CB04FF"/>
     <w:multiLevelType w:val="multilevel"/>
-    <w:tmpl w:val="36EAFE32"/>
+    <w:tmpl w:val="ADE23C3E"/>
     <w:lvl w:ilvl="0">
       <w:start w:val="1"/>
       <w:numFmt w:val="bullet"/>
@@ -56526,9 +56528,9 @@
     </w:lvl>
   </w:abstractNum>
   <w:abstractNum w:abstractNumId="4" w15:restartNumberingAfterBreak="0">
-    <w:nsid w:val="1DC07FD8"/>
+    <w:nsid w:val="2DC47C0B"/>
     <w:multiLevelType w:val="multilevel"/>
-    <w:tmpl w:val="BF2458AC"/>
+    <w:tmpl w:val="F41C755A"/>
     <w:lvl w:ilvl="0">
       <w:start w:val="1"/>
       <w:numFmt w:val="bullet"/>
@@ -56675,9 +56677,9 @@
     </w:lvl>
   </w:abstractNum>
   <w:abstractNum w:abstractNumId="5" w15:restartNumberingAfterBreak="0">
-    <w:nsid w:val="2921231D"/>
+    <w:nsid w:val="3B8E79DB"/>
     <w:multiLevelType w:val="multilevel"/>
-    <w:tmpl w:val="9B32584C"/>
+    <w:tmpl w:val="24428116"/>
     <w:lvl w:ilvl="0">
       <w:start w:val="1"/>
       <w:numFmt w:val="bullet"/>
@@ -56824,13 +56826,13 @@
     </w:lvl>
   </w:abstractNum>
   <w:abstractNum w:abstractNumId="6" w15:restartNumberingAfterBreak="0">
-    <w:nsid w:val="2ACE507D"/>
+    <w:nsid w:val="3D970AAD"/>
     <w:multiLevelType w:val="multilevel"/>
-    <w:tmpl w:val="15605392"/>
+    <w:tmpl w:val="6D6EB580"/>
     <w:lvl w:ilvl="0">
       <w:start w:val="1"/>
-      <w:numFmt w:val="bullet"/>
-      <w:lvlText w:val=""/>
+      <w:numFmt w:val="decimal"/>
+      <w:lvlText w:val="%1."/>
       <w:lvlJc w:val="left"/>
       <w:pPr>
         <w:tabs>
@@ -56838,15 +56840,11 @@
         </w:tabs>
         <w:ind w:left="720" w:hanging="360"/>
       </w:pPr>
-      <w:rPr>
-        <w:rFonts w:ascii="Symbol" w:hAnsi="Symbol" w:hint="default"/>
-        <w:sz w:val="20"/>
-      </w:rPr>
     </w:lvl>
     <w:lvl w:ilvl="1" w:tentative="1">
       <w:start w:val="1"/>
-      <w:numFmt w:val="bullet"/>
-      <w:lvlText w:val="o"/>
+      <w:numFmt w:val="decimal"/>
+      <w:lvlText w:val="%2."/>
       <w:lvlJc w:val="left"/>
       <w:pPr>
         <w:tabs>
@@ -56854,15 +56852,11 @@
         </w:tabs>
         <w:ind w:left="1440" w:hanging="360"/>
       </w:pPr>
-      <w:rPr>
-        <w:rFonts w:ascii="Courier New" w:hAnsi="Courier New" w:hint="default"/>
-        <w:sz w:val="20"/>
-      </w:rPr>
     </w:lvl>
     <w:lvl w:ilvl="2" w:tentative="1">
       <w:start w:val="1"/>
-      <w:numFmt w:val="bullet"/>
-      <w:lvlText w:val=""/>
+      <w:numFmt w:val="decimal"/>
+      <w:lvlText w:val="%3."/>
       <w:lvlJc w:val="left"/>
       <w:pPr>
         <w:tabs>
@@ -56870,15 +56864,11 @@
         </w:tabs>
         <w:ind w:left="2160" w:hanging="360"/>
       </w:pPr>
-      <w:rPr>
-        <w:rFonts w:ascii="Wingdings" w:hAnsi="Wingdings" w:hint="default"/>
-        <w:sz w:val="20"/>
-      </w:rPr>
     </w:lvl>
     <w:lvl w:ilvl="3" w:tentative="1">
       <w:start w:val="1"/>
-      <w:numFmt w:val="bullet"/>
-      <w:lvlText w:val=""/>
+      <w:numFmt w:val="decimal"/>
+      <w:lvlText w:val="%4."/>
       <w:lvlJc w:val="left"/>
       <w:pPr>
         <w:tabs>
@@ -56886,15 +56876,11 @@
         </w:tabs>
         <w:ind w:left="2880" w:hanging="360"/>
       </w:pPr>
-      <w:rPr>
-        <w:rFonts w:ascii="Wingdings" w:hAnsi="Wingdings" w:hint="default"/>
-        <w:sz w:val="20"/>
-      </w:rPr>
     </w:lvl>
     <w:lvl w:ilvl="4" w:tentative="1">
       <w:start w:val="1"/>
-      <w:numFmt w:val="bullet"/>
-      <w:lvlText w:val=""/>
+      <w:numFmt w:val="decimal"/>
+      <w:lvlText w:val="%5."/>
       <w:lvlJc w:val="left"/>
       <w:pPr>
         <w:tabs>
@@ -56902,15 +56888,11 @@
         </w:tabs>
         <w:ind w:left="3600" w:hanging="360"/>
       </w:pPr>
-      <w:rPr>
-        <w:rFonts w:ascii="Wingdings" w:hAnsi="Wingdings" w:hint="default"/>
-        <w:sz w:val="20"/>
-      </w:rPr>
     </w:lvl>
     <w:lvl w:ilvl="5" w:tentative="1">
       <w:start w:val="1"/>
-      <w:numFmt w:val="bullet"/>
-      <w:lvlText w:val=""/>
+      <w:numFmt w:val="decimal"/>
+      <w:lvlText w:val="%6."/>
       <w:lvlJc w:val="left"/>
       <w:pPr>
         <w:tabs>
@@ -56918,15 +56900,11 @@
         </w:tabs>
         <w:ind w:left="4320" w:hanging="360"/>
       </w:pPr>
-      <w:rPr>
-        <w:rFonts w:ascii="Wingdings" w:hAnsi="Wingdings" w:hint="default"/>
-        <w:sz w:val="20"/>
-      </w:rPr>
     </w:lvl>
     <w:lvl w:ilvl="6" w:tentative="1">
       <w:start w:val="1"/>
-      <w:numFmt w:val="bullet"/>
-      <w:lvlText w:val=""/>
+      <w:numFmt w:val="decimal"/>
+      <w:lvlText w:val="%7."/>
       <w:lvlJc w:val="left"/>
       <w:pPr>
         <w:tabs>
@@ -56934,15 +56912,11 @@
         </w:tabs>
         <w:ind w:left="5040" w:hanging="360"/>
       </w:pPr>
-      <w:rPr>
-        <w:rFonts w:ascii="Wingdings" w:hAnsi="Wingdings" w:hint="default"/>
-        <w:sz w:val="20"/>
-      </w:rPr>
     </w:lvl>
     <w:lvl w:ilvl="7" w:tentative="1">
       <w:start w:val="1"/>
-      <w:numFmt w:val="bullet"/>
-      <w:lvlText w:val=""/>
+      <w:numFmt w:val="decimal"/>
+      <w:lvlText w:val="%8."/>
       <w:lvlJc w:val="left"/>
       <w:pPr>
         <w:tabs>
@@ -56950,15 +56924,11 @@
         </w:tabs>
         <w:ind w:left="5760" w:hanging="360"/>
       </w:pPr>
-      <w:rPr>
-        <w:rFonts w:ascii="Wingdings" w:hAnsi="Wingdings" w:hint="default"/>
-        <w:sz w:val="20"/>
-      </w:rPr>
     </w:lvl>
     <w:lvl w:ilvl="8" w:tentative="1">
       <w:start w:val="1"/>
-      <w:numFmt w:val="bullet"/>
-      <w:lvlText w:val=""/>
+      <w:numFmt w:val="decimal"/>
+      <w:lvlText w:val="%9."/>
       <w:lvlJc w:val="left"/>
       <w:pPr>
         <w:tabs>
@@ -56966,16 +56936,12 @@
         </w:tabs>
         <w:ind w:left="6480" w:hanging="360"/>
       </w:pPr>
-      <w:rPr>
-        <w:rFonts w:ascii="Wingdings" w:hAnsi="Wingdings" w:hint="default"/>
-        <w:sz w:val="20"/>
-      </w:rPr>
     </w:lvl>
   </w:abstractNum>
   <w:abstractNum w:abstractNumId="7" w15:restartNumberingAfterBreak="0">
-    <w:nsid w:val="44DD075F"/>
+    <w:nsid w:val="4737565A"/>
     <w:multiLevelType w:val="multilevel"/>
-    <w:tmpl w:val="E8386DA6"/>
+    <w:tmpl w:val="01BA74B0"/>
     <w:lvl w:ilvl="0">
       <w:start w:val="1"/>
       <w:numFmt w:val="decimal"/>
@@ -57086,9 +57052,9 @@
     </w:lvl>
   </w:abstractNum>
   <w:abstractNum w:abstractNumId="8" w15:restartNumberingAfterBreak="0">
-    <w:nsid w:val="58492DB0"/>
+    <w:nsid w:val="49B60F9B"/>
     <w:multiLevelType w:val="multilevel"/>
-    <w:tmpl w:val="2074824E"/>
+    <w:tmpl w:val="972E52EA"/>
     <w:lvl w:ilvl="0">
       <w:start w:val="1"/>
       <w:numFmt w:val="bullet"/>
@@ -57235,122 +57201,9 @@
     </w:lvl>
   </w:abstractNum>
   <w:abstractNum w:abstractNumId="9" w15:restartNumberingAfterBreak="0">
-    <w:nsid w:val="5A1F1EC1"/>
+    <w:nsid w:val="50325F5B"/>
     <w:multiLevelType w:val="multilevel"/>
-    <w:tmpl w:val="F7180BA0"/>
-    <w:lvl w:ilvl="0">
-      <w:start w:val="1"/>
-      <w:numFmt w:val="decimal"/>
-      <w:lvlText w:val="%1."/>
-      <w:lvlJc w:val="left"/>
-      <w:pPr>
-        <w:tabs>
-          <w:tab w:val="num" w:pos="720"/>
-        </w:tabs>
-        <w:ind w:left="720" w:hanging="360"/>
-      </w:pPr>
-    </w:lvl>
-    <w:lvl w:ilvl="1" w:tentative="1">
-      <w:start w:val="1"/>
-      <w:numFmt w:val="decimal"/>
-      <w:lvlText w:val="%2."/>
-      <w:lvlJc w:val="left"/>
-      <w:pPr>
-        <w:tabs>
-          <w:tab w:val="num" w:pos="1440"/>
-        </w:tabs>
-        <w:ind w:left="1440" w:hanging="360"/>
-      </w:pPr>
-    </w:lvl>
-    <w:lvl w:ilvl="2" w:tentative="1">
-      <w:start w:val="1"/>
-      <w:numFmt w:val="decimal"/>
-      <w:lvlText w:val="%3."/>
-      <w:lvlJc w:val="left"/>
-      <w:pPr>
-        <w:tabs>
-          <w:tab w:val="num" w:pos="2160"/>
-        </w:tabs>
-        <w:ind w:left="2160" w:hanging="360"/>
-      </w:pPr>
-    </w:lvl>
-    <w:lvl w:ilvl="3" w:tentative="1">
-      <w:start w:val="1"/>
-      <w:numFmt w:val="decimal"/>
-      <w:lvlText w:val="%4."/>
-      <w:lvlJc w:val="left"/>
-      <w:pPr>
-        <w:tabs>
-          <w:tab w:val="num" w:pos="2880"/>
-        </w:tabs>
-        <w:ind w:left="2880" w:hanging="360"/>
-      </w:pPr>
-    </w:lvl>
-    <w:lvl w:ilvl="4" w:tentative="1">
-      <w:start w:val="1"/>
-      <w:numFmt w:val="decimal"/>
-      <w:lvlText w:val="%5."/>
-      <w:lvlJc w:val="left"/>
-      <w:pPr>
-        <w:tabs>
-          <w:tab w:val="num" w:pos="3600"/>
-        </w:tabs>
-        <w:ind w:left="3600" w:hanging="360"/>
-      </w:pPr>
-    </w:lvl>
-    <w:lvl w:ilvl="5" w:tentative="1">
-      <w:start w:val="1"/>
-      <w:numFmt w:val="decimal"/>
-      <w:lvlText w:val="%6."/>
-      <w:lvlJc w:val="left"/>
-      <w:pPr>
-        <w:tabs>
-          <w:tab w:val="num" w:pos="4320"/>
-        </w:tabs>
-        <w:ind w:left="4320" w:hanging="360"/>
-      </w:pPr>
-    </w:lvl>
-    <w:lvl w:ilvl="6" w:tentative="1">
-      <w:start w:val="1"/>
-      <w:numFmt w:val="decimal"/>
-      <w:lvlText w:val="%7."/>
-      <w:lvlJc w:val="left"/>
-      <w:pPr>
-        <w:tabs>
-          <w:tab w:val="num" w:pos="5040"/>
-        </w:tabs>
-        <w:ind w:left="5040" w:hanging="360"/>
-      </w:pPr>
-    </w:lvl>
-    <w:lvl w:ilvl="7" w:tentative="1">
-      <w:start w:val="1"/>
-      <w:numFmt w:val="decimal"/>
-      <w:lvlText w:val="%8."/>
-      <w:lvlJc w:val="left"/>
-      <w:pPr>
-        <w:tabs>
-          <w:tab w:val="num" w:pos="5760"/>
-        </w:tabs>
-        <w:ind w:left="5760" w:hanging="360"/>
-      </w:pPr>
-    </w:lvl>
-    <w:lvl w:ilvl="8" w:tentative="1">
-      <w:start w:val="1"/>
-      <w:numFmt w:val="decimal"/>
-      <w:lvlText w:val="%9."/>
-      <w:lvlJc w:val="left"/>
-      <w:pPr>
-        <w:tabs>
-          <w:tab w:val="num" w:pos="6480"/>
-        </w:tabs>
-        <w:ind w:left="6480" w:hanging="360"/>
-      </w:pPr>
-    </w:lvl>
-  </w:abstractNum>
-  <w:abstractNum w:abstractNumId="10" w15:restartNumberingAfterBreak="0">
-    <w:nsid w:val="5F157588"/>
-    <w:multiLevelType w:val="multilevel"/>
-    <w:tmpl w:val="8A62664E"/>
+    <w:tmpl w:val="D28E3B90"/>
     <w:lvl w:ilvl="0">
       <w:start w:val="1"/>
       <w:numFmt w:val="bullet"/>
@@ -57496,38 +57349,187 @@
       </w:rPr>
     </w:lvl>
   </w:abstractNum>
-  <w:num w:numId="1" w16cid:durableId="948974085">
+  <w:abstractNum w:abstractNumId="10" w15:restartNumberingAfterBreak="0">
+    <w:nsid w:val="5C2F2E32"/>
+    <w:multiLevelType w:val="multilevel"/>
+    <w:tmpl w:val="F36E71C2"/>
+    <w:lvl w:ilvl="0">
+      <w:start w:val="1"/>
+      <w:numFmt w:val="bullet"/>
+      <w:lvlText w:val=""/>
+      <w:lvlJc w:val="left"/>
+      <w:pPr>
+        <w:tabs>
+          <w:tab w:val="num" w:pos="720"/>
+        </w:tabs>
+        <w:ind w:left="720" w:hanging="360"/>
+      </w:pPr>
+      <w:rPr>
+        <w:rFonts w:ascii="Symbol" w:hAnsi="Symbol" w:hint="default"/>
+        <w:sz w:val="20"/>
+      </w:rPr>
+    </w:lvl>
+    <w:lvl w:ilvl="1" w:tentative="1">
+      <w:start w:val="1"/>
+      <w:numFmt w:val="bullet"/>
+      <w:lvlText w:val="o"/>
+      <w:lvlJc w:val="left"/>
+      <w:pPr>
+        <w:tabs>
+          <w:tab w:val="num" w:pos="1440"/>
+        </w:tabs>
+        <w:ind w:left="1440" w:hanging="360"/>
+      </w:pPr>
+      <w:rPr>
+        <w:rFonts w:ascii="Courier New" w:hAnsi="Courier New" w:hint="default"/>
+        <w:sz w:val="20"/>
+      </w:rPr>
+    </w:lvl>
+    <w:lvl w:ilvl="2" w:tentative="1">
+      <w:start w:val="1"/>
+      <w:numFmt w:val="bullet"/>
+      <w:lvlText w:val=""/>
+      <w:lvlJc w:val="left"/>
+      <w:pPr>
+        <w:tabs>
+          <w:tab w:val="num" w:pos="2160"/>
+        </w:tabs>
+        <w:ind w:left="2160" w:hanging="360"/>
+      </w:pPr>
+      <w:rPr>
+        <w:rFonts w:ascii="Wingdings" w:hAnsi="Wingdings" w:hint="default"/>
+        <w:sz w:val="20"/>
+      </w:rPr>
+    </w:lvl>
+    <w:lvl w:ilvl="3" w:tentative="1">
+      <w:start w:val="1"/>
+      <w:numFmt w:val="bullet"/>
+      <w:lvlText w:val=""/>
+      <w:lvlJc w:val="left"/>
+      <w:pPr>
+        <w:tabs>
+          <w:tab w:val="num" w:pos="2880"/>
+        </w:tabs>
+        <w:ind w:left="2880" w:hanging="360"/>
+      </w:pPr>
+      <w:rPr>
+        <w:rFonts w:ascii="Wingdings" w:hAnsi="Wingdings" w:hint="default"/>
+        <w:sz w:val="20"/>
+      </w:rPr>
+    </w:lvl>
+    <w:lvl w:ilvl="4" w:tentative="1">
+      <w:start w:val="1"/>
+      <w:numFmt w:val="bullet"/>
+      <w:lvlText w:val=""/>
+      <w:lvlJc w:val="left"/>
+      <w:pPr>
+        <w:tabs>
+          <w:tab w:val="num" w:pos="3600"/>
+        </w:tabs>
+        <w:ind w:left="3600" w:hanging="360"/>
+      </w:pPr>
+      <w:rPr>
+        <w:rFonts w:ascii="Wingdings" w:hAnsi="Wingdings" w:hint="default"/>
+        <w:sz w:val="20"/>
+      </w:rPr>
+    </w:lvl>
+    <w:lvl w:ilvl="5" w:tentative="1">
+      <w:start w:val="1"/>
+      <w:numFmt w:val="bullet"/>
+      <w:lvlText w:val=""/>
+      <w:lvlJc w:val="left"/>
+      <w:pPr>
+        <w:tabs>
+          <w:tab w:val="num" w:pos="4320"/>
+        </w:tabs>
+        <w:ind w:left="4320" w:hanging="360"/>
+      </w:pPr>
+      <w:rPr>
+        <w:rFonts w:ascii="Wingdings" w:hAnsi="Wingdings" w:hint="default"/>
+        <w:sz w:val="20"/>
+      </w:rPr>
+    </w:lvl>
+    <w:lvl w:ilvl="6" w:tentative="1">
+      <w:start w:val="1"/>
+      <w:numFmt w:val="bullet"/>
+      <w:lvlText w:val=""/>
+      <w:lvlJc w:val="left"/>
+      <w:pPr>
+        <w:tabs>
+          <w:tab w:val="num" w:pos="5040"/>
+        </w:tabs>
+        <w:ind w:left="5040" w:hanging="360"/>
+      </w:pPr>
+      <w:rPr>
+        <w:rFonts w:ascii="Wingdings" w:hAnsi="Wingdings" w:hint="default"/>
+        <w:sz w:val="20"/>
+      </w:rPr>
+    </w:lvl>
+    <w:lvl w:ilvl="7" w:tentative="1">
+      <w:start w:val="1"/>
+      <w:numFmt w:val="bullet"/>
+      <w:lvlText w:val=""/>
+      <w:lvlJc w:val="left"/>
+      <w:pPr>
+        <w:tabs>
+          <w:tab w:val="num" w:pos="5760"/>
+        </w:tabs>
+        <w:ind w:left="5760" w:hanging="360"/>
+      </w:pPr>
+      <w:rPr>
+        <w:rFonts w:ascii="Wingdings" w:hAnsi="Wingdings" w:hint="default"/>
+        <w:sz w:val="20"/>
+      </w:rPr>
+    </w:lvl>
+    <w:lvl w:ilvl="8" w:tentative="1">
+      <w:start w:val="1"/>
+      <w:numFmt w:val="bullet"/>
+      <w:lvlText w:val=""/>
+      <w:lvlJc w:val="left"/>
+      <w:pPr>
+        <w:tabs>
+          <w:tab w:val="num" w:pos="6480"/>
+        </w:tabs>
+        <w:ind w:left="6480" w:hanging="360"/>
+      </w:pPr>
+      <w:rPr>
+        <w:rFonts w:ascii="Wingdings" w:hAnsi="Wingdings" w:hint="default"/>
+        <w:sz w:val="20"/>
+      </w:rPr>
+    </w:lvl>
+  </w:abstractNum>
+  <w:num w:numId="1" w16cid:durableId="557404280">
     <w:abstractNumId w:val="8"/>
   </w:num>
-  <w:num w:numId="2" w16cid:durableId="1185024095">
+  <w:num w:numId="2" w16cid:durableId="1405570457">
+    <w:abstractNumId w:val="10"/>
+  </w:num>
+  <w:num w:numId="3" w16cid:durableId="933439212">
+    <w:abstractNumId w:val="1"/>
+  </w:num>
+  <w:num w:numId="4" w16cid:durableId="1267543260">
+    <w:abstractNumId w:val="9"/>
+  </w:num>
+  <w:num w:numId="5" w16cid:durableId="1278873332">
+    <w:abstractNumId w:val="3"/>
+  </w:num>
+  <w:num w:numId="6" w16cid:durableId="2063285597">
+    <w:abstractNumId w:val="7"/>
+  </w:num>
+  <w:num w:numId="7" w16cid:durableId="1515072771">
+    <w:abstractNumId w:val="0"/>
+  </w:num>
+  <w:num w:numId="8" w16cid:durableId="1394891799">
+    <w:abstractNumId w:val="2"/>
+  </w:num>
+  <w:num w:numId="9" w16cid:durableId="864249689">
     <w:abstractNumId w:val="6"/>
   </w:num>
-  <w:num w:numId="3" w16cid:durableId="140972075">
+  <w:num w:numId="10" w16cid:durableId="1130324668">
     <w:abstractNumId w:val="4"/>
   </w:num>
-  <w:num w:numId="4" w16cid:durableId="620963422">
-    <w:abstractNumId w:val="3"/>
-  </w:num>
-  <w:num w:numId="5" w16cid:durableId="1649437534">
-    <w:abstractNumId w:val="1"/>
-  </w:num>
-  <w:num w:numId="6" w16cid:durableId="446395664">
-    <w:abstractNumId w:val="9"/>
-  </w:num>
-  <w:num w:numId="7" w16cid:durableId="70323811">
-    <w:abstractNumId w:val="0"/>
-  </w:num>
-  <w:num w:numId="8" w16cid:durableId="1852260688">
+  <w:num w:numId="11" w16cid:durableId="1623464804">
     <w:abstractNumId w:val="5"/>
-  </w:num>
-  <w:num w:numId="9" w16cid:durableId="1912497221">
-    <w:abstractNumId w:val="7"/>
-  </w:num>
-  <w:num w:numId="10" w16cid:durableId="503009688">
-    <w:abstractNumId w:val="10"/>
-  </w:num>
-  <w:num w:numId="11" w16cid:durableId="2113474245">
-    <w:abstractNumId w:val="2"/>
   </w:num>
 </w:numbering>
 </file>
@@ -58204,7 +58206,7 @@
     <w:autoRedefine/>
     <w:uiPriority w:val="39"/>
     <w:unhideWhenUsed/>
-    <w:rsid w:val="00143250"/>
+    <w:rsid w:val="00E17692"/>
     <w:pPr>
       <w:spacing w:after="100"/>
     </w:pPr>
@@ -58216,7 +58218,7 @@
     <w:autoRedefine/>
     <w:uiPriority w:val="39"/>
     <w:unhideWhenUsed/>
-    <w:rsid w:val="00143250"/>
+    <w:rsid w:val="00E17692"/>
     <w:pPr>
       <w:spacing w:after="100"/>
       <w:ind w:left="200"/>
@@ -58229,7 +58231,7 @@
     <w:autoRedefine/>
     <w:uiPriority w:val="39"/>
     <w:unhideWhenUsed/>
-    <w:rsid w:val="00143250"/>
+    <w:rsid w:val="00E17692"/>
     <w:pPr>
       <w:spacing w:after="100"/>
       <w:ind w:left="400"/>
@@ -58241,7 +58243,7 @@
     <w:link w:val="En-tteCar"/>
     <w:uiPriority w:val="99"/>
     <w:unhideWhenUsed/>
-    <w:rsid w:val="00143250"/>
+    <w:rsid w:val="00E17692"/>
     <w:pPr>
       <w:tabs>
         <w:tab w:val="center" w:pos="4536"/>
@@ -58254,7 +58256,7 @@
     <w:basedOn w:val="Policepardfaut"/>
     <w:link w:val="En-tte"/>
     <w:uiPriority w:val="99"/>
-    <w:rsid w:val="00143250"/>
+    <w:rsid w:val="00E17692"/>
     <w:rPr>
       <w:rFonts w:ascii="Arial" w:eastAsiaTheme="minorEastAsia" w:hAnsi="Arial" w:cs="Arial"/>
       <w:szCs w:val="24"/>
@@ -58266,7 +58268,7 @@
     <w:link w:val="PieddepageCar"/>
     <w:uiPriority w:val="99"/>
     <w:unhideWhenUsed/>
-    <w:rsid w:val="00143250"/>
+    <w:rsid w:val="00E17692"/>
     <w:pPr>
       <w:tabs>
         <w:tab w:val="center" w:pos="4536"/>
@@ -58279,7 +58281,7 @@
     <w:basedOn w:val="Policepardfaut"/>
     <w:link w:val="Pieddepage"/>
     <w:uiPriority w:val="99"/>
-    <w:rsid w:val="00143250"/>
+    <w:rsid w:val="00E17692"/>
     <w:rPr>
       <w:rFonts w:ascii="Arial" w:eastAsiaTheme="minorEastAsia" w:hAnsi="Arial" w:cs="Arial"/>
       <w:szCs w:val="24"/>

</xml_diff>